<commit_message>
Asset retreival central fix
</commit_message>
<xml_diff>
--- a/docs/Memgine DEV environment set UP.docx
+++ b/docs/Memgine DEV environment set UP.docx
@@ -27,8 +27,13 @@
     </w:p>
     <w:p>
       <w:r>
-        <w:t>.\infra\scripts\deploy.ps1 dev apply</w:t>
-      </w:r>
+        <w:t xml:space="preserve">.\infra\scripts\deploy.ps1 dev </w:t>
+      </w:r>
+      <w:proofErr w:type="gramStart"/>
+      <w:r>
+        <w:t>apply</w:t>
+      </w:r>
+      <w:proofErr w:type="gramEnd"/>
     </w:p>
     <w:p>
       <w:r>
@@ -89,7 +94,15 @@
     </w:p>
     <w:p>
       <w:r>
-        <w:t>aws ssm describe-instance-information --profile memgine --region ca-central-1 --filters "Key=InstanceIds,Values=$instance"</w:t>
+        <w:t>aws ssm describe-instance-information --profile memgine --region ca-central-1 --filters "Key=</w:t>
+      </w:r>
+      <w:proofErr w:type="gramStart"/>
+      <w:r>
+        <w:t>InstanceIds,Values</w:t>
+      </w:r>
+      <w:proofErr w:type="gramEnd"/>
+      <w:r>
+        <w:t>=$instance"</w:t>
       </w:r>
     </w:p>
     <w:p>
@@ -99,7 +112,23 @@
     </w:p>
     <w:p>
       <w:r>
-        <w:t>aws ssm start-session --profile memgine --region ca-central-1 --target $instance --document-name AWS-StartPortForwardingSessionToRemoteHost --parameters "host=$rds,portNumber=5432,localPortNumber=15432"</w:t>
+        <w:t>aws ssm start-session --profile memgine --region ca-central-1 --target $instance --document-name AWS-StartPortForwardingSessionToRemoteHost --parameters "host=$</w:t>
+      </w:r>
+      <w:proofErr w:type="gramStart"/>
+      <w:r>
+        <w:t>rds,portNumber</w:t>
+      </w:r>
+      <w:proofErr w:type="gramEnd"/>
+      <w:r>
+        <w:t>=</w:t>
+      </w:r>
+      <w:proofErr w:type="gramStart"/>
+      <w:r>
+        <w:t>5432,localPortNumber</w:t>
+      </w:r>
+      <w:proofErr w:type="gramEnd"/>
+      <w:r>
+        <w:t>=15432"</w:t>
       </w:r>
     </w:p>
     <w:p>
@@ -225,10 +254,12 @@
       </w:r>
     </w:p>
     <w:p>
+      <w:bookmarkStart w:id="0" w:name="_Hlk241338051"/>
       <w:r>
         <w:t>powershell.exe -ExecutionPolicy Bypass -File ".\DB\scripts\liquibase-update.ps1" -Environment dev</w:t>
       </w:r>
     </w:p>
+    <w:bookmarkEnd w:id="0"/>
     <w:p/>
     <w:p>
       <w:r>
@@ -247,7 +278,23 @@
     </w:p>
     <w:p>
       <w:r>
-        <w:t xml:space="preserve">    "ARN": "arn:aws:secretsmanager:ca-central-1:482762107384:secret:memgine/dev/otp-pepper-1MY6Id",</w:t>
+        <w:t xml:space="preserve">    "ARN": "</w:t>
+      </w:r>
+      <w:proofErr w:type="gramStart"/>
+      <w:r>
+        <w:t>arn:aws</w:t>
+      </w:r>
+      <w:proofErr w:type="gramEnd"/>
+      <w:r>
+        <w:t>:secretsmanager:ca-central-</w:t>
+      </w:r>
+      <w:proofErr w:type="gramStart"/>
+      <w:r>
+        <w:t>1:482762107384:secret</w:t>
+      </w:r>
+      <w:proofErr w:type="gramEnd"/>
+      <w:r>
+        <w:t>:memgine/dev/otp-pepper-1MY6Id",</w:t>
       </w:r>
     </w:p>
     <w:p>
@@ -295,6 +342,11 @@
         <w:t>Complete deplyment end to end</w:t>
       </w:r>
     </w:p>
+    <w:p>
+      <w:r>
+        <w:t>.\server\scripts\setup-host.ps1 -Environment dev</w:t>
+      </w:r>
+    </w:p>
     <w:p/>
     <w:p>
       <w:r>
@@ -385,42 +437,766 @@
     <w:p/>
     <w:p>
       <w:r>
+        <w:t xml:space="preserve">Memgine internal PK/FK identifiers   → </w:t>
+      </w:r>
+      <w:proofErr w:type="gramStart"/>
+      <w:r>
+        <w:t>varchar(</w:t>
+      </w:r>
+      <w:proofErr w:type="gramEnd"/>
+      <w:r>
+        <w:t>64)</w:t>
+      </w:r>
+    </w:p>
+    <w:p>
+      <w:r>
+        <w:t xml:space="preserve">Memgine internal business codes      → </w:t>
+      </w:r>
+      <w:proofErr w:type="gramStart"/>
+      <w:r>
+        <w:t>varchar(</w:t>
+      </w:r>
+      <w:proofErr w:type="gramEnd"/>
+      <w:r>
+        <w:t>64)</w:t>
+      </w:r>
+    </w:p>
+    <w:p>
+      <w:r>
+        <w:t>External-system identifiers          → provider-defined length</w:t>
+      </w:r>
+    </w:p>
+    <w:p>
+      <w:r>
+        <w:t>Standards-based codes                → standard-defined length</w:t>
+      </w:r>
+    </w:p>
+    <w:p>
+      <w:r>
+        <w:t>Phone/postal/tax/registration fields → domain-specific length</w:t>
+      </w:r>
+    </w:p>
+    <w:p>
+      <w:r>
+        <w:t>Liquibase metadata                   → Liquibase-managed</w:t>
+      </w:r>
+    </w:p>
+    <w:p/>
+    <w:p/>
+    <w:p>
+      <w:r>
+        <w:t xml:space="preserve">aws ssm get-command-invocation --profile memgine --region ca-central-1 --command-id </w:t>
+      </w:r>
+      <w:r>
+        <w:t>bb30da7e-1ad3-4454-ae5e-9ea47e214ff8</w:t>
+      </w:r>
+      <w:r>
+        <w:t xml:space="preserve"> </w:t>
+      </w:r>
+      <w:r>
+        <w:t>--instance-id i-02a49b07c1b9979a5 --output json</w:t>
+      </w:r>
+    </w:p>
+    <w:p/>
+    <w:p/>
+    <w:p>
+      <w:r>
+        <w:t xml:space="preserve">aws ssm get-command-invocation --profile memgine --region ca-central-1 --command-id </w:t>
+      </w:r>
+      <w:r>
+        <w:t>161cb89a-b839-4d41-b6c0-5e582033c194</w:t>
+      </w:r>
+      <w:r>
+        <w:t>--instance-id i-02a49b07c1b9979a5 --query "{</w:t>
+      </w:r>
+      <w:proofErr w:type="gramStart"/>
+      <w:r>
+        <w:t>Status:Status</w:t>
+      </w:r>
+      <w:proofErr w:type="gramEnd"/>
+      <w:r>
+        <w:t>,</w:t>
+      </w:r>
+      <w:proofErr w:type="gramStart"/>
+      <w:r>
+        <w:t>ResponseCode:ResponseCode</w:t>
+      </w:r>
+      <w:proofErr w:type="gramEnd"/>
+      <w:r>
+        <w:t>,</w:t>
+      </w:r>
+      <w:proofErr w:type="gramStart"/>
+      <w:r>
+        <w:t>StdOut:StandardOutputContent</w:t>
+      </w:r>
+      <w:proofErr w:type="gramEnd"/>
+      <w:r>
+        <w:t>,</w:t>
+      </w:r>
+      <w:proofErr w:type="gramStart"/>
+      <w:r>
+        <w:t>StdErr:StandardErrorContent</w:t>
+      </w:r>
+      <w:proofErr w:type="gramEnd"/>
+      <w:r>
+        <w:t>}" --output json</w:t>
+      </w:r>
+    </w:p>
+    <w:p/>
+    <w:p>
+      <w:r>
+        <w:t>aws ssm get-command-invocation --profile memgine --region ca-central-1 --command-id 161cb89a-b839-4d41-b6c0-5e582033c194 --instance-id i-02a49b07c1b9979a5 --query "{</w:t>
+      </w:r>
+      <w:proofErr w:type="gramStart"/>
+      <w:r>
+        <w:t>Status:Status</w:t>
+      </w:r>
+      <w:proofErr w:type="gramEnd"/>
+      <w:r>
+        <w:t>,</w:t>
+      </w:r>
+      <w:proofErr w:type="gramStart"/>
+      <w:r>
+        <w:t>ResponseCode:ResponseCode</w:t>
+      </w:r>
+      <w:proofErr w:type="gramEnd"/>
+      <w:r>
+        <w:t>,</w:t>
+      </w:r>
+      <w:proofErr w:type="gramStart"/>
+      <w:r>
+        <w:t>StdOut:StandardOutputContent</w:t>
+      </w:r>
+      <w:proofErr w:type="gramEnd"/>
+      <w:r>
+        <w:t>,</w:t>
+      </w:r>
+      <w:proofErr w:type="gramStart"/>
+      <w:r>
+        <w:t>StdErr:StandardErrorContent</w:t>
+      </w:r>
+      <w:proofErr w:type="gramEnd"/>
+      <w:r>
+        <w:t>}" --output json</w:t>
+      </w:r>
+    </w:p>
+    <w:p/>
+    <w:p/>
+    <w:p>
+      <w:r>
+        <w:t>$localHash</w:t>
+      </w:r>
+      <w:proofErr w:type="gramStart"/>
+      <w:r>
+        <w:t>=(</w:t>
+      </w:r>
+      <w:proofErr w:type="gramEnd"/>
+      <w:r>
+        <w:t>Get-FileHash .\server\build\libs\memgine-server.jar -Algorithm SHA256).Hash; aws s3 cp "s3://memgine-dev-deploy/releases/</w:t>
+      </w:r>
+      <w:r>
+        <w:t>20260926-183813-c0d00dc</w:t>
+      </w:r>
+      <w:r>
+        <w:t>/server/server.jar" "$env:TEMP\memgine-s3-server.jar" --profile memgine --region ca-central-1 --quiet; $s3Hash=(Get-FileHash "$env:TEMP\memgine-s3-server.jar" -Algorithm SHA256).Hash; Write-Host "LOCAL=$localHash"; Write-Host "S3=$s3Hash"</w:t>
+      </w:r>
+    </w:p>
+    <w:p/>
+    <w:p/>
+    <w:p/>
+    <w:p/>
+    <w:p/>
+    <w:p/>
+    <w:p>
+      <w:pPr>
+        <w:pStyle w:val="ListParagraph"/>
+        <w:numPr>
+          <w:ilvl w:val="0"/>
+          <w:numId w:val="1"/>
+        </w:numPr>
+      </w:pPr>
+      <w:r>
         <w:lastRenderedPageBreak/>
-        <w:t>Memgine internal PK/FK identifiers   → varchar(64)</w:t>
-      </w:r>
-    </w:p>
-    <w:p>
-      <w:r>
-        <w:t>Memgine internal business codes      → varchar(64)</w:t>
-      </w:r>
-    </w:p>
-    <w:p>
-      <w:r>
-        <w:t>External-system identifiers          → provider-defined length</w:t>
-      </w:r>
-    </w:p>
-    <w:p>
-      <w:r>
-        <w:t>Standards-based codes                → standard-defined length</w:t>
-      </w:r>
-    </w:p>
-    <w:p>
-      <w:r>
-        <w:t>Phone/postal/tax/registration fields → domain-specific length</w:t>
-      </w:r>
-    </w:p>
-    <w:p>
-      <w:r>
-        <w:t>Liquibase metadata                   → Liquibase-managed</w:t>
-      </w:r>
-    </w:p>
-    <w:p/>
-    <w:p/>
-    <w:p/>
-    <w:p/>
-    <w:p/>
-    <w:p/>
-    <w:p/>
+        <w:t>Front end build and deploy</w:t>
+      </w:r>
+    </w:p>
+    <w:p>
+      <w:pPr>
+        <w:tabs>
+          <w:tab w:val="left" w:pos="916"/>
+          <w:tab w:val="left" w:pos="1832"/>
+          <w:tab w:val="left" w:pos="2748"/>
+          <w:tab w:val="left" w:pos="3664"/>
+          <w:tab w:val="left" w:pos="4580"/>
+          <w:tab w:val="left" w:pos="5496"/>
+          <w:tab w:val="left" w:pos="6412"/>
+          <w:tab w:val="left" w:pos="7328"/>
+          <w:tab w:val="left" w:pos="8244"/>
+          <w:tab w:val="left" w:pos="9160"/>
+          <w:tab w:val="left" w:pos="10076"/>
+          <w:tab w:val="left" w:pos="10992"/>
+          <w:tab w:val="left" w:pos="11908"/>
+          <w:tab w:val="left" w:pos="12824"/>
+          <w:tab w:val="left" w:pos="13740"/>
+          <w:tab w:val="left" w:pos="14656"/>
+        </w:tabs>
+        <w:spacing w:after="0" w:line="240" w:lineRule="auto"/>
+        <w:ind w:left="360"/>
+        <w:rPr>
+          <w:rFonts w:ascii="Courier New" w:eastAsia="Times New Roman" w:hAnsi="Courier New" w:cs="Courier New"/>
+          <w:sz w:val="20"/>
+          <w:szCs w:val="20"/>
+          <w:lang w:eastAsia="en-IN"/>
+        </w:rPr>
+      </w:pPr>
+      <w:r>
+        <w:rPr>
+          <w:rFonts w:ascii="Courier New" w:eastAsia="Times New Roman" w:hAnsi="Courier New" w:cs="Courier New"/>
+          <w:sz w:val="20"/>
+          <w:szCs w:val="20"/>
+          <w:lang w:eastAsia="en-IN"/>
+        </w:rPr>
+        <w:t>.\server\scripts\build-frontend.ps1 -Environment dev</w:t>
+      </w:r>
+    </w:p>
+    <w:p>
+      <w:pPr>
+        <w:tabs>
+          <w:tab w:val="left" w:pos="916"/>
+          <w:tab w:val="left" w:pos="1832"/>
+          <w:tab w:val="left" w:pos="2748"/>
+          <w:tab w:val="left" w:pos="3664"/>
+          <w:tab w:val="left" w:pos="4580"/>
+          <w:tab w:val="left" w:pos="5496"/>
+          <w:tab w:val="left" w:pos="6412"/>
+          <w:tab w:val="left" w:pos="7328"/>
+          <w:tab w:val="left" w:pos="8244"/>
+          <w:tab w:val="left" w:pos="9160"/>
+          <w:tab w:val="left" w:pos="10076"/>
+          <w:tab w:val="left" w:pos="10992"/>
+          <w:tab w:val="left" w:pos="11908"/>
+          <w:tab w:val="left" w:pos="12824"/>
+          <w:tab w:val="left" w:pos="13740"/>
+          <w:tab w:val="left" w:pos="14656"/>
+        </w:tabs>
+        <w:spacing w:after="0" w:line="240" w:lineRule="auto"/>
+        <w:ind w:left="360"/>
+        <w:rPr>
+          <w:rFonts w:ascii="Courier New" w:eastAsia="Times New Roman" w:hAnsi="Courier New" w:cs="Courier New"/>
+          <w:sz w:val="20"/>
+          <w:szCs w:val="20"/>
+          <w:lang w:eastAsia="en-IN"/>
+        </w:rPr>
+      </w:pPr>
+      <w:r>
+        <w:rPr>
+          <w:rFonts w:ascii="Courier New" w:eastAsia="Times New Roman" w:hAnsi="Courier New" w:cs="Courier New"/>
+          <w:sz w:val="20"/>
+          <w:szCs w:val="20"/>
+          <w:lang w:eastAsia="en-IN"/>
+        </w:rPr>
+        <w:t>$releaseId = .\server\scripts\publish-release.ps1 -Environment dev | Select-Object -Last 1; Write-Host "ReleaseId=$releaseId"</w:t>
+      </w:r>
+    </w:p>
+    <w:p>
+      <w:pPr>
+        <w:tabs>
+          <w:tab w:val="left" w:pos="916"/>
+          <w:tab w:val="left" w:pos="1832"/>
+          <w:tab w:val="left" w:pos="2748"/>
+          <w:tab w:val="left" w:pos="3664"/>
+          <w:tab w:val="left" w:pos="4580"/>
+          <w:tab w:val="left" w:pos="5496"/>
+          <w:tab w:val="left" w:pos="6412"/>
+          <w:tab w:val="left" w:pos="7328"/>
+          <w:tab w:val="left" w:pos="8244"/>
+          <w:tab w:val="left" w:pos="9160"/>
+          <w:tab w:val="left" w:pos="10076"/>
+          <w:tab w:val="left" w:pos="10992"/>
+          <w:tab w:val="left" w:pos="11908"/>
+          <w:tab w:val="left" w:pos="12824"/>
+          <w:tab w:val="left" w:pos="13740"/>
+          <w:tab w:val="left" w:pos="14656"/>
+        </w:tabs>
+        <w:spacing w:after="0" w:line="240" w:lineRule="auto"/>
+        <w:ind w:left="360"/>
+        <w:rPr>
+          <w:rFonts w:ascii="Courier New" w:eastAsia="Times New Roman" w:hAnsi="Courier New" w:cs="Courier New"/>
+          <w:sz w:val="20"/>
+          <w:szCs w:val="20"/>
+          <w:lang w:eastAsia="en-IN"/>
+        </w:rPr>
+      </w:pPr>
+      <w:r>
+        <w:rPr>
+          <w:rFonts w:ascii="Courier New" w:eastAsia="Times New Roman" w:hAnsi="Courier New" w:cs="Courier New"/>
+          <w:sz w:val="20"/>
+          <w:szCs w:val="20"/>
+          <w:lang w:eastAsia="en-IN"/>
+        </w:rPr>
+        <w:t>.\server\scripts\deploy-release.ps1 -Environment dev -ReleaseId $releaseId</w:t>
+      </w:r>
+    </w:p>
+    <w:p>
+      <w:pPr>
+        <w:tabs>
+          <w:tab w:val="left" w:pos="916"/>
+          <w:tab w:val="left" w:pos="1832"/>
+          <w:tab w:val="left" w:pos="2748"/>
+          <w:tab w:val="left" w:pos="3664"/>
+          <w:tab w:val="left" w:pos="4580"/>
+          <w:tab w:val="left" w:pos="5496"/>
+          <w:tab w:val="left" w:pos="6412"/>
+          <w:tab w:val="left" w:pos="7328"/>
+          <w:tab w:val="left" w:pos="8244"/>
+          <w:tab w:val="left" w:pos="9160"/>
+          <w:tab w:val="left" w:pos="10076"/>
+          <w:tab w:val="left" w:pos="10992"/>
+          <w:tab w:val="left" w:pos="11908"/>
+          <w:tab w:val="left" w:pos="12824"/>
+          <w:tab w:val="left" w:pos="13740"/>
+          <w:tab w:val="left" w:pos="14656"/>
+        </w:tabs>
+        <w:spacing w:after="0" w:line="240" w:lineRule="auto"/>
+        <w:ind w:left="360"/>
+        <w:rPr>
+          <w:rFonts w:ascii="Courier New" w:eastAsia="Times New Roman" w:hAnsi="Courier New" w:cs="Courier New"/>
+          <w:sz w:val="20"/>
+          <w:szCs w:val="20"/>
+          <w:lang w:eastAsia="en-IN"/>
+        </w:rPr>
+      </w:pPr>
+      <w:r>
+        <w:rPr>
+          <w:rFonts w:ascii="Courier New" w:eastAsia="Times New Roman" w:hAnsi="Courier New" w:cs="Courier New"/>
+          <w:sz w:val="20"/>
+          <w:szCs w:val="20"/>
+          <w:lang w:eastAsia="en-IN"/>
+        </w:rPr>
+        <w:t>.\server\scripts\remote-backend.ps1 -Environment dev -Action status</w:t>
+      </w:r>
+    </w:p>
+    <w:p>
+      <w:pPr>
+        <w:tabs>
+          <w:tab w:val="left" w:pos="916"/>
+          <w:tab w:val="left" w:pos="1832"/>
+          <w:tab w:val="left" w:pos="2748"/>
+          <w:tab w:val="left" w:pos="3664"/>
+          <w:tab w:val="left" w:pos="4580"/>
+          <w:tab w:val="left" w:pos="5496"/>
+          <w:tab w:val="left" w:pos="6412"/>
+          <w:tab w:val="left" w:pos="7328"/>
+          <w:tab w:val="left" w:pos="8244"/>
+          <w:tab w:val="left" w:pos="9160"/>
+          <w:tab w:val="left" w:pos="10076"/>
+          <w:tab w:val="left" w:pos="10992"/>
+          <w:tab w:val="left" w:pos="11908"/>
+          <w:tab w:val="left" w:pos="12824"/>
+          <w:tab w:val="left" w:pos="13740"/>
+          <w:tab w:val="left" w:pos="14656"/>
+        </w:tabs>
+        <w:spacing w:after="0" w:line="240" w:lineRule="auto"/>
+        <w:ind w:left="360"/>
+        <w:rPr>
+          <w:rFonts w:ascii="Courier New" w:eastAsia="Times New Roman" w:hAnsi="Courier New" w:cs="Courier New"/>
+          <w:sz w:val="20"/>
+          <w:szCs w:val="20"/>
+          <w:lang w:eastAsia="en-IN"/>
+        </w:rPr>
+      </w:pPr>
+    </w:p>
+    <w:p>
+      <w:pPr>
+        <w:pStyle w:val="ListParagraph"/>
+        <w:numPr>
+          <w:ilvl w:val="0"/>
+          <w:numId w:val="1"/>
+        </w:numPr>
+      </w:pPr>
+      <w:proofErr w:type="gramStart"/>
+      <w:r>
+        <w:t xml:space="preserve">Back </w:t>
+      </w:r>
+      <w:r>
+        <w:t>end</w:t>
+      </w:r>
+      <w:proofErr w:type="gramEnd"/>
+      <w:r>
+        <w:t xml:space="preserve"> build and deploy</w:t>
+      </w:r>
+    </w:p>
+    <w:p>
+      <w:pPr>
+        <w:pStyle w:val="ListParagraph"/>
+        <w:tabs>
+          <w:tab w:val="left" w:pos="916"/>
+          <w:tab w:val="left" w:pos="1832"/>
+          <w:tab w:val="left" w:pos="2748"/>
+          <w:tab w:val="left" w:pos="3664"/>
+          <w:tab w:val="left" w:pos="4580"/>
+          <w:tab w:val="left" w:pos="5496"/>
+          <w:tab w:val="left" w:pos="6412"/>
+          <w:tab w:val="left" w:pos="7328"/>
+          <w:tab w:val="left" w:pos="8244"/>
+          <w:tab w:val="left" w:pos="9160"/>
+          <w:tab w:val="left" w:pos="10076"/>
+          <w:tab w:val="left" w:pos="10992"/>
+          <w:tab w:val="left" w:pos="11908"/>
+          <w:tab w:val="left" w:pos="12824"/>
+          <w:tab w:val="left" w:pos="13740"/>
+          <w:tab w:val="left" w:pos="14656"/>
+        </w:tabs>
+        <w:spacing w:after="0" w:line="240" w:lineRule="auto"/>
+        <w:rPr>
+          <w:rFonts w:ascii="Courier New" w:eastAsia="Times New Roman" w:hAnsi="Courier New" w:cs="Courier New"/>
+          <w:sz w:val="20"/>
+          <w:szCs w:val="20"/>
+          <w:lang w:eastAsia="en-IN"/>
+        </w:rPr>
+      </w:pPr>
+      <w:r>
+        <w:rPr>
+          <w:rFonts w:ascii="Courier New" w:eastAsia="Times New Roman" w:hAnsi="Courier New" w:cs="Courier New"/>
+          <w:sz w:val="20"/>
+          <w:szCs w:val="20"/>
+          <w:lang w:eastAsia="en-IN"/>
+        </w:rPr>
+        <w:t>.\server\scripts\build-backend.ps1 -Environment dev</w:t>
+      </w:r>
+    </w:p>
+    <w:p>
+      <w:pPr>
+        <w:pStyle w:val="ListParagraph"/>
+      </w:pPr>
+      <w:r>
+        <w:t>$releaseId = .\server\scripts\publish-release.ps1 -Environment dev | Select-Object -Last 1; Write-Host "ReleaseId=$releaseId"</w:t>
+      </w:r>
+    </w:p>
+    <w:p>
+      <w:pPr>
+        <w:pStyle w:val="ListParagraph"/>
+      </w:pPr>
+      <w:r>
+        <w:t>.\server\scripts\deploy-release.ps1 -Environment dev -ReleaseId $releaseId</w:t>
+      </w:r>
+    </w:p>
+    <w:p>
+      <w:pPr>
+        <w:pStyle w:val="ListParagraph"/>
+      </w:pPr>
+      <w:r>
+        <w:t>.\server\scripts\remote-backend.ps1 -Environment dev -Action status</w:t>
+      </w:r>
+    </w:p>
+    <w:p>
+      <w:pPr>
+        <w:pStyle w:val="ListParagraph"/>
+      </w:pPr>
+    </w:p>
+    <w:p>
+      <w:pPr>
+        <w:pStyle w:val="ListParagraph"/>
+        <w:numPr>
+          <w:ilvl w:val="0"/>
+          <w:numId w:val="1"/>
+        </w:numPr>
+      </w:pPr>
+      <w:r>
+        <w:t>Lambda Only Change</w:t>
+      </w:r>
+    </w:p>
+    <w:p>
+      <w:pPr>
+        <w:pStyle w:val="ListParagraph"/>
+        <w:tabs>
+          <w:tab w:val="left" w:pos="916"/>
+          <w:tab w:val="left" w:pos="1832"/>
+          <w:tab w:val="left" w:pos="2748"/>
+          <w:tab w:val="left" w:pos="3664"/>
+          <w:tab w:val="left" w:pos="4580"/>
+          <w:tab w:val="left" w:pos="5496"/>
+          <w:tab w:val="left" w:pos="6412"/>
+          <w:tab w:val="left" w:pos="7328"/>
+          <w:tab w:val="left" w:pos="8244"/>
+          <w:tab w:val="left" w:pos="9160"/>
+          <w:tab w:val="left" w:pos="10076"/>
+          <w:tab w:val="left" w:pos="10992"/>
+          <w:tab w:val="left" w:pos="11908"/>
+          <w:tab w:val="left" w:pos="12824"/>
+          <w:tab w:val="left" w:pos="13740"/>
+          <w:tab w:val="left" w:pos="14656"/>
+        </w:tabs>
+        <w:spacing w:after="0" w:line="240" w:lineRule="auto"/>
+        <w:rPr>
+          <w:rFonts w:ascii="Courier New" w:eastAsia="Times New Roman" w:hAnsi="Courier New" w:cs="Courier New"/>
+          <w:sz w:val="20"/>
+          <w:szCs w:val="20"/>
+          <w:lang w:eastAsia="en-IN"/>
+        </w:rPr>
+      </w:pPr>
+      <w:proofErr w:type="gramStart"/>
+      <w:r>
+        <w:rPr>
+          <w:rFonts w:ascii="Courier New" w:eastAsia="Times New Roman" w:hAnsi="Courier New" w:cs="Courier New"/>
+          <w:sz w:val="20"/>
+          <w:szCs w:val="20"/>
+          <w:lang w:eastAsia="en-IN"/>
+        </w:rPr>
+        <w:t>.\gradlew.bat :lambda</w:t>
+      </w:r>
+      <w:proofErr w:type="gramEnd"/>
+      <w:r>
+        <w:rPr>
+          <w:rFonts w:ascii="Courier New" w:eastAsia="Times New Roman" w:hAnsi="Courier New" w:cs="Courier New"/>
+          <w:sz w:val="20"/>
+          <w:szCs w:val="20"/>
+          <w:lang w:eastAsia="en-IN"/>
+        </w:rPr>
+        <w:t>:sms-processor:jar</w:t>
+      </w:r>
+    </w:p>
+    <w:p>
+      <w:pPr>
+        <w:pStyle w:val="ListParagraph"/>
+        <w:rPr>
+          <w:rFonts w:ascii="Courier New" w:eastAsia="Times New Roman" w:hAnsi="Courier New" w:cs="Courier New"/>
+          <w:sz w:val="20"/>
+          <w:szCs w:val="20"/>
+          <w:lang w:eastAsia="en-IN"/>
+        </w:rPr>
+      </w:pPr>
+      <w:r>
+        <w:rPr>
+          <w:rFonts w:ascii="Courier New" w:eastAsia="Times New Roman" w:hAnsi="Courier New" w:cs="Courier New"/>
+          <w:sz w:val="20"/>
+          <w:szCs w:val="20"/>
+          <w:lang w:eastAsia="en-IN"/>
+        </w:rPr>
+        <w:t>.\infra\scripts\deploy.ps1 dev plan</w:t>
+      </w:r>
+    </w:p>
+    <w:p>
+      <w:pPr>
+        <w:pStyle w:val="ListParagraph"/>
+        <w:rPr>
+          <w:rFonts w:ascii="Courier New" w:eastAsia="Times New Roman" w:hAnsi="Courier New" w:cs="Courier New"/>
+          <w:sz w:val="20"/>
+          <w:szCs w:val="20"/>
+          <w:lang w:eastAsia="en-IN"/>
+        </w:rPr>
+      </w:pPr>
+      <w:r>
+        <w:rPr>
+          <w:rFonts w:ascii="Courier New" w:eastAsia="Times New Roman" w:hAnsi="Courier New" w:cs="Courier New"/>
+          <w:sz w:val="20"/>
+          <w:szCs w:val="20"/>
+          <w:lang w:eastAsia="en-IN"/>
+        </w:rPr>
+        <w:t xml:space="preserve">.\infra\scripts\deploy.ps1 dev </w:t>
+      </w:r>
+      <w:proofErr w:type="gramStart"/>
+      <w:r>
+        <w:rPr>
+          <w:rFonts w:ascii="Courier New" w:eastAsia="Times New Roman" w:hAnsi="Courier New" w:cs="Courier New"/>
+          <w:sz w:val="20"/>
+          <w:szCs w:val="20"/>
+          <w:lang w:eastAsia="en-IN"/>
+        </w:rPr>
+        <w:t>apply</w:t>
+      </w:r>
+      <w:proofErr w:type="gramEnd"/>
+    </w:p>
+    <w:p>
+      <w:pPr>
+        <w:pStyle w:val="ListParagraph"/>
+        <w:rPr>
+          <w:rFonts w:ascii="Courier New" w:eastAsia="Times New Roman" w:hAnsi="Courier New" w:cs="Courier New"/>
+          <w:sz w:val="20"/>
+          <w:szCs w:val="20"/>
+          <w:lang w:eastAsia="en-IN"/>
+        </w:rPr>
+      </w:pPr>
+      <w:r>
+        <w:rPr>
+          <w:rFonts w:ascii="Courier New" w:eastAsia="Times New Roman" w:hAnsi="Courier New" w:cs="Courier New"/>
+          <w:sz w:val="20"/>
+          <w:szCs w:val="20"/>
+          <w:lang w:eastAsia="en-IN"/>
+        </w:rPr>
+        <w:t>aws logs tail /aws/lambda/memgine-dev-sms-processor --follow --profile memgine --region ca-central-1</w:t>
+      </w:r>
+    </w:p>
+    <w:p>
+      <w:pPr>
+        <w:pStyle w:val="ListParagraph"/>
+        <w:numPr>
+          <w:ilvl w:val="0"/>
+          <w:numId w:val="1"/>
+        </w:numPr>
+        <w:rPr>
+          <w:rFonts w:ascii="Courier New" w:eastAsia="Times New Roman" w:hAnsi="Courier New" w:cs="Courier New"/>
+          <w:sz w:val="20"/>
+          <w:szCs w:val="20"/>
+          <w:lang w:eastAsia="en-IN"/>
+        </w:rPr>
+      </w:pPr>
+      <w:r>
+        <w:rPr>
+          <w:rFonts w:ascii="Courier New" w:eastAsia="Times New Roman" w:hAnsi="Courier New" w:cs="Courier New"/>
+          <w:sz w:val="20"/>
+          <w:szCs w:val="20"/>
+          <w:lang w:eastAsia="en-IN"/>
+        </w:rPr>
+        <w:t>Both front end and back end</w:t>
+      </w:r>
+    </w:p>
+    <w:p>
+      <w:pPr>
+        <w:pStyle w:val="ListParagraph"/>
+        <w:tabs>
+          <w:tab w:val="left" w:pos="916"/>
+          <w:tab w:val="left" w:pos="1832"/>
+          <w:tab w:val="left" w:pos="2748"/>
+          <w:tab w:val="left" w:pos="3664"/>
+          <w:tab w:val="left" w:pos="4580"/>
+          <w:tab w:val="left" w:pos="5496"/>
+          <w:tab w:val="left" w:pos="6412"/>
+          <w:tab w:val="left" w:pos="7328"/>
+          <w:tab w:val="left" w:pos="8244"/>
+          <w:tab w:val="left" w:pos="9160"/>
+          <w:tab w:val="left" w:pos="10076"/>
+          <w:tab w:val="left" w:pos="10992"/>
+          <w:tab w:val="left" w:pos="11908"/>
+          <w:tab w:val="left" w:pos="12824"/>
+          <w:tab w:val="left" w:pos="13740"/>
+          <w:tab w:val="left" w:pos="14656"/>
+        </w:tabs>
+        <w:spacing w:after="0" w:line="240" w:lineRule="auto"/>
+        <w:rPr>
+          <w:rFonts w:ascii="Courier New" w:eastAsia="Times New Roman" w:hAnsi="Courier New" w:cs="Courier New"/>
+          <w:sz w:val="20"/>
+          <w:szCs w:val="20"/>
+          <w:lang w:eastAsia="en-IN"/>
+        </w:rPr>
+      </w:pPr>
+      <w:r>
+        <w:rPr>
+          <w:rFonts w:ascii="Courier New" w:eastAsia="Times New Roman" w:hAnsi="Courier New" w:cs="Courier New"/>
+          <w:sz w:val="20"/>
+          <w:szCs w:val="20"/>
+          <w:lang w:eastAsia="en-IN"/>
+        </w:rPr>
+        <w:t>.\server\scripts\deploy-release.ps1 -Environment dev</w:t>
+      </w:r>
+    </w:p>
+    <w:p>
+      <w:pPr>
+        <w:pStyle w:val="ListParagraph"/>
+        <w:rPr>
+          <w:rFonts w:ascii="Courier New" w:eastAsia="Times New Roman" w:hAnsi="Courier New" w:cs="Courier New"/>
+          <w:sz w:val="20"/>
+          <w:szCs w:val="20"/>
+          <w:lang w:eastAsia="en-IN"/>
+        </w:rPr>
+      </w:pPr>
+      <w:r>
+        <w:rPr>
+          <w:rFonts w:ascii="Courier New" w:eastAsia="Times New Roman" w:hAnsi="Courier New" w:cs="Courier New"/>
+          <w:sz w:val="20"/>
+          <w:szCs w:val="20"/>
+          <w:lang w:eastAsia="en-IN"/>
+        </w:rPr>
+        <w:t>.\server\scripts\remote-backend.ps1 -Environment dev -Action status</w:t>
+      </w:r>
+    </w:p>
+    <w:p>
+      <w:pPr>
+        <w:pStyle w:val="ListParagraph"/>
+        <w:tabs>
+          <w:tab w:val="left" w:pos="916"/>
+          <w:tab w:val="left" w:pos="1832"/>
+          <w:tab w:val="left" w:pos="2748"/>
+          <w:tab w:val="left" w:pos="3664"/>
+          <w:tab w:val="left" w:pos="4580"/>
+          <w:tab w:val="left" w:pos="5496"/>
+          <w:tab w:val="left" w:pos="6412"/>
+          <w:tab w:val="left" w:pos="7328"/>
+          <w:tab w:val="left" w:pos="8244"/>
+          <w:tab w:val="left" w:pos="9160"/>
+          <w:tab w:val="left" w:pos="10076"/>
+          <w:tab w:val="left" w:pos="10992"/>
+          <w:tab w:val="left" w:pos="11908"/>
+          <w:tab w:val="left" w:pos="12824"/>
+          <w:tab w:val="left" w:pos="13740"/>
+          <w:tab w:val="left" w:pos="14656"/>
+        </w:tabs>
+        <w:spacing w:after="0" w:line="240" w:lineRule="auto"/>
+        <w:rPr>
+          <w:rFonts w:ascii="Courier New" w:eastAsia="Times New Roman" w:hAnsi="Courier New" w:cs="Courier New"/>
+          <w:sz w:val="20"/>
+          <w:szCs w:val="20"/>
+          <w:lang w:eastAsia="en-IN"/>
+        </w:rPr>
+      </w:pPr>
+    </w:p>
+    <w:p>
+      <w:pPr>
+        <w:pStyle w:val="ListParagraph"/>
+        <w:rPr>
+          <w:rFonts w:ascii="Courier New" w:eastAsia="Times New Roman" w:hAnsi="Courier New" w:cs="Courier New"/>
+          <w:sz w:val="20"/>
+          <w:szCs w:val="20"/>
+          <w:lang w:eastAsia="en-IN"/>
+        </w:rPr>
+      </w:pPr>
+    </w:p>
+    <w:p>
+      <w:pPr>
+        <w:pStyle w:val="ListParagraph"/>
+        <w:rPr>
+          <w:rFonts w:ascii="Courier New" w:eastAsia="Times New Roman" w:hAnsi="Courier New" w:cs="Courier New"/>
+          <w:sz w:val="20"/>
+          <w:szCs w:val="20"/>
+          <w:lang w:eastAsia="en-IN"/>
+        </w:rPr>
+      </w:pPr>
+    </w:p>
+    <w:p>
+      <w:pPr>
+        <w:pStyle w:val="ListParagraph"/>
+        <w:tabs>
+          <w:tab w:val="left" w:pos="916"/>
+          <w:tab w:val="left" w:pos="1832"/>
+          <w:tab w:val="left" w:pos="2748"/>
+          <w:tab w:val="left" w:pos="3664"/>
+          <w:tab w:val="left" w:pos="4580"/>
+          <w:tab w:val="left" w:pos="5496"/>
+          <w:tab w:val="left" w:pos="6412"/>
+          <w:tab w:val="left" w:pos="7328"/>
+          <w:tab w:val="left" w:pos="8244"/>
+          <w:tab w:val="left" w:pos="9160"/>
+          <w:tab w:val="left" w:pos="10076"/>
+          <w:tab w:val="left" w:pos="10992"/>
+          <w:tab w:val="left" w:pos="11908"/>
+          <w:tab w:val="left" w:pos="12824"/>
+          <w:tab w:val="left" w:pos="13740"/>
+          <w:tab w:val="left" w:pos="14656"/>
+        </w:tabs>
+        <w:spacing w:after="0" w:line="240" w:lineRule="auto"/>
+        <w:rPr>
+          <w:rFonts w:ascii="Courier New" w:eastAsia="Times New Roman" w:hAnsi="Courier New" w:cs="Courier New"/>
+          <w:sz w:val="20"/>
+          <w:szCs w:val="20"/>
+          <w:lang w:eastAsia="en-IN"/>
+        </w:rPr>
+      </w:pPr>
+    </w:p>
+    <w:p>
+      <w:pPr>
+        <w:pStyle w:val="ListParagraph"/>
+      </w:pPr>
+    </w:p>
     <w:p/>
     <w:p/>
     <w:sectPr>
@@ -431,6 +1207,103 @@
     </w:sectPr>
   </w:body>
 </w:document>
+</file>
+
+<file path=word/numbering.xml><?xml version="1.0" encoding="utf-8"?>
+<w:numbering xmlns:wpc="http://schemas.microsoft.com/office/word/2010/wordprocessingCanvas" xmlns:cx="http://schemas.microsoft.com/office/drawing/2014/chartex" xmlns:cx1="http://schemas.microsoft.com/office/drawing/2015/9/8/chartex" xmlns:cx2="http://schemas.microsoft.com/office/drawing/2015/10/21/chartex" xmlns:cx3="http://schemas.microsoft.com/office/drawing/2016/5/9/chartex" xmlns:cx4="http://schemas.microsoft.com/office/drawing/2016/5/10/chartex" xmlns:cx5="http://schemas.microsoft.com/office/drawing/2016/5/11/chartex" xmlns:cx6="http://schemas.microsoft.com/office/drawing/2016/5/12/chartex" xmlns:cx7="http://schemas.microsoft.com/office/drawing/2016/5/13/chartex" xmlns:cx8="http://schemas.microsoft.com/office/drawing/2016/5/14/chartex" xmlns:mc="http://schemas.openxmlformats.org/markup-compatibility/2006" xmlns:aink="http://schemas.microsoft.com/office/drawing/2016/ink" xmlns:am3d="http://schemas.microsoft.com/office/drawing/2017/model3d" xmlns:o="urn:schemas-microsoft-com:office:office" xmlns:oel="http://schemas.microsoft.com/office/2019/extlst" xmlns:r="http://schemas.openxmlformats.org/officeDocument/2006/relationships" xmlns:m="http://schemas.openxmlformats.org/officeDocument/2006/math" xmlns:v="urn:schemas-microsoft-com:vml" xmlns:wp14="http://schemas.microsoft.com/office/word/2010/wordprocessingDrawing" xmlns:wp="http://schemas.openxmlformats.org/drawingml/2006/wordprocessingDrawing" xmlns:w10="urn:schemas-microsoft-com:office:word" xmlns:w="http://schemas.openxmlformats.org/wordprocessingml/2006/main" xmlns:w14="http://schemas.microsoft.com/office/word/2010/wordml" xmlns:w15="http://schemas.microsoft.com/office/word/2012/wordml" xmlns:w16cex="http://schemas.microsoft.com/office/word/2018/wordml/cex" xmlns:w16cid="http://schemas.microsoft.com/office/word/2016/wordml/cid" xmlns:w16="http://schemas.microsoft.com/office/word/2018/wordml" xmlns:w16du="http://schemas.microsoft.com/office/word/2023/wordml/word16du" xmlns:w16sdtdh="http://schemas.microsoft.com/office/word/2020/wordml/sdtdatahash" xmlns:w16sdtfl="http://schemas.microsoft.com/office/word/2024/wordml/sdtformatlock" xmlns:w16se="http://schemas.microsoft.com/office/word/2015/wordml/symex" xmlns:wpg="http://schemas.microsoft.com/office/word/2010/wordprocessingGroup" xmlns:wpi="http://schemas.microsoft.com/office/word/2010/wordprocessingInk" xmlns:wne="http://schemas.microsoft.com/office/word/2006/wordml" xmlns:wps="http://schemas.microsoft.com/office/word/2010/wordprocessingShape" mc:Ignorable="w14 w15 w16se w16cid w16 w16cex w16sdtdh w16sdtfl w16du wp14">
+  <w:abstractNum w:abstractNumId="0" w15:restartNumberingAfterBreak="0">
+    <w:nsid w:val="76DF0CD0"/>
+    <w:multiLevelType w:val="hybridMultilevel"/>
+    <w:tmpl w:val="97C4C618"/>
+    <w:lvl w:ilvl="0" w:tplc="4009000F">
+      <w:start w:val="1"/>
+      <w:numFmt w:val="decimal"/>
+      <w:lvlText w:val="%1."/>
+      <w:lvlJc w:val="left"/>
+      <w:pPr>
+        <w:ind w:left="720" w:hanging="360"/>
+      </w:pPr>
+      <w:rPr>
+        <w:rFonts w:hint="default"/>
+      </w:rPr>
+    </w:lvl>
+    <w:lvl w:ilvl="1" w:tplc="40090019" w:tentative="1">
+      <w:start w:val="1"/>
+      <w:numFmt w:val="lowerLetter"/>
+      <w:lvlText w:val="%2."/>
+      <w:lvlJc w:val="left"/>
+      <w:pPr>
+        <w:ind w:left="1440" w:hanging="360"/>
+      </w:pPr>
+    </w:lvl>
+    <w:lvl w:ilvl="2" w:tplc="4009001B" w:tentative="1">
+      <w:start w:val="1"/>
+      <w:numFmt w:val="lowerRoman"/>
+      <w:lvlText w:val="%3."/>
+      <w:lvlJc w:val="right"/>
+      <w:pPr>
+        <w:ind w:left="2160" w:hanging="180"/>
+      </w:pPr>
+    </w:lvl>
+    <w:lvl w:ilvl="3" w:tplc="4009000F" w:tentative="1">
+      <w:start w:val="1"/>
+      <w:numFmt w:val="decimal"/>
+      <w:lvlText w:val="%4."/>
+      <w:lvlJc w:val="left"/>
+      <w:pPr>
+        <w:ind w:left="2880" w:hanging="360"/>
+      </w:pPr>
+    </w:lvl>
+    <w:lvl w:ilvl="4" w:tplc="40090019" w:tentative="1">
+      <w:start w:val="1"/>
+      <w:numFmt w:val="lowerLetter"/>
+      <w:lvlText w:val="%5."/>
+      <w:lvlJc w:val="left"/>
+      <w:pPr>
+        <w:ind w:left="3600" w:hanging="360"/>
+      </w:pPr>
+    </w:lvl>
+    <w:lvl w:ilvl="5" w:tplc="4009001B" w:tentative="1">
+      <w:start w:val="1"/>
+      <w:numFmt w:val="lowerRoman"/>
+      <w:lvlText w:val="%6."/>
+      <w:lvlJc w:val="right"/>
+      <w:pPr>
+        <w:ind w:left="4320" w:hanging="180"/>
+      </w:pPr>
+    </w:lvl>
+    <w:lvl w:ilvl="6" w:tplc="4009000F" w:tentative="1">
+      <w:start w:val="1"/>
+      <w:numFmt w:val="decimal"/>
+      <w:lvlText w:val="%7."/>
+      <w:lvlJc w:val="left"/>
+      <w:pPr>
+        <w:ind w:left="5040" w:hanging="360"/>
+      </w:pPr>
+    </w:lvl>
+    <w:lvl w:ilvl="7" w:tplc="40090019" w:tentative="1">
+      <w:start w:val="1"/>
+      <w:numFmt w:val="lowerLetter"/>
+      <w:lvlText w:val="%8."/>
+      <w:lvlJc w:val="left"/>
+      <w:pPr>
+        <w:ind w:left="5760" w:hanging="360"/>
+      </w:pPr>
+    </w:lvl>
+    <w:lvl w:ilvl="8" w:tplc="4009001B" w:tentative="1">
+      <w:start w:val="1"/>
+      <w:numFmt w:val="lowerRoman"/>
+      <w:lvlText w:val="%9."/>
+      <w:lvlJc w:val="right"/>
+      <w:pPr>
+        <w:ind w:left="6480" w:hanging="180"/>
+      </w:pPr>
+    </w:lvl>
+  </w:abstractNum>
+  <w:num w:numId="1" w16cid:durableId="1960331650">
+    <w:abstractNumId w:val="0"/>
+  </w:num>
+</w:numbering>
 </file>
 
 <file path=word/styles.xml><?xml version="1.0" encoding="utf-8"?>
@@ -1377,6 +2250,19 @@
       <w:szCs w:val="20"/>
     </w:rPr>
   </w:style>
+  <w:style w:type="character" w:styleId="HTMLCode">
+    <w:name w:val="HTML Code"/>
+    <w:basedOn w:val="DefaultParagraphFont"/>
+    <w:uiPriority w:val="99"/>
+    <w:semiHidden/>
+    <w:unhideWhenUsed/>
+    <w:rsid w:val="0056476E"/>
+    <w:rPr>
+      <w:rFonts w:ascii="Courier New" w:eastAsia="Times New Roman" w:hAnsi="Courier New" w:cs="Courier New"/>
+      <w:sz w:val="20"/>
+      <w:szCs w:val="20"/>
+    </w:rPr>
+  </w:style>
 </w:styles>
 </file>
 

</xml_diff>

<commit_message>
offer forrm and stores fixes
</commit_message>
<xml_diff>
--- a/docs/Memgine DEV environment set UP.docx
+++ b/docs/Memgine DEV environment set UP.docx
@@ -27,13 +27,8 @@
     </w:p>
     <w:p>
       <w:r>
-        <w:t xml:space="preserve">.\infra\scripts\deploy.ps1 dev </w:t>
-      </w:r>
-      <w:proofErr w:type="gramStart"/>
-      <w:r>
-        <w:t>apply</w:t>
-      </w:r>
-      <w:proofErr w:type="gramEnd"/>
+        <w:t>.\infra\scripts\deploy.ps1 dev apply</w:t>
+      </w:r>
     </w:p>
     <w:p>
       <w:r>
@@ -94,15 +89,7 @@
     </w:p>
     <w:p>
       <w:r>
-        <w:t>aws ssm describe-instance-information --profile memgine --region ca-central-1 --filters "Key=</w:t>
-      </w:r>
-      <w:proofErr w:type="gramStart"/>
-      <w:r>
-        <w:t>InstanceIds,Values</w:t>
-      </w:r>
-      <w:proofErr w:type="gramEnd"/>
-      <w:r>
-        <w:t>=$instance"</w:t>
+        <w:t>aws ssm describe-instance-information --profile memgine --region ca-central-1 --filters "Key=InstanceIds,Values=$instance"</w:t>
       </w:r>
     </w:p>
     <w:p>
@@ -112,23 +99,13 @@
     </w:p>
     <w:p>
       <w:r>
-        <w:t>aws ssm start-session --profile memgine --region ca-central-1 --target $instance --document-name AWS-StartPortForwardingSessionToRemoteHost --parameters "host=$</w:t>
-      </w:r>
-      <w:proofErr w:type="gramStart"/>
-      <w:r>
-        <w:t>rds,portNumber</w:t>
-      </w:r>
-      <w:proofErr w:type="gramEnd"/>
-      <w:r>
-        <w:t>=</w:t>
-      </w:r>
-      <w:proofErr w:type="gramStart"/>
-      <w:r>
-        <w:t>5432,localPortNumber</w:t>
-      </w:r>
-      <w:proofErr w:type="gramEnd"/>
-      <w:r>
-        <w:t>=15432"</w:t>
+        <w:t>$instance = terraform "-chdir=.\infra\envs\dev" output -raw app_ec2_instance_id</w:t>
+      </w:r>
+    </w:p>
+    <w:p/>
+    <w:p>
+      <w:r>
+        <w:t>aws ssm start-session --profile memgine --region ca-central-1 --target $instance --document-name AWS-StartPortForwardingSessionToRemoteHost --parameters "host=$rds,portNumber=5432,localPortNumber=15432"</w:t>
       </w:r>
     </w:p>
     <w:p>
@@ -148,13 +125,16 @@
     </w:p>
     <w:p>
       <w:r>
-        <w:t>$raw = aws secretsmanager get-secret-value --profile memgine --region ca-central-1 --secret-id $runtime --query SecretString --output text; $obj = $raw | ConvertFrom-Json; Write-Host "username=$($obj.username) host=$($obj.host) port=$($obj.port) database=$($obj.database) schema=$($obj.schema) passwordPresent=$(-not [string]::IsNullOrWhiteSpace($obj.password))"</w:t>
+        <w:t xml:space="preserve">$raw = aws secretsmanager get-secret-value --profile memgine --region ca-central-1 --secret-id $runtime --query SecretString --output text; $obj = $raw | ConvertFrom-Json; Write-Host </w:t>
+      </w:r>
+      <w:r>
+        <w:lastRenderedPageBreak/>
+        <w:t>"username=$($obj.username) host=$($obj.host) port=$($obj.port) database=$($obj.database) schema=$($obj.schema) passwordPresent=$(-not [string]::IsNullOrWhiteSpace($obj.password))"</w:t>
       </w:r>
     </w:p>
     <w:p/>
     <w:p>
       <w:r>
-        <w:lastRenderedPageBreak/>
         <w:t>.\infra\scripts\deploy-db.ps1 dev -LiquibaseSecretArn $liquibase -DatabaseHost 127.0.0.1 -DatabasePort 15432</w:t>
       </w:r>
     </w:p>
@@ -167,10 +147,7 @@
     <w:p/>
     <w:p>
       <w:r>
-        <w:t>Dev</w:t>
-      </w:r>
-      <w:r>
-        <w:t xml:space="preserve"> schema memgine_dev</w:t>
+        <w:t>Dev schema memgine_dev</w:t>
       </w:r>
     </w:p>
     <w:p>
@@ -199,10 +176,7 @@
     </w:p>
     <w:p>
       <w:r>
-        <w:t xml:space="preserve">Dev </w:t>
-      </w:r>
-      <w:r>
-        <w:t xml:space="preserve">app usr - </w:t>
+        <w:t xml:space="preserve">Dev app usr - </w:t>
       </w:r>
       <w:r>
         <w:t>memgine_</w:t>
@@ -213,10 +187,7 @@
     </w:p>
     <w:p>
       <w:r>
-        <w:t>Dev</w:t>
-      </w:r>
-      <w:r>
-        <w:t xml:space="preserve"> app user password – </w:t>
+        <w:t xml:space="preserve">Dev app user password – </w:t>
       </w:r>
       <w:r>
         <w:tab/>
@@ -278,23 +249,7 @@
     </w:p>
     <w:p>
       <w:r>
-        <w:t xml:space="preserve">    "ARN": "</w:t>
-      </w:r>
-      <w:proofErr w:type="gramStart"/>
-      <w:r>
-        <w:t>arn:aws</w:t>
-      </w:r>
-      <w:proofErr w:type="gramEnd"/>
-      <w:r>
-        <w:t>:secretsmanager:ca-central-</w:t>
-      </w:r>
-      <w:proofErr w:type="gramStart"/>
-      <w:r>
-        <w:t>1:482762107384:secret</w:t>
-      </w:r>
-      <w:proofErr w:type="gramEnd"/>
-      <w:r>
-        <w:t>:memgine/dev/otp-pepper-1MY6Id",</w:t>
+        <w:t xml:space="preserve">    "ARN": "arn:aws:secretsmanager:ca-central-1:482762107384:secret:memgine/dev/otp-pepper-1MY6Id",</w:t>
       </w:r>
     </w:p>
     <w:p>
@@ -304,6 +259,7 @@
     </w:p>
     <w:p>
       <w:r>
+        <w:lastRenderedPageBreak/>
         <w:t xml:space="preserve">    "VersionId": "3dc7aa0d-da3a-4763-9519-af9d9536bc9d",</w:t>
       </w:r>
     </w:p>
@@ -319,7 +275,6 @@
     </w:p>
     <w:p>
       <w:r>
-        <w:lastRenderedPageBreak/>
         <w:t xml:space="preserve">    ]</w:t>
       </w:r>
     </w:p>
@@ -437,28 +392,12 @@
     <w:p/>
     <w:p>
       <w:r>
-        <w:t xml:space="preserve">Memgine internal PK/FK identifiers   → </w:t>
-      </w:r>
-      <w:proofErr w:type="gramStart"/>
-      <w:r>
-        <w:t>varchar(</w:t>
-      </w:r>
-      <w:proofErr w:type="gramEnd"/>
-      <w:r>
-        <w:t>64)</w:t>
-      </w:r>
-    </w:p>
-    <w:p>
-      <w:r>
-        <w:t xml:space="preserve">Memgine internal business codes      → </w:t>
-      </w:r>
-      <w:proofErr w:type="gramStart"/>
-      <w:r>
-        <w:t>varchar(</w:t>
-      </w:r>
-      <w:proofErr w:type="gramEnd"/>
-      <w:r>
-        <w:t>64)</w:t>
+        <w:t>Memgine internal PK/FK identifiers   → varchar(64)</w:t>
+      </w:r>
+    </w:p>
+    <w:p>
+      <w:r>
+        <w:t>Memgine internal business codes      → varchar(64)</w:t>
       </w:r>
     </w:p>
     <w:p>
@@ -491,10 +430,7 @@
         <w:t>bb30da7e-1ad3-4454-ae5e-9ea47e214ff8</w:t>
       </w:r>
       <w:r>
-        <w:t xml:space="preserve"> </w:t>
-      </w:r>
-      <w:r>
-        <w:t>--instance-id i-02a49b07c1b9979a5 --output json</w:t>
+        <w:t xml:space="preserve"> --instance-id i-02a49b07c1b9979a5 --output json</w:t>
       </w:r>
     </w:p>
     <w:p/>
@@ -507,92 +443,20 @@
         <w:t>161cb89a-b839-4d41-b6c0-5e582033c194</w:t>
       </w:r>
       <w:r>
-        <w:t>--instance-id i-02a49b07c1b9979a5 --query "{</w:t>
-      </w:r>
-      <w:proofErr w:type="gramStart"/>
-      <w:r>
-        <w:t>Status:Status</w:t>
-      </w:r>
-      <w:proofErr w:type="gramEnd"/>
-      <w:r>
-        <w:t>,</w:t>
-      </w:r>
-      <w:proofErr w:type="gramStart"/>
-      <w:r>
-        <w:t>ResponseCode:ResponseCode</w:t>
-      </w:r>
-      <w:proofErr w:type="gramEnd"/>
-      <w:r>
-        <w:t>,</w:t>
-      </w:r>
-      <w:proofErr w:type="gramStart"/>
-      <w:r>
-        <w:t>StdOut:StandardOutputContent</w:t>
-      </w:r>
-      <w:proofErr w:type="gramEnd"/>
-      <w:r>
-        <w:t>,</w:t>
-      </w:r>
-      <w:proofErr w:type="gramStart"/>
-      <w:r>
-        <w:t>StdErr:StandardErrorContent</w:t>
-      </w:r>
-      <w:proofErr w:type="gramEnd"/>
-      <w:r>
-        <w:t>}" --output json</w:t>
+        <w:t>--instance-id i-02a49b07c1b9979a5 --query "{Status:Status,ResponseCode:ResponseCode,StdOut:StandardOutputContent,StdErr:StandardErrorContent}" --output json</w:t>
       </w:r>
     </w:p>
     <w:p/>
     <w:p>
       <w:r>
-        <w:t>aws ssm get-command-invocation --profile memgine --region ca-central-1 --command-id 161cb89a-b839-4d41-b6c0-5e582033c194 --instance-id i-02a49b07c1b9979a5 --query "{</w:t>
-      </w:r>
-      <w:proofErr w:type="gramStart"/>
-      <w:r>
-        <w:t>Status:Status</w:t>
-      </w:r>
-      <w:proofErr w:type="gramEnd"/>
-      <w:r>
-        <w:t>,</w:t>
-      </w:r>
-      <w:proofErr w:type="gramStart"/>
-      <w:r>
-        <w:t>ResponseCode:ResponseCode</w:t>
-      </w:r>
-      <w:proofErr w:type="gramEnd"/>
-      <w:r>
-        <w:t>,</w:t>
-      </w:r>
-      <w:proofErr w:type="gramStart"/>
-      <w:r>
-        <w:t>StdOut:StandardOutputContent</w:t>
-      </w:r>
-      <w:proofErr w:type="gramEnd"/>
-      <w:r>
-        <w:t>,</w:t>
-      </w:r>
-      <w:proofErr w:type="gramStart"/>
-      <w:r>
-        <w:t>StdErr:StandardErrorContent</w:t>
-      </w:r>
-      <w:proofErr w:type="gramEnd"/>
-      <w:r>
-        <w:t>}" --output json</w:t>
+        <w:t>aws ssm get-command-invocation --profile memgine --region ca-central-1 --command-id 161cb89a-b839-4d41-b6c0-5e582033c194 --instance-id i-02a49b07c1b9979a5 --query "{Status:Status,ResponseCode:ResponseCode,StdOut:StandardOutputContent,StdErr:StandardErrorContent}" --output json</w:t>
       </w:r>
     </w:p>
     <w:p/>
     <w:p/>
     <w:p>
       <w:r>
-        <w:t>$localHash</w:t>
-      </w:r>
-      <w:proofErr w:type="gramStart"/>
-      <w:r>
-        <w:t>=(</w:t>
-      </w:r>
-      <w:proofErr w:type="gramEnd"/>
-      <w:r>
-        <w:t>Get-FileHash .\server\build\libs\memgine-server.jar -Algorithm SHA256).Hash; aws s3 cp "s3://memgine-dev-deploy/releases/</w:t>
+        <w:t>$localHash=(Get-FileHash .\server\build\libs\memgine-server.jar -Algorithm SHA256).Hash; aws s3 cp "s3://memgine-dev-deploy/releases/</w:t>
       </w:r>
       <w:r>
         <w:t>20260926-183813-c0d00dc</w:t>
@@ -616,7 +480,6 @@
         </w:numPr>
       </w:pPr>
       <w:r>
-        <w:lastRenderedPageBreak/>
         <w:t>Front end build and deploy</w:t>
       </w:r>
     </w:p>
@@ -814,16 +677,8 @@
           <w:numId w:val="1"/>
         </w:numPr>
       </w:pPr>
-      <w:proofErr w:type="gramStart"/>
-      <w:r>
-        <w:t xml:space="preserve">Back </w:t>
-      </w:r>
-      <w:r>
-        <w:t>end</w:t>
-      </w:r>
-      <w:proofErr w:type="gramEnd"/>
-      <w:r>
-        <w:t xml:space="preserve"> build and deploy</w:t>
+      <w:r>
+        <w:t>Back end build and deploy</w:t>
       </w:r>
     </w:p>
     <w:p>
@@ -935,25 +790,14 @@
           <w:lang w:eastAsia="en-IN"/>
         </w:rPr>
       </w:pPr>
-      <w:proofErr w:type="gramStart"/>
-      <w:r>
-        <w:rPr>
-          <w:rFonts w:ascii="Courier New" w:eastAsia="Times New Roman" w:hAnsi="Courier New" w:cs="Courier New"/>
-          <w:sz w:val="20"/>
-          <w:szCs w:val="20"/>
-          <w:lang w:eastAsia="en-IN"/>
-        </w:rPr>
-        <w:t>.\gradlew.bat :lambda</w:t>
-      </w:r>
-      <w:proofErr w:type="gramEnd"/>
-      <w:r>
-        <w:rPr>
-          <w:rFonts w:ascii="Courier New" w:eastAsia="Times New Roman" w:hAnsi="Courier New" w:cs="Courier New"/>
-          <w:sz w:val="20"/>
-          <w:szCs w:val="20"/>
-          <w:lang w:eastAsia="en-IN"/>
-        </w:rPr>
-        <w:t>:sms-processor:jar</w:t>
+      <w:r>
+        <w:rPr>
+          <w:rFonts w:ascii="Courier New" w:eastAsia="Times New Roman" w:hAnsi="Courier New" w:cs="Courier New"/>
+          <w:sz w:val="20"/>
+          <w:szCs w:val="20"/>
+          <w:lang w:eastAsia="en-IN"/>
+        </w:rPr>
+        <w:t>.\gradlew.bat :lambda:sms-processor:jar</w:t>
       </w:r>
     </w:p>
     <w:p>
@@ -995,7 +839,6 @@
         </w:rPr>
         <w:t xml:space="preserve">.\infra\scripts\deploy.ps1 dev </w:t>
       </w:r>
-      <w:proofErr w:type="gramStart"/>
       <w:r>
         <w:rPr>
           <w:rFonts w:ascii="Courier New" w:eastAsia="Times New Roman" w:hAnsi="Courier New" w:cs="Courier New"/>
@@ -1005,7 +848,6 @@
         </w:rPr>
         <w:t>apply</w:t>
       </w:r>
-      <w:proofErr w:type="gramEnd"/>
     </w:p>
     <w:p>
       <w:pPr>
@@ -1109,6 +951,1549 @@
         </w:rPr>
         <w:t>.\server\scripts\remote-backend.ps1 -Environment dev -Action status</w:t>
       </w:r>
+    </w:p>
+    <w:p>
+      <w:pPr>
+        <w:rPr>
+          <w:rFonts w:ascii="Courier New" w:eastAsia="Times New Roman" w:hAnsi="Courier New" w:cs="Courier New"/>
+          <w:sz w:val="20"/>
+          <w:szCs w:val="20"/>
+          <w:lang w:eastAsia="en-IN"/>
+        </w:rPr>
+      </w:pPr>
+    </w:p>
+    <w:p>
+      <w:pPr>
+        <w:rPr>
+          <w:rFonts w:ascii="Courier New" w:eastAsia="Times New Roman" w:hAnsi="Courier New" w:cs="Courier New"/>
+          <w:sz w:val="20"/>
+          <w:szCs w:val="20"/>
+          <w:lang w:eastAsia="en-IN"/>
+        </w:rPr>
+      </w:pPr>
+      <w:r>
+        <w:rPr>
+          <w:rFonts w:ascii="Courier New" w:eastAsia="Times New Roman" w:hAnsi="Courier New" w:cs="Courier New"/>
+          <w:sz w:val="20"/>
+          <w:szCs w:val="20"/>
+          <w:lang w:eastAsia="en-IN"/>
+        </w:rPr>
+        <w:t>Product test data entry in dev sql</w:t>
+      </w:r>
+    </w:p>
+    <w:p>
+      <w:pPr>
+        <w:rPr>
+          <w:rFonts w:ascii="Courier New" w:eastAsia="Times New Roman" w:hAnsi="Courier New" w:cs="Courier New"/>
+          <w:sz w:val="20"/>
+          <w:szCs w:val="20"/>
+          <w:lang w:eastAsia="en-IN"/>
+        </w:rPr>
+      </w:pPr>
+    </w:p>
+    <w:p>
+      <w:pPr>
+        <w:rPr>
+          <w:rFonts w:ascii="Courier New" w:eastAsia="Times New Roman" w:hAnsi="Courier New" w:cs="Courier New"/>
+          <w:sz w:val="20"/>
+          <w:szCs w:val="20"/>
+          <w:lang w:eastAsia="en-IN"/>
+        </w:rPr>
+      </w:pPr>
+      <w:r>
+        <w:rPr>
+          <w:rFonts w:ascii="Courier New" w:eastAsia="Times New Roman" w:hAnsi="Courier New" w:cs="Courier New"/>
+          <w:sz w:val="20"/>
+          <w:szCs w:val="20"/>
+          <w:lang w:eastAsia="en-IN"/>
+        </w:rPr>
+        <w:t>-- DEV TEST DATA ONLY</w:t>
+      </w:r>
+    </w:p>
+    <w:p>
+      <w:pPr>
+        <w:rPr>
+          <w:rFonts w:ascii="Courier New" w:eastAsia="Times New Roman" w:hAnsi="Courier New" w:cs="Courier New"/>
+          <w:sz w:val="20"/>
+          <w:szCs w:val="20"/>
+          <w:lang w:eastAsia="en-IN"/>
+        </w:rPr>
+      </w:pPr>
+      <w:r>
+        <w:rPr>
+          <w:rFonts w:ascii="Courier New" w:eastAsia="Times New Roman" w:hAnsi="Courier New" w:cs="Courier New"/>
+          <w:sz w:val="20"/>
+          <w:szCs w:val="20"/>
+          <w:lang w:eastAsia="en-IN"/>
+        </w:rPr>
+        <w:t>-- Sample menu products for:</w:t>
+      </w:r>
+    </w:p>
+    <w:p>
+      <w:pPr>
+        <w:rPr>
+          <w:rFonts w:ascii="Courier New" w:eastAsia="Times New Roman" w:hAnsi="Courier New" w:cs="Courier New"/>
+          <w:sz w:val="20"/>
+          <w:szCs w:val="20"/>
+          <w:lang w:eastAsia="en-IN"/>
+        </w:rPr>
+      </w:pPr>
+      <w:r>
+        <w:rPr>
+          <w:rFonts w:ascii="Courier New" w:eastAsia="Times New Roman" w:hAnsi="Courier New" w:cs="Courier New"/>
+          <w:sz w:val="20"/>
+          <w:szCs w:val="20"/>
+          <w:lang w:eastAsia="en-IN"/>
+        </w:rPr>
+        <w:t>-- ORG_ece1b2f6-0e01-4d1b-ac11-3528e136cc1b</w:t>
+      </w:r>
+    </w:p>
+    <w:p>
+      <w:pPr>
+        <w:rPr>
+          <w:rFonts w:ascii="Courier New" w:eastAsia="Times New Roman" w:hAnsi="Courier New" w:cs="Courier New"/>
+          <w:sz w:val="20"/>
+          <w:szCs w:val="20"/>
+          <w:lang w:eastAsia="en-IN"/>
+        </w:rPr>
+      </w:pPr>
+      <w:r>
+        <w:rPr>
+          <w:rFonts w:ascii="Courier New" w:eastAsia="Times New Roman" w:hAnsi="Courier New" w:cs="Courier New"/>
+          <w:sz w:val="20"/>
+          <w:szCs w:val="20"/>
+          <w:lang w:eastAsia="en-IN"/>
+        </w:rPr>
+        <w:t>--</w:t>
+      </w:r>
+    </w:p>
+    <w:p>
+      <w:pPr>
+        <w:rPr>
+          <w:rFonts w:ascii="Courier New" w:eastAsia="Times New Roman" w:hAnsi="Courier New" w:cs="Courier New"/>
+          <w:sz w:val="20"/>
+          <w:szCs w:val="20"/>
+          <w:lang w:eastAsia="en-IN"/>
+        </w:rPr>
+      </w:pPr>
+      <w:r>
+        <w:rPr>
+          <w:rFonts w:ascii="Courier New" w:eastAsia="Times New Roman" w:hAnsi="Courier New" w:cs="Courier New"/>
+          <w:sz w:val="20"/>
+          <w:szCs w:val="20"/>
+          <w:lang w:eastAsia="en-IN"/>
+        </w:rPr>
+        <w:t>-- Safe to rerun. Existing rows with the same product_id are updated.</w:t>
+      </w:r>
+    </w:p>
+    <w:p>
+      <w:pPr>
+        <w:rPr>
+          <w:rFonts w:ascii="Courier New" w:eastAsia="Times New Roman" w:hAnsi="Courier New" w:cs="Courier New"/>
+          <w:sz w:val="20"/>
+          <w:szCs w:val="20"/>
+          <w:lang w:eastAsia="en-IN"/>
+        </w:rPr>
+      </w:pPr>
+    </w:p>
+    <w:p>
+      <w:pPr>
+        <w:rPr>
+          <w:rFonts w:ascii="Courier New" w:eastAsia="Times New Roman" w:hAnsi="Courier New" w:cs="Courier New"/>
+          <w:sz w:val="20"/>
+          <w:szCs w:val="20"/>
+          <w:lang w:eastAsia="en-IN"/>
+        </w:rPr>
+      </w:pPr>
+      <w:r>
+        <w:rPr>
+          <w:rFonts w:ascii="Courier New" w:eastAsia="Times New Roman" w:hAnsi="Courier New" w:cs="Courier New"/>
+          <w:sz w:val="20"/>
+          <w:szCs w:val="20"/>
+          <w:lang w:eastAsia="en-IN"/>
+        </w:rPr>
+        <w:t>INSERT INTO memginedev.product (</w:t>
+      </w:r>
+    </w:p>
+    <w:p>
+      <w:pPr>
+        <w:rPr>
+          <w:rFonts w:ascii="Courier New" w:eastAsia="Times New Roman" w:hAnsi="Courier New" w:cs="Courier New"/>
+          <w:sz w:val="20"/>
+          <w:szCs w:val="20"/>
+          <w:lang w:eastAsia="en-IN"/>
+        </w:rPr>
+      </w:pPr>
+      <w:r>
+        <w:rPr>
+          <w:rFonts w:ascii="Courier New" w:eastAsia="Times New Roman" w:hAnsi="Courier New" w:cs="Courier New"/>
+          <w:sz w:val="20"/>
+          <w:szCs w:val="20"/>
+          <w:lang w:eastAsia="en-IN"/>
+        </w:rPr>
+        <w:t xml:space="preserve">    product_id,</w:t>
+      </w:r>
+    </w:p>
+    <w:p>
+      <w:pPr>
+        <w:rPr>
+          <w:rFonts w:ascii="Courier New" w:eastAsia="Times New Roman" w:hAnsi="Courier New" w:cs="Courier New"/>
+          <w:sz w:val="20"/>
+          <w:szCs w:val="20"/>
+          <w:lang w:eastAsia="en-IN"/>
+        </w:rPr>
+      </w:pPr>
+      <w:r>
+        <w:rPr>
+          <w:rFonts w:ascii="Courier New" w:eastAsia="Times New Roman" w:hAnsi="Courier New" w:cs="Courier New"/>
+          <w:sz w:val="20"/>
+          <w:szCs w:val="20"/>
+          <w:lang w:eastAsia="en-IN"/>
+        </w:rPr>
+        <w:t xml:space="preserve">    organization_id,</w:t>
+      </w:r>
+    </w:p>
+    <w:p>
+      <w:pPr>
+        <w:rPr>
+          <w:rFonts w:ascii="Courier New" w:eastAsia="Times New Roman" w:hAnsi="Courier New" w:cs="Courier New"/>
+          <w:sz w:val="20"/>
+          <w:szCs w:val="20"/>
+          <w:lang w:eastAsia="en-IN"/>
+        </w:rPr>
+      </w:pPr>
+      <w:r>
+        <w:rPr>
+          <w:rFonts w:ascii="Courier New" w:eastAsia="Times New Roman" w:hAnsi="Courier New" w:cs="Courier New"/>
+          <w:sz w:val="20"/>
+          <w:szCs w:val="20"/>
+          <w:lang w:eastAsia="en-IN"/>
+        </w:rPr>
+        <w:t xml:space="preserve">    product_code,</w:t>
+      </w:r>
+    </w:p>
+    <w:p>
+      <w:pPr>
+        <w:rPr>
+          <w:rFonts w:ascii="Courier New" w:eastAsia="Times New Roman" w:hAnsi="Courier New" w:cs="Courier New"/>
+          <w:sz w:val="20"/>
+          <w:szCs w:val="20"/>
+          <w:lang w:eastAsia="en-IN"/>
+        </w:rPr>
+      </w:pPr>
+      <w:r>
+        <w:rPr>
+          <w:rFonts w:ascii="Courier New" w:eastAsia="Times New Roman" w:hAnsi="Courier New" w:cs="Courier New"/>
+          <w:sz w:val="20"/>
+          <w:szCs w:val="20"/>
+          <w:lang w:eastAsia="en-IN"/>
+        </w:rPr>
+        <w:t xml:space="preserve">    product_name,</w:t>
+      </w:r>
+    </w:p>
+    <w:p>
+      <w:pPr>
+        <w:rPr>
+          <w:rFonts w:ascii="Courier New" w:eastAsia="Times New Roman" w:hAnsi="Courier New" w:cs="Courier New"/>
+          <w:sz w:val="20"/>
+          <w:szCs w:val="20"/>
+          <w:lang w:eastAsia="en-IN"/>
+        </w:rPr>
+      </w:pPr>
+      <w:r>
+        <w:rPr>
+          <w:rFonts w:ascii="Courier New" w:eastAsia="Times New Roman" w:hAnsi="Courier New" w:cs="Courier New"/>
+          <w:sz w:val="20"/>
+          <w:szCs w:val="20"/>
+          <w:lang w:eastAsia="en-IN"/>
+        </w:rPr>
+        <w:t xml:space="preserve">    description,</w:t>
+      </w:r>
+    </w:p>
+    <w:p>
+      <w:pPr>
+        <w:rPr>
+          <w:rFonts w:ascii="Courier New" w:eastAsia="Times New Roman" w:hAnsi="Courier New" w:cs="Courier New"/>
+          <w:sz w:val="20"/>
+          <w:szCs w:val="20"/>
+          <w:lang w:eastAsia="en-IN"/>
+        </w:rPr>
+      </w:pPr>
+      <w:r>
+        <w:rPr>
+          <w:rFonts w:ascii="Courier New" w:eastAsia="Times New Roman" w:hAnsi="Courier New" w:cs="Courier New"/>
+          <w:sz w:val="20"/>
+          <w:szCs w:val="20"/>
+          <w:lang w:eastAsia="en-IN"/>
+        </w:rPr>
+        <w:lastRenderedPageBreak/>
+        <w:t xml:space="preserve">    status_id,</w:t>
+      </w:r>
+    </w:p>
+    <w:p>
+      <w:pPr>
+        <w:rPr>
+          <w:rFonts w:ascii="Courier New" w:eastAsia="Times New Roman" w:hAnsi="Courier New" w:cs="Courier New"/>
+          <w:sz w:val="20"/>
+          <w:szCs w:val="20"/>
+          <w:lang w:eastAsia="en-IN"/>
+        </w:rPr>
+      </w:pPr>
+      <w:r>
+        <w:rPr>
+          <w:rFonts w:ascii="Courier New" w:eastAsia="Times New Roman" w:hAnsi="Courier New" w:cs="Courier New"/>
+          <w:sz w:val="20"/>
+          <w:szCs w:val="20"/>
+          <w:lang w:eastAsia="en-IN"/>
+        </w:rPr>
+        <w:t xml:space="preserve">    created_at,</w:t>
+      </w:r>
+    </w:p>
+    <w:p>
+      <w:pPr>
+        <w:rPr>
+          <w:rFonts w:ascii="Courier New" w:eastAsia="Times New Roman" w:hAnsi="Courier New" w:cs="Courier New"/>
+          <w:sz w:val="20"/>
+          <w:szCs w:val="20"/>
+          <w:lang w:eastAsia="en-IN"/>
+        </w:rPr>
+      </w:pPr>
+      <w:r>
+        <w:rPr>
+          <w:rFonts w:ascii="Courier New" w:eastAsia="Times New Roman" w:hAnsi="Courier New" w:cs="Courier New"/>
+          <w:sz w:val="20"/>
+          <w:szCs w:val="20"/>
+          <w:lang w:eastAsia="en-IN"/>
+        </w:rPr>
+        <w:t xml:space="preserve">    created_by,</w:t>
+      </w:r>
+    </w:p>
+    <w:p>
+      <w:pPr>
+        <w:rPr>
+          <w:rFonts w:ascii="Courier New" w:eastAsia="Times New Roman" w:hAnsi="Courier New" w:cs="Courier New"/>
+          <w:sz w:val="20"/>
+          <w:szCs w:val="20"/>
+          <w:lang w:eastAsia="en-IN"/>
+        </w:rPr>
+      </w:pPr>
+      <w:r>
+        <w:rPr>
+          <w:rFonts w:ascii="Courier New" w:eastAsia="Times New Roman" w:hAnsi="Courier New" w:cs="Courier New"/>
+          <w:sz w:val="20"/>
+          <w:szCs w:val="20"/>
+          <w:lang w:eastAsia="en-IN"/>
+        </w:rPr>
+        <w:t xml:space="preserve">    updated_at,</w:t>
+      </w:r>
+    </w:p>
+    <w:p>
+      <w:pPr>
+        <w:rPr>
+          <w:rFonts w:ascii="Courier New" w:eastAsia="Times New Roman" w:hAnsi="Courier New" w:cs="Courier New"/>
+          <w:sz w:val="20"/>
+          <w:szCs w:val="20"/>
+          <w:lang w:eastAsia="en-IN"/>
+        </w:rPr>
+      </w:pPr>
+      <w:r>
+        <w:rPr>
+          <w:rFonts w:ascii="Courier New" w:eastAsia="Times New Roman" w:hAnsi="Courier New" w:cs="Courier New"/>
+          <w:sz w:val="20"/>
+          <w:szCs w:val="20"/>
+          <w:lang w:eastAsia="en-IN"/>
+        </w:rPr>
+        <w:t xml:space="preserve">    updated_by,</w:t>
+      </w:r>
+    </w:p>
+    <w:p>
+      <w:pPr>
+        <w:rPr>
+          <w:rFonts w:ascii="Courier New" w:eastAsia="Times New Roman" w:hAnsi="Courier New" w:cs="Courier New"/>
+          <w:sz w:val="20"/>
+          <w:szCs w:val="20"/>
+          <w:lang w:eastAsia="en-IN"/>
+        </w:rPr>
+      </w:pPr>
+      <w:r>
+        <w:rPr>
+          <w:rFonts w:ascii="Courier New" w:eastAsia="Times New Roman" w:hAnsi="Courier New" w:cs="Courier New"/>
+          <w:sz w:val="20"/>
+          <w:szCs w:val="20"/>
+          <w:lang w:eastAsia="en-IN"/>
+        </w:rPr>
+        <w:t xml:space="preserve">    is_deleted,</w:t>
+      </w:r>
+    </w:p>
+    <w:p>
+      <w:pPr>
+        <w:rPr>
+          <w:rFonts w:ascii="Courier New" w:eastAsia="Times New Roman" w:hAnsi="Courier New" w:cs="Courier New"/>
+          <w:sz w:val="20"/>
+          <w:szCs w:val="20"/>
+          <w:lang w:eastAsia="en-IN"/>
+        </w:rPr>
+      </w:pPr>
+      <w:r>
+        <w:rPr>
+          <w:rFonts w:ascii="Courier New" w:eastAsia="Times New Roman" w:hAnsi="Courier New" w:cs="Courier New"/>
+          <w:sz w:val="20"/>
+          <w:szCs w:val="20"/>
+          <w:lang w:eastAsia="en-IN"/>
+        </w:rPr>
+        <w:t xml:space="preserve">    version_no</w:t>
+      </w:r>
+    </w:p>
+    <w:p>
+      <w:pPr>
+        <w:rPr>
+          <w:rFonts w:ascii="Courier New" w:eastAsia="Times New Roman" w:hAnsi="Courier New" w:cs="Courier New"/>
+          <w:sz w:val="20"/>
+          <w:szCs w:val="20"/>
+          <w:lang w:eastAsia="en-IN"/>
+        </w:rPr>
+      </w:pPr>
+      <w:r>
+        <w:rPr>
+          <w:rFonts w:ascii="Courier New" w:eastAsia="Times New Roman" w:hAnsi="Courier New" w:cs="Courier New"/>
+          <w:sz w:val="20"/>
+          <w:szCs w:val="20"/>
+          <w:lang w:eastAsia="en-IN"/>
+        </w:rPr>
+        <w:t>)</w:t>
+      </w:r>
+    </w:p>
+    <w:p>
+      <w:pPr>
+        <w:rPr>
+          <w:rFonts w:ascii="Courier New" w:eastAsia="Times New Roman" w:hAnsi="Courier New" w:cs="Courier New"/>
+          <w:sz w:val="20"/>
+          <w:szCs w:val="20"/>
+          <w:lang w:eastAsia="en-IN"/>
+        </w:rPr>
+      </w:pPr>
+      <w:r>
+        <w:rPr>
+          <w:rFonts w:ascii="Courier New" w:eastAsia="Times New Roman" w:hAnsi="Courier New" w:cs="Courier New"/>
+          <w:sz w:val="20"/>
+          <w:szCs w:val="20"/>
+          <w:lang w:eastAsia="en-IN"/>
+        </w:rPr>
+        <w:t>SELECT</w:t>
+      </w:r>
+    </w:p>
+    <w:p>
+      <w:pPr>
+        <w:rPr>
+          <w:rFonts w:ascii="Courier New" w:eastAsia="Times New Roman" w:hAnsi="Courier New" w:cs="Courier New"/>
+          <w:sz w:val="20"/>
+          <w:szCs w:val="20"/>
+          <w:lang w:eastAsia="en-IN"/>
+        </w:rPr>
+      </w:pPr>
+      <w:r>
+        <w:rPr>
+          <w:rFonts w:ascii="Courier New" w:eastAsia="Times New Roman" w:hAnsi="Courier New" w:cs="Courier New"/>
+          <w:sz w:val="20"/>
+          <w:szCs w:val="20"/>
+          <w:lang w:eastAsia="en-IN"/>
+        </w:rPr>
+        <w:t xml:space="preserve">    v.product_id,</w:t>
+      </w:r>
+    </w:p>
+    <w:p>
+      <w:pPr>
+        <w:rPr>
+          <w:rFonts w:ascii="Courier New" w:eastAsia="Times New Roman" w:hAnsi="Courier New" w:cs="Courier New"/>
+          <w:sz w:val="20"/>
+          <w:szCs w:val="20"/>
+          <w:lang w:eastAsia="en-IN"/>
+        </w:rPr>
+      </w:pPr>
+      <w:r>
+        <w:rPr>
+          <w:rFonts w:ascii="Courier New" w:eastAsia="Times New Roman" w:hAnsi="Courier New" w:cs="Courier New"/>
+          <w:sz w:val="20"/>
+          <w:szCs w:val="20"/>
+          <w:lang w:eastAsia="en-IN"/>
+        </w:rPr>
+        <w:t xml:space="preserve">    'ORG_ece1b2f6-0e01-4d1b-ac11-3528e136cc1b',</w:t>
+      </w:r>
+    </w:p>
+    <w:p>
+      <w:pPr>
+        <w:rPr>
+          <w:rFonts w:ascii="Courier New" w:eastAsia="Times New Roman" w:hAnsi="Courier New" w:cs="Courier New"/>
+          <w:sz w:val="20"/>
+          <w:szCs w:val="20"/>
+          <w:lang w:eastAsia="en-IN"/>
+        </w:rPr>
+      </w:pPr>
+      <w:r>
+        <w:rPr>
+          <w:rFonts w:ascii="Courier New" w:eastAsia="Times New Roman" w:hAnsi="Courier New" w:cs="Courier New"/>
+          <w:sz w:val="20"/>
+          <w:szCs w:val="20"/>
+          <w:lang w:eastAsia="en-IN"/>
+        </w:rPr>
+        <w:t xml:space="preserve">    v.product_code,</w:t>
+      </w:r>
+    </w:p>
+    <w:p>
+      <w:pPr>
+        <w:rPr>
+          <w:rFonts w:ascii="Courier New" w:eastAsia="Times New Roman" w:hAnsi="Courier New" w:cs="Courier New"/>
+          <w:sz w:val="20"/>
+          <w:szCs w:val="20"/>
+          <w:lang w:eastAsia="en-IN"/>
+        </w:rPr>
+      </w:pPr>
+      <w:r>
+        <w:rPr>
+          <w:rFonts w:ascii="Courier New" w:eastAsia="Times New Roman" w:hAnsi="Courier New" w:cs="Courier New"/>
+          <w:sz w:val="20"/>
+          <w:szCs w:val="20"/>
+          <w:lang w:eastAsia="en-IN"/>
+        </w:rPr>
+        <w:t xml:space="preserve">    v.product_name,</w:t>
+      </w:r>
+    </w:p>
+    <w:p>
+      <w:pPr>
+        <w:rPr>
+          <w:rFonts w:ascii="Courier New" w:eastAsia="Times New Roman" w:hAnsi="Courier New" w:cs="Courier New"/>
+          <w:sz w:val="20"/>
+          <w:szCs w:val="20"/>
+          <w:lang w:eastAsia="en-IN"/>
+        </w:rPr>
+      </w:pPr>
+      <w:r>
+        <w:rPr>
+          <w:rFonts w:ascii="Courier New" w:eastAsia="Times New Roman" w:hAnsi="Courier New" w:cs="Courier New"/>
+          <w:sz w:val="20"/>
+          <w:szCs w:val="20"/>
+          <w:lang w:eastAsia="en-IN"/>
+        </w:rPr>
+        <w:t xml:space="preserve">    v.description,</w:t>
+      </w:r>
+    </w:p>
+    <w:p>
+      <w:pPr>
+        <w:rPr>
+          <w:rFonts w:ascii="Courier New" w:eastAsia="Times New Roman" w:hAnsi="Courier New" w:cs="Courier New"/>
+          <w:sz w:val="20"/>
+          <w:szCs w:val="20"/>
+          <w:lang w:eastAsia="en-IN"/>
+        </w:rPr>
+      </w:pPr>
+      <w:r>
+        <w:rPr>
+          <w:rFonts w:ascii="Courier New" w:eastAsia="Times New Roman" w:hAnsi="Courier New" w:cs="Courier New"/>
+          <w:sz w:val="20"/>
+          <w:szCs w:val="20"/>
+          <w:lang w:eastAsia="en-IN"/>
+        </w:rPr>
+        <w:t xml:space="preserve">    'entity-status-product-active',</w:t>
+      </w:r>
+    </w:p>
+    <w:p>
+      <w:pPr>
+        <w:rPr>
+          <w:rFonts w:ascii="Courier New" w:eastAsia="Times New Roman" w:hAnsi="Courier New" w:cs="Courier New"/>
+          <w:sz w:val="20"/>
+          <w:szCs w:val="20"/>
+          <w:lang w:eastAsia="en-IN"/>
+        </w:rPr>
+      </w:pPr>
+      <w:r>
+        <w:rPr>
+          <w:rFonts w:ascii="Courier New" w:eastAsia="Times New Roman" w:hAnsi="Courier New" w:cs="Courier New"/>
+          <w:sz w:val="20"/>
+          <w:szCs w:val="20"/>
+          <w:lang w:eastAsia="en-IN"/>
+        </w:rPr>
+        <w:t xml:space="preserve">    CURRENT_TIMESTAMP,</w:t>
+      </w:r>
+    </w:p>
+    <w:p>
+      <w:pPr>
+        <w:rPr>
+          <w:rFonts w:ascii="Courier New" w:eastAsia="Times New Roman" w:hAnsi="Courier New" w:cs="Courier New"/>
+          <w:sz w:val="20"/>
+          <w:szCs w:val="20"/>
+          <w:lang w:eastAsia="en-IN"/>
+        </w:rPr>
+      </w:pPr>
+      <w:r>
+        <w:rPr>
+          <w:rFonts w:ascii="Courier New" w:eastAsia="Times New Roman" w:hAnsi="Courier New" w:cs="Courier New"/>
+          <w:sz w:val="20"/>
+          <w:szCs w:val="20"/>
+          <w:lang w:eastAsia="en-IN"/>
+        </w:rPr>
+        <w:t xml:space="preserve">    o.updated_by,</w:t>
+      </w:r>
+    </w:p>
+    <w:p>
+      <w:pPr>
+        <w:rPr>
+          <w:rFonts w:ascii="Courier New" w:eastAsia="Times New Roman" w:hAnsi="Courier New" w:cs="Courier New"/>
+          <w:sz w:val="20"/>
+          <w:szCs w:val="20"/>
+          <w:lang w:eastAsia="en-IN"/>
+        </w:rPr>
+      </w:pPr>
+      <w:r>
+        <w:rPr>
+          <w:rFonts w:ascii="Courier New" w:eastAsia="Times New Roman" w:hAnsi="Courier New" w:cs="Courier New"/>
+          <w:sz w:val="20"/>
+          <w:szCs w:val="20"/>
+          <w:lang w:eastAsia="en-IN"/>
+        </w:rPr>
+        <w:t xml:space="preserve">    CURRENT_TIMESTAMP,</w:t>
+      </w:r>
+    </w:p>
+    <w:p>
+      <w:pPr>
+        <w:rPr>
+          <w:rFonts w:ascii="Courier New" w:eastAsia="Times New Roman" w:hAnsi="Courier New" w:cs="Courier New"/>
+          <w:sz w:val="20"/>
+          <w:szCs w:val="20"/>
+          <w:lang w:eastAsia="en-IN"/>
+        </w:rPr>
+      </w:pPr>
+      <w:r>
+        <w:rPr>
+          <w:rFonts w:ascii="Courier New" w:eastAsia="Times New Roman" w:hAnsi="Courier New" w:cs="Courier New"/>
+          <w:sz w:val="20"/>
+          <w:szCs w:val="20"/>
+          <w:lang w:eastAsia="en-IN"/>
+        </w:rPr>
+        <w:t xml:space="preserve">    o.updated_by,</w:t>
+      </w:r>
+    </w:p>
+    <w:p>
+      <w:pPr>
+        <w:rPr>
+          <w:rFonts w:ascii="Courier New" w:eastAsia="Times New Roman" w:hAnsi="Courier New" w:cs="Courier New"/>
+          <w:sz w:val="20"/>
+          <w:szCs w:val="20"/>
+          <w:lang w:eastAsia="en-IN"/>
+        </w:rPr>
+      </w:pPr>
+      <w:r>
+        <w:rPr>
+          <w:rFonts w:ascii="Courier New" w:eastAsia="Times New Roman" w:hAnsi="Courier New" w:cs="Courier New"/>
+          <w:sz w:val="20"/>
+          <w:szCs w:val="20"/>
+          <w:lang w:eastAsia="en-IN"/>
+        </w:rPr>
+        <w:t xml:space="preserve">    FALSE,</w:t>
+      </w:r>
+    </w:p>
+    <w:p>
+      <w:pPr>
+        <w:rPr>
+          <w:rFonts w:ascii="Courier New" w:eastAsia="Times New Roman" w:hAnsi="Courier New" w:cs="Courier New"/>
+          <w:sz w:val="20"/>
+          <w:szCs w:val="20"/>
+          <w:lang w:eastAsia="en-IN"/>
+        </w:rPr>
+      </w:pPr>
+      <w:r>
+        <w:rPr>
+          <w:rFonts w:ascii="Courier New" w:eastAsia="Times New Roman" w:hAnsi="Courier New" w:cs="Courier New"/>
+          <w:sz w:val="20"/>
+          <w:szCs w:val="20"/>
+          <w:lang w:eastAsia="en-IN"/>
+        </w:rPr>
+        <w:t xml:space="preserve">    1</w:t>
+      </w:r>
+    </w:p>
+    <w:p>
+      <w:pPr>
+        <w:rPr>
+          <w:rFonts w:ascii="Courier New" w:eastAsia="Times New Roman" w:hAnsi="Courier New" w:cs="Courier New"/>
+          <w:sz w:val="20"/>
+          <w:szCs w:val="20"/>
+          <w:lang w:eastAsia="en-IN"/>
+        </w:rPr>
+      </w:pPr>
+      <w:r>
+        <w:rPr>
+          <w:rFonts w:ascii="Courier New" w:eastAsia="Times New Roman" w:hAnsi="Courier New" w:cs="Courier New"/>
+          <w:sz w:val="20"/>
+          <w:szCs w:val="20"/>
+          <w:lang w:eastAsia="en-IN"/>
+        </w:rPr>
+        <w:t>FROM (</w:t>
+      </w:r>
+    </w:p>
+    <w:p>
+      <w:pPr>
+        <w:rPr>
+          <w:rFonts w:ascii="Courier New" w:eastAsia="Times New Roman" w:hAnsi="Courier New" w:cs="Courier New"/>
+          <w:sz w:val="20"/>
+          <w:szCs w:val="20"/>
+          <w:lang w:eastAsia="en-IN"/>
+        </w:rPr>
+      </w:pPr>
+      <w:r>
+        <w:rPr>
+          <w:rFonts w:ascii="Courier New" w:eastAsia="Times New Roman" w:hAnsi="Courier New" w:cs="Courier New"/>
+          <w:sz w:val="20"/>
+          <w:szCs w:val="20"/>
+          <w:lang w:eastAsia="en-IN"/>
+        </w:rPr>
+        <w:t xml:space="preserve">    VALUES</w:t>
+      </w:r>
+    </w:p>
+    <w:p>
+      <w:pPr>
+        <w:rPr>
+          <w:rFonts w:ascii="Courier New" w:eastAsia="Times New Roman" w:hAnsi="Courier New" w:cs="Courier New"/>
+          <w:sz w:val="20"/>
+          <w:szCs w:val="20"/>
+          <w:lang w:eastAsia="en-IN"/>
+        </w:rPr>
+      </w:pPr>
+      <w:r>
+        <w:rPr>
+          <w:rFonts w:ascii="Courier New" w:eastAsia="Times New Roman" w:hAnsi="Courier New" w:cs="Courier New"/>
+          <w:sz w:val="20"/>
+          <w:szCs w:val="20"/>
+          <w:lang w:eastAsia="en-IN"/>
+        </w:rPr>
+        <w:t xml:space="preserve">        (</w:t>
+      </w:r>
+    </w:p>
+    <w:p>
+      <w:pPr>
+        <w:rPr>
+          <w:rFonts w:ascii="Courier New" w:eastAsia="Times New Roman" w:hAnsi="Courier New" w:cs="Courier New"/>
+          <w:sz w:val="20"/>
+          <w:szCs w:val="20"/>
+          <w:lang w:eastAsia="en-IN"/>
+        </w:rPr>
+      </w:pPr>
+      <w:r>
+        <w:rPr>
+          <w:rFonts w:ascii="Courier New" w:eastAsia="Times New Roman" w:hAnsi="Courier New" w:cs="Courier New"/>
+          <w:sz w:val="20"/>
+          <w:szCs w:val="20"/>
+          <w:lang w:eastAsia="en-IN"/>
+        </w:rPr>
+        <w:t xml:space="preserve">            'prod-ece1-filter-coffee',</w:t>
+      </w:r>
+    </w:p>
+    <w:p>
+      <w:pPr>
+        <w:rPr>
+          <w:rFonts w:ascii="Courier New" w:eastAsia="Times New Roman" w:hAnsi="Courier New" w:cs="Courier New"/>
+          <w:sz w:val="20"/>
+          <w:szCs w:val="20"/>
+          <w:lang w:eastAsia="en-IN"/>
+        </w:rPr>
+      </w:pPr>
+      <w:r>
+        <w:rPr>
+          <w:rFonts w:ascii="Courier New" w:eastAsia="Times New Roman" w:hAnsi="Courier New" w:cs="Courier New"/>
+          <w:sz w:val="20"/>
+          <w:szCs w:val="20"/>
+          <w:lang w:eastAsia="en-IN"/>
+        </w:rPr>
+        <w:t xml:space="preserve">            'ECE1-FILTER-COFFEE',</w:t>
+      </w:r>
+    </w:p>
+    <w:p>
+      <w:pPr>
+        <w:rPr>
+          <w:rFonts w:ascii="Courier New" w:eastAsia="Times New Roman" w:hAnsi="Courier New" w:cs="Courier New"/>
+          <w:sz w:val="20"/>
+          <w:szCs w:val="20"/>
+          <w:lang w:eastAsia="en-IN"/>
+        </w:rPr>
+      </w:pPr>
+      <w:r>
+        <w:rPr>
+          <w:rFonts w:ascii="Courier New" w:eastAsia="Times New Roman" w:hAnsi="Courier New" w:cs="Courier New"/>
+          <w:sz w:val="20"/>
+          <w:szCs w:val="20"/>
+          <w:lang w:eastAsia="en-IN"/>
+        </w:rPr>
+        <w:t xml:space="preserve">            'Filter Coffee',</w:t>
+      </w:r>
+    </w:p>
+    <w:p>
+      <w:pPr>
+        <w:rPr>
+          <w:rFonts w:ascii="Courier New" w:eastAsia="Times New Roman" w:hAnsi="Courier New" w:cs="Courier New"/>
+          <w:sz w:val="20"/>
+          <w:szCs w:val="20"/>
+          <w:lang w:eastAsia="en-IN"/>
+        </w:rPr>
+      </w:pPr>
+      <w:r>
+        <w:rPr>
+          <w:rFonts w:ascii="Courier New" w:eastAsia="Times New Roman" w:hAnsi="Courier New" w:cs="Courier New"/>
+          <w:sz w:val="20"/>
+          <w:szCs w:val="20"/>
+          <w:lang w:eastAsia="en-IN"/>
+        </w:rPr>
+        <w:t xml:space="preserve">            'Freshly prepared filter coffee.'</w:t>
+      </w:r>
+    </w:p>
+    <w:p>
+      <w:pPr>
+        <w:rPr>
+          <w:rFonts w:ascii="Courier New" w:eastAsia="Times New Roman" w:hAnsi="Courier New" w:cs="Courier New"/>
+          <w:sz w:val="20"/>
+          <w:szCs w:val="20"/>
+          <w:lang w:eastAsia="en-IN"/>
+        </w:rPr>
+      </w:pPr>
+      <w:r>
+        <w:rPr>
+          <w:rFonts w:ascii="Courier New" w:eastAsia="Times New Roman" w:hAnsi="Courier New" w:cs="Courier New"/>
+          <w:sz w:val="20"/>
+          <w:szCs w:val="20"/>
+          <w:lang w:eastAsia="en-IN"/>
+        </w:rPr>
+        <w:t xml:space="preserve">        ),</w:t>
+      </w:r>
+    </w:p>
+    <w:p>
+      <w:pPr>
+        <w:rPr>
+          <w:rFonts w:ascii="Courier New" w:eastAsia="Times New Roman" w:hAnsi="Courier New" w:cs="Courier New"/>
+          <w:sz w:val="20"/>
+          <w:szCs w:val="20"/>
+          <w:lang w:eastAsia="en-IN"/>
+        </w:rPr>
+      </w:pPr>
+      <w:r>
+        <w:rPr>
+          <w:rFonts w:ascii="Courier New" w:eastAsia="Times New Roman" w:hAnsi="Courier New" w:cs="Courier New"/>
+          <w:sz w:val="20"/>
+          <w:szCs w:val="20"/>
+          <w:lang w:eastAsia="en-IN"/>
+        </w:rPr>
+        <w:t xml:space="preserve">        (</w:t>
+      </w:r>
+    </w:p>
+    <w:p>
+      <w:pPr>
+        <w:rPr>
+          <w:rFonts w:ascii="Courier New" w:eastAsia="Times New Roman" w:hAnsi="Courier New" w:cs="Courier New"/>
+          <w:sz w:val="20"/>
+          <w:szCs w:val="20"/>
+          <w:lang w:eastAsia="en-IN"/>
+        </w:rPr>
+      </w:pPr>
+      <w:r>
+        <w:rPr>
+          <w:rFonts w:ascii="Courier New" w:eastAsia="Times New Roman" w:hAnsi="Courier New" w:cs="Courier New"/>
+          <w:sz w:val="20"/>
+          <w:szCs w:val="20"/>
+          <w:lang w:eastAsia="en-IN"/>
+        </w:rPr>
+        <w:t xml:space="preserve">            'prod-ece1-butter-croissant',</w:t>
+      </w:r>
+    </w:p>
+    <w:p>
+      <w:pPr>
+        <w:rPr>
+          <w:rFonts w:ascii="Courier New" w:eastAsia="Times New Roman" w:hAnsi="Courier New" w:cs="Courier New"/>
+          <w:sz w:val="20"/>
+          <w:szCs w:val="20"/>
+          <w:lang w:eastAsia="en-IN"/>
+        </w:rPr>
+      </w:pPr>
+      <w:r>
+        <w:rPr>
+          <w:rFonts w:ascii="Courier New" w:eastAsia="Times New Roman" w:hAnsi="Courier New" w:cs="Courier New"/>
+          <w:sz w:val="20"/>
+          <w:szCs w:val="20"/>
+          <w:lang w:eastAsia="en-IN"/>
+        </w:rPr>
+        <w:t xml:space="preserve">            'ECE1-BUTTER-CROISSANT',</w:t>
+      </w:r>
+    </w:p>
+    <w:p>
+      <w:pPr>
+        <w:rPr>
+          <w:rFonts w:ascii="Courier New" w:eastAsia="Times New Roman" w:hAnsi="Courier New" w:cs="Courier New"/>
+          <w:sz w:val="20"/>
+          <w:szCs w:val="20"/>
+          <w:lang w:eastAsia="en-IN"/>
+        </w:rPr>
+      </w:pPr>
+      <w:r>
+        <w:rPr>
+          <w:rFonts w:ascii="Courier New" w:eastAsia="Times New Roman" w:hAnsi="Courier New" w:cs="Courier New"/>
+          <w:sz w:val="20"/>
+          <w:szCs w:val="20"/>
+          <w:lang w:eastAsia="en-IN"/>
+        </w:rPr>
+        <w:t xml:space="preserve">            'Butter Croissant',</w:t>
+      </w:r>
+    </w:p>
+    <w:p>
+      <w:pPr>
+        <w:rPr>
+          <w:rFonts w:ascii="Courier New" w:eastAsia="Times New Roman" w:hAnsi="Courier New" w:cs="Courier New"/>
+          <w:sz w:val="20"/>
+          <w:szCs w:val="20"/>
+          <w:lang w:eastAsia="en-IN"/>
+        </w:rPr>
+      </w:pPr>
+      <w:r>
+        <w:rPr>
+          <w:rFonts w:ascii="Courier New" w:eastAsia="Times New Roman" w:hAnsi="Courier New" w:cs="Courier New"/>
+          <w:sz w:val="20"/>
+          <w:szCs w:val="20"/>
+          <w:lang w:eastAsia="en-IN"/>
+        </w:rPr>
+        <w:t xml:space="preserve">            'Fresh butter croissant.'</w:t>
+      </w:r>
+    </w:p>
+    <w:p>
+      <w:pPr>
+        <w:rPr>
+          <w:rFonts w:ascii="Courier New" w:eastAsia="Times New Roman" w:hAnsi="Courier New" w:cs="Courier New"/>
+          <w:sz w:val="20"/>
+          <w:szCs w:val="20"/>
+          <w:lang w:eastAsia="en-IN"/>
+        </w:rPr>
+      </w:pPr>
+      <w:r>
+        <w:rPr>
+          <w:rFonts w:ascii="Courier New" w:eastAsia="Times New Roman" w:hAnsi="Courier New" w:cs="Courier New"/>
+          <w:sz w:val="20"/>
+          <w:szCs w:val="20"/>
+          <w:lang w:eastAsia="en-IN"/>
+        </w:rPr>
+        <w:lastRenderedPageBreak/>
+        <w:t xml:space="preserve">        ),</w:t>
+      </w:r>
+    </w:p>
+    <w:p>
+      <w:pPr>
+        <w:rPr>
+          <w:rFonts w:ascii="Courier New" w:eastAsia="Times New Roman" w:hAnsi="Courier New" w:cs="Courier New"/>
+          <w:sz w:val="20"/>
+          <w:szCs w:val="20"/>
+          <w:lang w:eastAsia="en-IN"/>
+        </w:rPr>
+      </w:pPr>
+      <w:r>
+        <w:rPr>
+          <w:rFonts w:ascii="Courier New" w:eastAsia="Times New Roman" w:hAnsi="Courier New" w:cs="Courier New"/>
+          <w:sz w:val="20"/>
+          <w:szCs w:val="20"/>
+          <w:lang w:eastAsia="en-IN"/>
+        </w:rPr>
+        <w:t xml:space="preserve">        (</w:t>
+      </w:r>
+    </w:p>
+    <w:p>
+      <w:pPr>
+        <w:rPr>
+          <w:rFonts w:ascii="Courier New" w:eastAsia="Times New Roman" w:hAnsi="Courier New" w:cs="Courier New"/>
+          <w:sz w:val="20"/>
+          <w:szCs w:val="20"/>
+          <w:lang w:eastAsia="en-IN"/>
+        </w:rPr>
+      </w:pPr>
+      <w:r>
+        <w:rPr>
+          <w:rFonts w:ascii="Courier New" w:eastAsia="Times New Roman" w:hAnsi="Courier New" w:cs="Courier New"/>
+          <w:sz w:val="20"/>
+          <w:szCs w:val="20"/>
+          <w:lang w:eastAsia="en-IN"/>
+        </w:rPr>
+        <w:t xml:space="preserve">            'prod-ece1-choc-cookie',</w:t>
+      </w:r>
+    </w:p>
+    <w:p>
+      <w:pPr>
+        <w:rPr>
+          <w:rFonts w:ascii="Courier New" w:eastAsia="Times New Roman" w:hAnsi="Courier New" w:cs="Courier New"/>
+          <w:sz w:val="20"/>
+          <w:szCs w:val="20"/>
+          <w:lang w:eastAsia="en-IN"/>
+        </w:rPr>
+      </w:pPr>
+      <w:r>
+        <w:rPr>
+          <w:rFonts w:ascii="Courier New" w:eastAsia="Times New Roman" w:hAnsi="Courier New" w:cs="Courier New"/>
+          <w:sz w:val="20"/>
+          <w:szCs w:val="20"/>
+          <w:lang w:eastAsia="en-IN"/>
+        </w:rPr>
+        <w:t xml:space="preserve">            'ECE1-CHOC-COOKIE',</w:t>
+      </w:r>
+    </w:p>
+    <w:p>
+      <w:pPr>
+        <w:rPr>
+          <w:rFonts w:ascii="Courier New" w:eastAsia="Times New Roman" w:hAnsi="Courier New" w:cs="Courier New"/>
+          <w:sz w:val="20"/>
+          <w:szCs w:val="20"/>
+          <w:lang w:eastAsia="en-IN"/>
+        </w:rPr>
+      </w:pPr>
+      <w:r>
+        <w:rPr>
+          <w:rFonts w:ascii="Courier New" w:eastAsia="Times New Roman" w:hAnsi="Courier New" w:cs="Courier New"/>
+          <w:sz w:val="20"/>
+          <w:szCs w:val="20"/>
+          <w:lang w:eastAsia="en-IN"/>
+        </w:rPr>
+        <w:t xml:space="preserve">            'Chocolate Cookie',</w:t>
+      </w:r>
+    </w:p>
+    <w:p>
+      <w:pPr>
+        <w:rPr>
+          <w:rFonts w:ascii="Courier New" w:eastAsia="Times New Roman" w:hAnsi="Courier New" w:cs="Courier New"/>
+          <w:sz w:val="20"/>
+          <w:szCs w:val="20"/>
+          <w:lang w:eastAsia="en-IN"/>
+        </w:rPr>
+      </w:pPr>
+      <w:r>
+        <w:rPr>
+          <w:rFonts w:ascii="Courier New" w:eastAsia="Times New Roman" w:hAnsi="Courier New" w:cs="Courier New"/>
+          <w:sz w:val="20"/>
+          <w:szCs w:val="20"/>
+          <w:lang w:eastAsia="en-IN"/>
+        </w:rPr>
+        <w:t xml:space="preserve">            'Chocolate cookie.'</w:t>
+      </w:r>
+    </w:p>
+    <w:p>
+      <w:pPr>
+        <w:rPr>
+          <w:rFonts w:ascii="Courier New" w:eastAsia="Times New Roman" w:hAnsi="Courier New" w:cs="Courier New"/>
+          <w:sz w:val="20"/>
+          <w:szCs w:val="20"/>
+          <w:lang w:eastAsia="en-IN"/>
+        </w:rPr>
+      </w:pPr>
+      <w:r>
+        <w:rPr>
+          <w:rFonts w:ascii="Courier New" w:eastAsia="Times New Roman" w:hAnsi="Courier New" w:cs="Courier New"/>
+          <w:sz w:val="20"/>
+          <w:szCs w:val="20"/>
+          <w:lang w:eastAsia="en-IN"/>
+        </w:rPr>
+        <w:t xml:space="preserve">        ),</w:t>
+      </w:r>
+    </w:p>
+    <w:p>
+      <w:pPr>
+        <w:rPr>
+          <w:rFonts w:ascii="Courier New" w:eastAsia="Times New Roman" w:hAnsi="Courier New" w:cs="Courier New"/>
+          <w:sz w:val="20"/>
+          <w:szCs w:val="20"/>
+          <w:lang w:eastAsia="en-IN"/>
+        </w:rPr>
+      </w:pPr>
+      <w:r>
+        <w:rPr>
+          <w:rFonts w:ascii="Courier New" w:eastAsia="Times New Roman" w:hAnsi="Courier New" w:cs="Courier New"/>
+          <w:sz w:val="20"/>
+          <w:szCs w:val="20"/>
+          <w:lang w:eastAsia="en-IN"/>
+        </w:rPr>
+        <w:t xml:space="preserve">        (</w:t>
+      </w:r>
+    </w:p>
+    <w:p>
+      <w:pPr>
+        <w:rPr>
+          <w:rFonts w:ascii="Courier New" w:eastAsia="Times New Roman" w:hAnsi="Courier New" w:cs="Courier New"/>
+          <w:sz w:val="20"/>
+          <w:szCs w:val="20"/>
+          <w:lang w:eastAsia="en-IN"/>
+        </w:rPr>
+      </w:pPr>
+      <w:r>
+        <w:rPr>
+          <w:rFonts w:ascii="Courier New" w:eastAsia="Times New Roman" w:hAnsi="Courier New" w:cs="Courier New"/>
+          <w:sz w:val="20"/>
+          <w:szCs w:val="20"/>
+          <w:lang w:eastAsia="en-IN"/>
+        </w:rPr>
+        <w:t xml:space="preserve">            'prod-ece1-caffe-latte',</w:t>
+      </w:r>
+    </w:p>
+    <w:p>
+      <w:pPr>
+        <w:rPr>
+          <w:rFonts w:ascii="Courier New" w:eastAsia="Times New Roman" w:hAnsi="Courier New" w:cs="Courier New"/>
+          <w:sz w:val="20"/>
+          <w:szCs w:val="20"/>
+          <w:lang w:eastAsia="en-IN"/>
+        </w:rPr>
+      </w:pPr>
+      <w:r>
+        <w:rPr>
+          <w:rFonts w:ascii="Courier New" w:eastAsia="Times New Roman" w:hAnsi="Courier New" w:cs="Courier New"/>
+          <w:sz w:val="20"/>
+          <w:szCs w:val="20"/>
+          <w:lang w:eastAsia="en-IN"/>
+        </w:rPr>
+        <w:t xml:space="preserve">            'ECE1-CAFFE-LATTE',</w:t>
+      </w:r>
+    </w:p>
+    <w:p>
+      <w:pPr>
+        <w:rPr>
+          <w:rFonts w:ascii="Courier New" w:eastAsia="Times New Roman" w:hAnsi="Courier New" w:cs="Courier New"/>
+          <w:sz w:val="20"/>
+          <w:szCs w:val="20"/>
+          <w:lang w:eastAsia="en-IN"/>
+        </w:rPr>
+      </w:pPr>
+      <w:r>
+        <w:rPr>
+          <w:rFonts w:ascii="Courier New" w:eastAsia="Times New Roman" w:hAnsi="Courier New" w:cs="Courier New"/>
+          <w:sz w:val="20"/>
+          <w:szCs w:val="20"/>
+          <w:lang w:eastAsia="en-IN"/>
+        </w:rPr>
+        <w:t xml:space="preserve">            'Caffe Latte',</w:t>
+      </w:r>
+    </w:p>
+    <w:p>
+      <w:pPr>
+        <w:rPr>
+          <w:rFonts w:ascii="Courier New" w:eastAsia="Times New Roman" w:hAnsi="Courier New" w:cs="Courier New"/>
+          <w:sz w:val="20"/>
+          <w:szCs w:val="20"/>
+          <w:lang w:eastAsia="en-IN"/>
+        </w:rPr>
+      </w:pPr>
+      <w:r>
+        <w:rPr>
+          <w:rFonts w:ascii="Courier New" w:eastAsia="Times New Roman" w:hAnsi="Courier New" w:cs="Courier New"/>
+          <w:sz w:val="20"/>
+          <w:szCs w:val="20"/>
+          <w:lang w:eastAsia="en-IN"/>
+        </w:rPr>
+        <w:t xml:space="preserve">            'Freshly prepared caffe latte.'</w:t>
+      </w:r>
+    </w:p>
+    <w:p>
+      <w:pPr>
+        <w:rPr>
+          <w:rFonts w:ascii="Courier New" w:eastAsia="Times New Roman" w:hAnsi="Courier New" w:cs="Courier New"/>
+          <w:sz w:val="20"/>
+          <w:szCs w:val="20"/>
+          <w:lang w:eastAsia="en-IN"/>
+        </w:rPr>
+      </w:pPr>
+      <w:r>
+        <w:rPr>
+          <w:rFonts w:ascii="Courier New" w:eastAsia="Times New Roman" w:hAnsi="Courier New" w:cs="Courier New"/>
+          <w:sz w:val="20"/>
+          <w:szCs w:val="20"/>
+          <w:lang w:eastAsia="en-IN"/>
+        </w:rPr>
+        <w:t xml:space="preserve">        ),</w:t>
+      </w:r>
+    </w:p>
+    <w:p>
+      <w:pPr>
+        <w:rPr>
+          <w:rFonts w:ascii="Courier New" w:eastAsia="Times New Roman" w:hAnsi="Courier New" w:cs="Courier New"/>
+          <w:sz w:val="20"/>
+          <w:szCs w:val="20"/>
+          <w:lang w:eastAsia="en-IN"/>
+        </w:rPr>
+      </w:pPr>
+      <w:r>
+        <w:rPr>
+          <w:rFonts w:ascii="Courier New" w:eastAsia="Times New Roman" w:hAnsi="Courier New" w:cs="Courier New"/>
+          <w:sz w:val="20"/>
+          <w:szCs w:val="20"/>
+          <w:lang w:eastAsia="en-IN"/>
+        </w:rPr>
+        <w:t xml:space="preserve">        (</w:t>
+      </w:r>
+    </w:p>
+    <w:p>
+      <w:pPr>
+        <w:rPr>
+          <w:rFonts w:ascii="Courier New" w:eastAsia="Times New Roman" w:hAnsi="Courier New" w:cs="Courier New"/>
+          <w:sz w:val="20"/>
+          <w:szCs w:val="20"/>
+          <w:lang w:eastAsia="en-IN"/>
+        </w:rPr>
+      </w:pPr>
+      <w:r>
+        <w:rPr>
+          <w:rFonts w:ascii="Courier New" w:eastAsia="Times New Roman" w:hAnsi="Courier New" w:cs="Courier New"/>
+          <w:sz w:val="20"/>
+          <w:szCs w:val="20"/>
+          <w:lang w:eastAsia="en-IN"/>
+        </w:rPr>
+        <w:t xml:space="preserve">            'prod-ece1-caffe-mocha',</w:t>
+      </w:r>
+    </w:p>
+    <w:p>
+      <w:pPr>
+        <w:rPr>
+          <w:rFonts w:ascii="Courier New" w:eastAsia="Times New Roman" w:hAnsi="Courier New" w:cs="Courier New"/>
+          <w:sz w:val="20"/>
+          <w:szCs w:val="20"/>
+          <w:lang w:eastAsia="en-IN"/>
+        </w:rPr>
+      </w:pPr>
+      <w:r>
+        <w:rPr>
+          <w:rFonts w:ascii="Courier New" w:eastAsia="Times New Roman" w:hAnsi="Courier New" w:cs="Courier New"/>
+          <w:sz w:val="20"/>
+          <w:szCs w:val="20"/>
+          <w:lang w:eastAsia="en-IN"/>
+        </w:rPr>
+        <w:t xml:space="preserve">            'ECE1-CAFFE-MOCHA',</w:t>
+      </w:r>
+    </w:p>
+    <w:p>
+      <w:pPr>
+        <w:rPr>
+          <w:rFonts w:ascii="Courier New" w:eastAsia="Times New Roman" w:hAnsi="Courier New" w:cs="Courier New"/>
+          <w:sz w:val="20"/>
+          <w:szCs w:val="20"/>
+          <w:lang w:eastAsia="en-IN"/>
+        </w:rPr>
+      </w:pPr>
+      <w:r>
+        <w:rPr>
+          <w:rFonts w:ascii="Courier New" w:eastAsia="Times New Roman" w:hAnsi="Courier New" w:cs="Courier New"/>
+          <w:sz w:val="20"/>
+          <w:szCs w:val="20"/>
+          <w:lang w:eastAsia="en-IN"/>
+        </w:rPr>
+        <w:t xml:space="preserve">            'Caffe Mocha',</w:t>
+      </w:r>
+    </w:p>
+    <w:p>
+      <w:pPr>
+        <w:rPr>
+          <w:rFonts w:ascii="Courier New" w:eastAsia="Times New Roman" w:hAnsi="Courier New" w:cs="Courier New"/>
+          <w:sz w:val="20"/>
+          <w:szCs w:val="20"/>
+          <w:lang w:eastAsia="en-IN"/>
+        </w:rPr>
+      </w:pPr>
+      <w:r>
+        <w:rPr>
+          <w:rFonts w:ascii="Courier New" w:eastAsia="Times New Roman" w:hAnsi="Courier New" w:cs="Courier New"/>
+          <w:sz w:val="20"/>
+          <w:szCs w:val="20"/>
+          <w:lang w:eastAsia="en-IN"/>
+        </w:rPr>
+        <w:t xml:space="preserve">            'Freshly prepared caffe mocha.'</w:t>
+      </w:r>
+    </w:p>
+    <w:p>
+      <w:pPr>
+        <w:rPr>
+          <w:rFonts w:ascii="Courier New" w:eastAsia="Times New Roman" w:hAnsi="Courier New" w:cs="Courier New"/>
+          <w:sz w:val="20"/>
+          <w:szCs w:val="20"/>
+          <w:lang w:eastAsia="en-IN"/>
+        </w:rPr>
+      </w:pPr>
+      <w:r>
+        <w:rPr>
+          <w:rFonts w:ascii="Courier New" w:eastAsia="Times New Roman" w:hAnsi="Courier New" w:cs="Courier New"/>
+          <w:sz w:val="20"/>
+          <w:szCs w:val="20"/>
+          <w:lang w:eastAsia="en-IN"/>
+        </w:rPr>
+        <w:t xml:space="preserve">        )</w:t>
+      </w:r>
+    </w:p>
+    <w:p>
+      <w:pPr>
+        <w:rPr>
+          <w:rFonts w:ascii="Courier New" w:eastAsia="Times New Roman" w:hAnsi="Courier New" w:cs="Courier New"/>
+          <w:sz w:val="20"/>
+          <w:szCs w:val="20"/>
+          <w:lang w:eastAsia="en-IN"/>
+        </w:rPr>
+      </w:pPr>
+      <w:r>
+        <w:rPr>
+          <w:rFonts w:ascii="Courier New" w:eastAsia="Times New Roman" w:hAnsi="Courier New" w:cs="Courier New"/>
+          <w:sz w:val="20"/>
+          <w:szCs w:val="20"/>
+          <w:lang w:eastAsia="en-IN"/>
+        </w:rPr>
+        <w:t>) AS v(product_id, product_code, product_name, description)</w:t>
+      </w:r>
+    </w:p>
+    <w:p>
+      <w:pPr>
+        <w:rPr>
+          <w:rFonts w:ascii="Courier New" w:eastAsia="Times New Roman" w:hAnsi="Courier New" w:cs="Courier New"/>
+          <w:sz w:val="20"/>
+          <w:szCs w:val="20"/>
+          <w:lang w:eastAsia="en-IN"/>
+        </w:rPr>
+      </w:pPr>
+      <w:r>
+        <w:rPr>
+          <w:rFonts w:ascii="Courier New" w:eastAsia="Times New Roman" w:hAnsi="Courier New" w:cs="Courier New"/>
+          <w:sz w:val="20"/>
+          <w:szCs w:val="20"/>
+          <w:lang w:eastAsia="en-IN"/>
+        </w:rPr>
+        <w:t>JOIN memginedev.organization o</w:t>
+      </w:r>
+    </w:p>
+    <w:p>
+      <w:pPr>
+        <w:rPr>
+          <w:rFonts w:ascii="Courier New" w:eastAsia="Times New Roman" w:hAnsi="Courier New" w:cs="Courier New"/>
+          <w:sz w:val="20"/>
+          <w:szCs w:val="20"/>
+          <w:lang w:eastAsia="en-IN"/>
+        </w:rPr>
+      </w:pPr>
+      <w:r>
+        <w:rPr>
+          <w:rFonts w:ascii="Courier New" w:eastAsia="Times New Roman" w:hAnsi="Courier New" w:cs="Courier New"/>
+          <w:sz w:val="20"/>
+          <w:szCs w:val="20"/>
+          <w:lang w:eastAsia="en-IN"/>
+        </w:rPr>
+        <w:t xml:space="preserve">  ON o.organization_id = 'ORG_ece1b2f6-0e01-4d1b-ac11-3528e136cc1b'</w:t>
+      </w:r>
+    </w:p>
+    <w:p>
+      <w:pPr>
+        <w:rPr>
+          <w:rFonts w:ascii="Courier New" w:eastAsia="Times New Roman" w:hAnsi="Courier New" w:cs="Courier New"/>
+          <w:sz w:val="20"/>
+          <w:szCs w:val="20"/>
+          <w:lang w:eastAsia="en-IN"/>
+        </w:rPr>
+      </w:pPr>
+      <w:r>
+        <w:rPr>
+          <w:rFonts w:ascii="Courier New" w:eastAsia="Times New Roman" w:hAnsi="Courier New" w:cs="Courier New"/>
+          <w:sz w:val="20"/>
+          <w:szCs w:val="20"/>
+          <w:lang w:eastAsia="en-IN"/>
+        </w:rPr>
+        <w:t>ON CONFLICT (product_id) DO UPDATE</w:t>
+      </w:r>
+    </w:p>
+    <w:p>
+      <w:pPr>
+        <w:rPr>
+          <w:rFonts w:ascii="Courier New" w:eastAsia="Times New Roman" w:hAnsi="Courier New" w:cs="Courier New"/>
+          <w:sz w:val="20"/>
+          <w:szCs w:val="20"/>
+          <w:lang w:eastAsia="en-IN"/>
+        </w:rPr>
+      </w:pPr>
+      <w:r>
+        <w:rPr>
+          <w:rFonts w:ascii="Courier New" w:eastAsia="Times New Roman" w:hAnsi="Courier New" w:cs="Courier New"/>
+          <w:sz w:val="20"/>
+          <w:szCs w:val="20"/>
+          <w:lang w:eastAsia="en-IN"/>
+        </w:rPr>
+        <w:t>SET</w:t>
+      </w:r>
+    </w:p>
+    <w:p>
+      <w:pPr>
+        <w:rPr>
+          <w:rFonts w:ascii="Courier New" w:eastAsia="Times New Roman" w:hAnsi="Courier New" w:cs="Courier New"/>
+          <w:sz w:val="20"/>
+          <w:szCs w:val="20"/>
+          <w:lang w:eastAsia="en-IN"/>
+        </w:rPr>
+      </w:pPr>
+      <w:r>
+        <w:rPr>
+          <w:rFonts w:ascii="Courier New" w:eastAsia="Times New Roman" w:hAnsi="Courier New" w:cs="Courier New"/>
+          <w:sz w:val="20"/>
+          <w:szCs w:val="20"/>
+          <w:lang w:eastAsia="en-IN"/>
+        </w:rPr>
+        <w:t xml:space="preserve">    organization_id = EXCLUDED.organization_id,</w:t>
+      </w:r>
+    </w:p>
+    <w:p>
+      <w:pPr>
+        <w:rPr>
+          <w:rFonts w:ascii="Courier New" w:eastAsia="Times New Roman" w:hAnsi="Courier New" w:cs="Courier New"/>
+          <w:sz w:val="20"/>
+          <w:szCs w:val="20"/>
+          <w:lang w:eastAsia="en-IN"/>
+        </w:rPr>
+      </w:pPr>
+      <w:r>
+        <w:rPr>
+          <w:rFonts w:ascii="Courier New" w:eastAsia="Times New Roman" w:hAnsi="Courier New" w:cs="Courier New"/>
+          <w:sz w:val="20"/>
+          <w:szCs w:val="20"/>
+          <w:lang w:eastAsia="en-IN"/>
+        </w:rPr>
+        <w:t xml:space="preserve">    product_code = EXCLUDED.product_code,</w:t>
+      </w:r>
+    </w:p>
+    <w:p>
+      <w:pPr>
+        <w:rPr>
+          <w:rFonts w:ascii="Courier New" w:eastAsia="Times New Roman" w:hAnsi="Courier New" w:cs="Courier New"/>
+          <w:sz w:val="20"/>
+          <w:szCs w:val="20"/>
+          <w:lang w:eastAsia="en-IN"/>
+        </w:rPr>
+      </w:pPr>
+      <w:r>
+        <w:rPr>
+          <w:rFonts w:ascii="Courier New" w:eastAsia="Times New Roman" w:hAnsi="Courier New" w:cs="Courier New"/>
+          <w:sz w:val="20"/>
+          <w:szCs w:val="20"/>
+          <w:lang w:eastAsia="en-IN"/>
+        </w:rPr>
+        <w:t xml:space="preserve">    product_name = EXCLUDED.product_name,</w:t>
+      </w:r>
+    </w:p>
+    <w:p>
+      <w:pPr>
+        <w:rPr>
+          <w:rFonts w:ascii="Courier New" w:eastAsia="Times New Roman" w:hAnsi="Courier New" w:cs="Courier New"/>
+          <w:sz w:val="20"/>
+          <w:szCs w:val="20"/>
+          <w:lang w:eastAsia="en-IN"/>
+        </w:rPr>
+      </w:pPr>
+      <w:r>
+        <w:rPr>
+          <w:rFonts w:ascii="Courier New" w:eastAsia="Times New Roman" w:hAnsi="Courier New" w:cs="Courier New"/>
+          <w:sz w:val="20"/>
+          <w:szCs w:val="20"/>
+          <w:lang w:eastAsia="en-IN"/>
+        </w:rPr>
+        <w:t xml:space="preserve">    description = EXCLUDED.description,</w:t>
+      </w:r>
+    </w:p>
+    <w:p>
+      <w:pPr>
+        <w:rPr>
+          <w:rFonts w:ascii="Courier New" w:eastAsia="Times New Roman" w:hAnsi="Courier New" w:cs="Courier New"/>
+          <w:sz w:val="20"/>
+          <w:szCs w:val="20"/>
+          <w:lang w:eastAsia="en-IN"/>
+        </w:rPr>
+      </w:pPr>
+      <w:r>
+        <w:rPr>
+          <w:rFonts w:ascii="Courier New" w:eastAsia="Times New Roman" w:hAnsi="Courier New" w:cs="Courier New"/>
+          <w:sz w:val="20"/>
+          <w:szCs w:val="20"/>
+          <w:lang w:eastAsia="en-IN"/>
+        </w:rPr>
+        <w:t xml:space="preserve">    status_id = EXCLUDED.status_id,</w:t>
+      </w:r>
+    </w:p>
+    <w:p>
+      <w:pPr>
+        <w:rPr>
+          <w:rFonts w:ascii="Courier New" w:eastAsia="Times New Roman" w:hAnsi="Courier New" w:cs="Courier New"/>
+          <w:sz w:val="20"/>
+          <w:szCs w:val="20"/>
+          <w:lang w:eastAsia="en-IN"/>
+        </w:rPr>
+      </w:pPr>
+      <w:r>
+        <w:rPr>
+          <w:rFonts w:ascii="Courier New" w:eastAsia="Times New Roman" w:hAnsi="Courier New" w:cs="Courier New"/>
+          <w:sz w:val="20"/>
+          <w:szCs w:val="20"/>
+          <w:lang w:eastAsia="en-IN"/>
+        </w:rPr>
+        <w:t xml:space="preserve">    updated_at = CURRENT_TIMESTAMP,</w:t>
+      </w:r>
+    </w:p>
+    <w:p>
+      <w:pPr>
+        <w:rPr>
+          <w:rFonts w:ascii="Courier New" w:eastAsia="Times New Roman" w:hAnsi="Courier New" w:cs="Courier New"/>
+          <w:sz w:val="20"/>
+          <w:szCs w:val="20"/>
+          <w:lang w:eastAsia="en-IN"/>
+        </w:rPr>
+      </w:pPr>
+      <w:r>
+        <w:rPr>
+          <w:rFonts w:ascii="Courier New" w:eastAsia="Times New Roman" w:hAnsi="Courier New" w:cs="Courier New"/>
+          <w:sz w:val="20"/>
+          <w:szCs w:val="20"/>
+          <w:lang w:eastAsia="en-IN"/>
+        </w:rPr>
+        <w:t xml:space="preserve">    updated_by = EXCLUDED.updated_by,</w:t>
+      </w:r>
+    </w:p>
+    <w:p>
+      <w:pPr>
+        <w:rPr>
+          <w:rFonts w:ascii="Courier New" w:eastAsia="Times New Roman" w:hAnsi="Courier New" w:cs="Courier New"/>
+          <w:sz w:val="20"/>
+          <w:szCs w:val="20"/>
+          <w:lang w:eastAsia="en-IN"/>
+        </w:rPr>
+      </w:pPr>
+      <w:r>
+        <w:rPr>
+          <w:rFonts w:ascii="Courier New" w:eastAsia="Times New Roman" w:hAnsi="Courier New" w:cs="Courier New"/>
+          <w:sz w:val="20"/>
+          <w:szCs w:val="20"/>
+          <w:lang w:eastAsia="en-IN"/>
+        </w:rPr>
+        <w:t xml:space="preserve">    is_deleted = FALSE,</w:t>
+      </w:r>
+    </w:p>
+    <w:p>
+      <w:pPr>
+        <w:rPr>
+          <w:rFonts w:ascii="Courier New" w:eastAsia="Times New Roman" w:hAnsi="Courier New" w:cs="Courier New"/>
+          <w:sz w:val="20"/>
+          <w:szCs w:val="20"/>
+          <w:lang w:eastAsia="en-IN"/>
+        </w:rPr>
+      </w:pPr>
+      <w:r>
+        <w:rPr>
+          <w:rFonts w:ascii="Courier New" w:eastAsia="Times New Roman" w:hAnsi="Courier New" w:cs="Courier New"/>
+          <w:sz w:val="20"/>
+          <w:szCs w:val="20"/>
+          <w:lang w:eastAsia="en-IN"/>
+        </w:rPr>
+        <w:t xml:space="preserve">    version_no = memginedev.product.version_no + 1;</w:t>
+      </w:r>
+    </w:p>
+    <w:p>
+      <w:pPr>
+        <w:rPr>
+          <w:rFonts w:ascii="Courier New" w:eastAsia="Times New Roman" w:hAnsi="Courier New" w:cs="Courier New"/>
+          <w:sz w:val="20"/>
+          <w:szCs w:val="20"/>
+          <w:lang w:eastAsia="en-IN"/>
+        </w:rPr>
+      </w:pPr>
     </w:p>
     <w:p>
       <w:pPr>

</xml_diff>

<commit_message>
Payment integration Phase 1
</commit_message>
<xml_diff>
--- a/docs/Memgine DEV environment set UP.docx
+++ b/docs/Memgine DEV environment set UP.docx
@@ -388,7 +388,10 @@
     </w:p>
     <w:p>
       <w:r>
-        <w:t xml:space="preserve">Sudo </w:t>
+        <w:t>s</w:t>
+      </w:r>
+      <w:r>
+        <w:t xml:space="preserve">udo </w:t>
       </w:r>
       <w:r>
         <w:t>journalctl -u memgine-dev -n 100 --no-pager</w:t>
@@ -397,6 +400,11 @@
     <w:p>
       <w:r>
         <w:t>sudo journalctl -u memgine-dev -f</w:t>
+      </w:r>
+    </w:p>
+    <w:p>
+      <w:r>
+        <w:t>aws ssm start-session --target i-02a49b07c1b9979a5 --region ca-central-1 --profile memgine</w:t>
       </w:r>
     </w:p>
     <w:p/>
@@ -407,6 +415,7 @@
     <w:p/>
     <w:p/>
     <w:p/>
+    <w:p/>
     <w:p>
       <w:r>
         <w:t>Memgine internal PK/FK identifiers   → varchar(64)</w:t>
@@ -479,7 +488,11 @@
         <w:t>20260926-183813-c0d00dc</w:t>
       </w:r>
       <w:r>
-        <w:t>/server/server.jar" "$env:TEMP\memgine-s3-server.jar" --profile memgine --region ca-central-1 --quiet; $s3Hash=(Get-FileHash "$env:TEMP\memgine-s3-server.jar" -Algorithm SHA256).Hash; Write-Host "LOCAL=$localHash"; Write-Host "S3=$s3Hash"</w:t>
+        <w:t xml:space="preserve">/server/server.jar" </w:t>
+      </w:r>
+      <w:r>
+        <w:lastRenderedPageBreak/>
+        <w:t>"$env:TEMP\memgine-s3-server.jar" --profile memgine --region ca-central-1 --quiet; $s3Hash=(Get-FileHash "$env:TEMP\memgine-s3-server.jar" -Algorithm SHA256).Hash; Write-Host "LOCAL=$localHash"; Write-Host "S3=$s3Hash"</w:t>
       </w:r>
     </w:p>
     <w:p/>
@@ -1238,521 +1251,635 @@
           <w:szCs w:val="20"/>
           <w:lang w:eastAsia="en-IN"/>
         </w:rPr>
+        <w:t xml:space="preserve">    product_id,</w:t>
+      </w:r>
+    </w:p>
+    <w:p>
+      <w:pPr>
+        <w:rPr>
+          <w:rFonts w:ascii="Courier New" w:eastAsia="Times New Roman" w:hAnsi="Courier New" w:cs="Courier New"/>
+          <w:sz w:val="20"/>
+          <w:szCs w:val="20"/>
+          <w:lang w:eastAsia="en-IN"/>
+        </w:rPr>
+      </w:pPr>
+      <w:r>
+        <w:rPr>
+          <w:rFonts w:ascii="Courier New" w:eastAsia="Times New Roman" w:hAnsi="Courier New" w:cs="Courier New"/>
+          <w:sz w:val="20"/>
+          <w:szCs w:val="20"/>
+          <w:lang w:eastAsia="en-IN"/>
+        </w:rPr>
+        <w:t xml:space="preserve">    organization_id,</w:t>
+      </w:r>
+    </w:p>
+    <w:p>
+      <w:pPr>
+        <w:rPr>
+          <w:rFonts w:ascii="Courier New" w:eastAsia="Times New Roman" w:hAnsi="Courier New" w:cs="Courier New"/>
+          <w:sz w:val="20"/>
+          <w:szCs w:val="20"/>
+          <w:lang w:eastAsia="en-IN"/>
+        </w:rPr>
+      </w:pPr>
+      <w:r>
+        <w:rPr>
+          <w:rFonts w:ascii="Courier New" w:eastAsia="Times New Roman" w:hAnsi="Courier New" w:cs="Courier New"/>
+          <w:sz w:val="20"/>
+          <w:szCs w:val="20"/>
+          <w:lang w:eastAsia="en-IN"/>
+        </w:rPr>
+        <w:t xml:space="preserve">    product_code,</w:t>
+      </w:r>
+    </w:p>
+    <w:p>
+      <w:pPr>
+        <w:rPr>
+          <w:rFonts w:ascii="Courier New" w:eastAsia="Times New Roman" w:hAnsi="Courier New" w:cs="Courier New"/>
+          <w:sz w:val="20"/>
+          <w:szCs w:val="20"/>
+          <w:lang w:eastAsia="en-IN"/>
+        </w:rPr>
+      </w:pPr>
+      <w:r>
+        <w:rPr>
+          <w:rFonts w:ascii="Courier New" w:eastAsia="Times New Roman" w:hAnsi="Courier New" w:cs="Courier New"/>
+          <w:sz w:val="20"/>
+          <w:szCs w:val="20"/>
+          <w:lang w:eastAsia="en-IN"/>
+        </w:rPr>
+        <w:t xml:space="preserve">    product_name,</w:t>
+      </w:r>
+    </w:p>
+    <w:p>
+      <w:pPr>
+        <w:rPr>
+          <w:rFonts w:ascii="Courier New" w:eastAsia="Times New Roman" w:hAnsi="Courier New" w:cs="Courier New"/>
+          <w:sz w:val="20"/>
+          <w:szCs w:val="20"/>
+          <w:lang w:eastAsia="en-IN"/>
+        </w:rPr>
+      </w:pPr>
+      <w:r>
+        <w:rPr>
+          <w:rFonts w:ascii="Courier New" w:eastAsia="Times New Roman" w:hAnsi="Courier New" w:cs="Courier New"/>
+          <w:sz w:val="20"/>
+          <w:szCs w:val="20"/>
+          <w:lang w:eastAsia="en-IN"/>
+        </w:rPr>
+        <w:t xml:space="preserve">    description,</w:t>
+      </w:r>
+    </w:p>
+    <w:p>
+      <w:pPr>
+        <w:rPr>
+          <w:rFonts w:ascii="Courier New" w:eastAsia="Times New Roman" w:hAnsi="Courier New" w:cs="Courier New"/>
+          <w:sz w:val="20"/>
+          <w:szCs w:val="20"/>
+          <w:lang w:eastAsia="en-IN"/>
+        </w:rPr>
+      </w:pPr>
+      <w:r>
+        <w:rPr>
+          <w:rFonts w:ascii="Courier New" w:eastAsia="Times New Roman" w:hAnsi="Courier New" w:cs="Courier New"/>
+          <w:sz w:val="20"/>
+          <w:szCs w:val="20"/>
+          <w:lang w:eastAsia="en-IN"/>
+        </w:rPr>
+        <w:t xml:space="preserve">    status_id,</w:t>
+      </w:r>
+    </w:p>
+    <w:p>
+      <w:pPr>
+        <w:rPr>
+          <w:rFonts w:ascii="Courier New" w:eastAsia="Times New Roman" w:hAnsi="Courier New" w:cs="Courier New"/>
+          <w:sz w:val="20"/>
+          <w:szCs w:val="20"/>
+          <w:lang w:eastAsia="en-IN"/>
+        </w:rPr>
+      </w:pPr>
+      <w:r>
+        <w:rPr>
+          <w:rFonts w:ascii="Courier New" w:eastAsia="Times New Roman" w:hAnsi="Courier New" w:cs="Courier New"/>
+          <w:sz w:val="20"/>
+          <w:szCs w:val="20"/>
+          <w:lang w:eastAsia="en-IN"/>
+        </w:rPr>
+        <w:t xml:space="preserve">    created_at,</w:t>
+      </w:r>
+    </w:p>
+    <w:p>
+      <w:pPr>
+        <w:rPr>
+          <w:rFonts w:ascii="Courier New" w:eastAsia="Times New Roman" w:hAnsi="Courier New" w:cs="Courier New"/>
+          <w:sz w:val="20"/>
+          <w:szCs w:val="20"/>
+          <w:lang w:eastAsia="en-IN"/>
+        </w:rPr>
+      </w:pPr>
+      <w:r>
+        <w:rPr>
+          <w:rFonts w:ascii="Courier New" w:eastAsia="Times New Roman" w:hAnsi="Courier New" w:cs="Courier New"/>
+          <w:sz w:val="20"/>
+          <w:szCs w:val="20"/>
+          <w:lang w:eastAsia="en-IN"/>
+        </w:rPr>
+        <w:t xml:space="preserve">    created_by,</w:t>
+      </w:r>
+    </w:p>
+    <w:p>
+      <w:pPr>
+        <w:rPr>
+          <w:rFonts w:ascii="Courier New" w:eastAsia="Times New Roman" w:hAnsi="Courier New" w:cs="Courier New"/>
+          <w:sz w:val="20"/>
+          <w:szCs w:val="20"/>
+          <w:lang w:eastAsia="en-IN"/>
+        </w:rPr>
+      </w:pPr>
+      <w:r>
+        <w:rPr>
+          <w:rFonts w:ascii="Courier New" w:eastAsia="Times New Roman" w:hAnsi="Courier New" w:cs="Courier New"/>
+          <w:sz w:val="20"/>
+          <w:szCs w:val="20"/>
+          <w:lang w:eastAsia="en-IN"/>
+        </w:rPr>
+        <w:t xml:space="preserve">    updated_at,</w:t>
+      </w:r>
+    </w:p>
+    <w:p>
+      <w:pPr>
+        <w:rPr>
+          <w:rFonts w:ascii="Courier New" w:eastAsia="Times New Roman" w:hAnsi="Courier New" w:cs="Courier New"/>
+          <w:sz w:val="20"/>
+          <w:szCs w:val="20"/>
+          <w:lang w:eastAsia="en-IN"/>
+        </w:rPr>
+      </w:pPr>
+      <w:r>
+        <w:rPr>
+          <w:rFonts w:ascii="Courier New" w:eastAsia="Times New Roman" w:hAnsi="Courier New" w:cs="Courier New"/>
+          <w:sz w:val="20"/>
+          <w:szCs w:val="20"/>
+          <w:lang w:eastAsia="en-IN"/>
+        </w:rPr>
+        <w:t xml:space="preserve">    updated_by,</w:t>
+      </w:r>
+    </w:p>
+    <w:p>
+      <w:pPr>
+        <w:rPr>
+          <w:rFonts w:ascii="Courier New" w:eastAsia="Times New Roman" w:hAnsi="Courier New" w:cs="Courier New"/>
+          <w:sz w:val="20"/>
+          <w:szCs w:val="20"/>
+          <w:lang w:eastAsia="en-IN"/>
+        </w:rPr>
+      </w:pPr>
+      <w:r>
+        <w:rPr>
+          <w:rFonts w:ascii="Courier New" w:eastAsia="Times New Roman" w:hAnsi="Courier New" w:cs="Courier New"/>
+          <w:sz w:val="20"/>
+          <w:szCs w:val="20"/>
+          <w:lang w:eastAsia="en-IN"/>
+        </w:rPr>
+        <w:t xml:space="preserve">    is_deleted,</w:t>
+      </w:r>
+    </w:p>
+    <w:p>
+      <w:pPr>
+        <w:rPr>
+          <w:rFonts w:ascii="Courier New" w:eastAsia="Times New Roman" w:hAnsi="Courier New" w:cs="Courier New"/>
+          <w:sz w:val="20"/>
+          <w:szCs w:val="20"/>
+          <w:lang w:eastAsia="en-IN"/>
+        </w:rPr>
+      </w:pPr>
+      <w:r>
+        <w:rPr>
+          <w:rFonts w:ascii="Courier New" w:eastAsia="Times New Roman" w:hAnsi="Courier New" w:cs="Courier New"/>
+          <w:sz w:val="20"/>
+          <w:szCs w:val="20"/>
+          <w:lang w:eastAsia="en-IN"/>
+        </w:rPr>
+        <w:t xml:space="preserve">    version_no</w:t>
+      </w:r>
+    </w:p>
+    <w:p>
+      <w:pPr>
+        <w:rPr>
+          <w:rFonts w:ascii="Courier New" w:eastAsia="Times New Roman" w:hAnsi="Courier New" w:cs="Courier New"/>
+          <w:sz w:val="20"/>
+          <w:szCs w:val="20"/>
+          <w:lang w:eastAsia="en-IN"/>
+        </w:rPr>
+      </w:pPr>
+      <w:r>
+        <w:rPr>
+          <w:rFonts w:ascii="Courier New" w:eastAsia="Times New Roman" w:hAnsi="Courier New" w:cs="Courier New"/>
+          <w:sz w:val="20"/>
+          <w:szCs w:val="20"/>
+          <w:lang w:eastAsia="en-IN"/>
+        </w:rPr>
+        <w:t>)</w:t>
+      </w:r>
+    </w:p>
+    <w:p>
+      <w:pPr>
+        <w:rPr>
+          <w:rFonts w:ascii="Courier New" w:eastAsia="Times New Roman" w:hAnsi="Courier New" w:cs="Courier New"/>
+          <w:sz w:val="20"/>
+          <w:szCs w:val="20"/>
+          <w:lang w:eastAsia="en-IN"/>
+        </w:rPr>
+      </w:pPr>
+      <w:r>
+        <w:rPr>
+          <w:rFonts w:ascii="Courier New" w:eastAsia="Times New Roman" w:hAnsi="Courier New" w:cs="Courier New"/>
+          <w:sz w:val="20"/>
+          <w:szCs w:val="20"/>
+          <w:lang w:eastAsia="en-IN"/>
+        </w:rPr>
+        <w:t>SELECT</w:t>
+      </w:r>
+    </w:p>
+    <w:p>
+      <w:pPr>
+        <w:rPr>
+          <w:rFonts w:ascii="Courier New" w:eastAsia="Times New Roman" w:hAnsi="Courier New" w:cs="Courier New"/>
+          <w:sz w:val="20"/>
+          <w:szCs w:val="20"/>
+          <w:lang w:eastAsia="en-IN"/>
+        </w:rPr>
+      </w:pPr>
+      <w:r>
+        <w:rPr>
+          <w:rFonts w:ascii="Courier New" w:eastAsia="Times New Roman" w:hAnsi="Courier New" w:cs="Courier New"/>
+          <w:sz w:val="20"/>
+          <w:szCs w:val="20"/>
+          <w:lang w:eastAsia="en-IN"/>
+        </w:rPr>
+        <w:t xml:space="preserve">    v.product_id,</w:t>
+      </w:r>
+    </w:p>
+    <w:p>
+      <w:pPr>
+        <w:rPr>
+          <w:rFonts w:ascii="Courier New" w:eastAsia="Times New Roman" w:hAnsi="Courier New" w:cs="Courier New"/>
+          <w:sz w:val="20"/>
+          <w:szCs w:val="20"/>
+          <w:lang w:eastAsia="en-IN"/>
+        </w:rPr>
+      </w:pPr>
+      <w:r>
+        <w:rPr>
+          <w:rFonts w:ascii="Courier New" w:eastAsia="Times New Roman" w:hAnsi="Courier New" w:cs="Courier New"/>
+          <w:sz w:val="20"/>
+          <w:szCs w:val="20"/>
+          <w:lang w:eastAsia="en-IN"/>
+        </w:rPr>
+        <w:t xml:space="preserve">    'ORG_ece1b2f6-0e01-4d1b-ac11-3528e136cc1b',</w:t>
+      </w:r>
+    </w:p>
+    <w:p>
+      <w:pPr>
+        <w:rPr>
+          <w:rFonts w:ascii="Courier New" w:eastAsia="Times New Roman" w:hAnsi="Courier New" w:cs="Courier New"/>
+          <w:sz w:val="20"/>
+          <w:szCs w:val="20"/>
+          <w:lang w:eastAsia="en-IN"/>
+        </w:rPr>
+      </w:pPr>
+      <w:r>
+        <w:rPr>
+          <w:rFonts w:ascii="Courier New" w:eastAsia="Times New Roman" w:hAnsi="Courier New" w:cs="Courier New"/>
+          <w:sz w:val="20"/>
+          <w:szCs w:val="20"/>
+          <w:lang w:eastAsia="en-IN"/>
+        </w:rPr>
+        <w:t xml:space="preserve">    v.product_code,</w:t>
+      </w:r>
+    </w:p>
+    <w:p>
+      <w:pPr>
+        <w:rPr>
+          <w:rFonts w:ascii="Courier New" w:eastAsia="Times New Roman" w:hAnsi="Courier New" w:cs="Courier New"/>
+          <w:sz w:val="20"/>
+          <w:szCs w:val="20"/>
+          <w:lang w:eastAsia="en-IN"/>
+        </w:rPr>
+      </w:pPr>
+      <w:r>
+        <w:rPr>
+          <w:rFonts w:ascii="Courier New" w:eastAsia="Times New Roman" w:hAnsi="Courier New" w:cs="Courier New"/>
+          <w:sz w:val="20"/>
+          <w:szCs w:val="20"/>
+          <w:lang w:eastAsia="en-IN"/>
+        </w:rPr>
+        <w:t xml:space="preserve">    v.product_name,</w:t>
+      </w:r>
+    </w:p>
+    <w:p>
+      <w:pPr>
+        <w:rPr>
+          <w:rFonts w:ascii="Courier New" w:eastAsia="Times New Roman" w:hAnsi="Courier New" w:cs="Courier New"/>
+          <w:sz w:val="20"/>
+          <w:szCs w:val="20"/>
+          <w:lang w:eastAsia="en-IN"/>
+        </w:rPr>
+      </w:pPr>
+      <w:r>
+        <w:rPr>
+          <w:rFonts w:ascii="Courier New" w:eastAsia="Times New Roman" w:hAnsi="Courier New" w:cs="Courier New"/>
+          <w:sz w:val="20"/>
+          <w:szCs w:val="20"/>
+          <w:lang w:eastAsia="en-IN"/>
+        </w:rPr>
+        <w:t xml:space="preserve">    v.description,</w:t>
+      </w:r>
+    </w:p>
+    <w:p>
+      <w:pPr>
+        <w:rPr>
+          <w:rFonts w:ascii="Courier New" w:eastAsia="Times New Roman" w:hAnsi="Courier New" w:cs="Courier New"/>
+          <w:sz w:val="20"/>
+          <w:szCs w:val="20"/>
+          <w:lang w:eastAsia="en-IN"/>
+        </w:rPr>
+      </w:pPr>
+      <w:r>
+        <w:rPr>
+          <w:rFonts w:ascii="Courier New" w:eastAsia="Times New Roman" w:hAnsi="Courier New" w:cs="Courier New"/>
+          <w:sz w:val="20"/>
+          <w:szCs w:val="20"/>
+          <w:lang w:eastAsia="en-IN"/>
+        </w:rPr>
+        <w:t xml:space="preserve">    'entity-status-product-active',</w:t>
+      </w:r>
+    </w:p>
+    <w:p>
+      <w:pPr>
+        <w:rPr>
+          <w:rFonts w:ascii="Courier New" w:eastAsia="Times New Roman" w:hAnsi="Courier New" w:cs="Courier New"/>
+          <w:sz w:val="20"/>
+          <w:szCs w:val="20"/>
+          <w:lang w:eastAsia="en-IN"/>
+        </w:rPr>
+      </w:pPr>
+      <w:r>
+        <w:rPr>
+          <w:rFonts w:ascii="Courier New" w:eastAsia="Times New Roman" w:hAnsi="Courier New" w:cs="Courier New"/>
+          <w:sz w:val="20"/>
+          <w:szCs w:val="20"/>
+          <w:lang w:eastAsia="en-IN"/>
+        </w:rPr>
+        <w:t xml:space="preserve">    CURRENT_TIMESTAMP,</w:t>
+      </w:r>
+    </w:p>
+    <w:p>
+      <w:pPr>
+        <w:rPr>
+          <w:rFonts w:ascii="Courier New" w:eastAsia="Times New Roman" w:hAnsi="Courier New" w:cs="Courier New"/>
+          <w:sz w:val="20"/>
+          <w:szCs w:val="20"/>
+          <w:lang w:eastAsia="en-IN"/>
+        </w:rPr>
+      </w:pPr>
+      <w:r>
+        <w:rPr>
+          <w:rFonts w:ascii="Courier New" w:eastAsia="Times New Roman" w:hAnsi="Courier New" w:cs="Courier New"/>
+          <w:sz w:val="20"/>
+          <w:szCs w:val="20"/>
+          <w:lang w:eastAsia="en-IN"/>
+        </w:rPr>
+        <w:t xml:space="preserve">    o.updated_by,</w:t>
+      </w:r>
+    </w:p>
+    <w:p>
+      <w:pPr>
+        <w:rPr>
+          <w:rFonts w:ascii="Courier New" w:eastAsia="Times New Roman" w:hAnsi="Courier New" w:cs="Courier New"/>
+          <w:sz w:val="20"/>
+          <w:szCs w:val="20"/>
+          <w:lang w:eastAsia="en-IN"/>
+        </w:rPr>
+      </w:pPr>
+      <w:r>
+        <w:rPr>
+          <w:rFonts w:ascii="Courier New" w:eastAsia="Times New Roman" w:hAnsi="Courier New" w:cs="Courier New"/>
+          <w:sz w:val="20"/>
+          <w:szCs w:val="20"/>
+          <w:lang w:eastAsia="en-IN"/>
+        </w:rPr>
+        <w:t xml:space="preserve">    CURRENT_TIMESTAMP,</w:t>
+      </w:r>
+    </w:p>
+    <w:p>
+      <w:pPr>
+        <w:rPr>
+          <w:rFonts w:ascii="Courier New" w:eastAsia="Times New Roman" w:hAnsi="Courier New" w:cs="Courier New"/>
+          <w:sz w:val="20"/>
+          <w:szCs w:val="20"/>
+          <w:lang w:eastAsia="en-IN"/>
+        </w:rPr>
+      </w:pPr>
+      <w:r>
+        <w:rPr>
+          <w:rFonts w:ascii="Courier New" w:eastAsia="Times New Roman" w:hAnsi="Courier New" w:cs="Courier New"/>
+          <w:sz w:val="20"/>
+          <w:szCs w:val="20"/>
+          <w:lang w:eastAsia="en-IN"/>
+        </w:rPr>
+        <w:t xml:space="preserve">    o.updated_by,</w:t>
+      </w:r>
+    </w:p>
+    <w:p>
+      <w:pPr>
+        <w:rPr>
+          <w:rFonts w:ascii="Courier New" w:eastAsia="Times New Roman" w:hAnsi="Courier New" w:cs="Courier New"/>
+          <w:sz w:val="20"/>
+          <w:szCs w:val="20"/>
+          <w:lang w:eastAsia="en-IN"/>
+        </w:rPr>
+      </w:pPr>
+      <w:r>
+        <w:rPr>
+          <w:rFonts w:ascii="Courier New" w:eastAsia="Times New Roman" w:hAnsi="Courier New" w:cs="Courier New"/>
+          <w:sz w:val="20"/>
+          <w:szCs w:val="20"/>
+          <w:lang w:eastAsia="en-IN"/>
+        </w:rPr>
+        <w:t xml:space="preserve">    FALSE,</w:t>
+      </w:r>
+    </w:p>
+    <w:p>
+      <w:pPr>
+        <w:rPr>
+          <w:rFonts w:ascii="Courier New" w:eastAsia="Times New Roman" w:hAnsi="Courier New" w:cs="Courier New"/>
+          <w:sz w:val="20"/>
+          <w:szCs w:val="20"/>
+          <w:lang w:eastAsia="en-IN"/>
+        </w:rPr>
+      </w:pPr>
+      <w:r>
+        <w:rPr>
+          <w:rFonts w:ascii="Courier New" w:eastAsia="Times New Roman" w:hAnsi="Courier New" w:cs="Courier New"/>
+          <w:sz w:val="20"/>
+          <w:szCs w:val="20"/>
+          <w:lang w:eastAsia="en-IN"/>
+        </w:rPr>
+        <w:t xml:space="preserve">    1</w:t>
+      </w:r>
+    </w:p>
+    <w:p>
+      <w:pPr>
+        <w:rPr>
+          <w:rFonts w:ascii="Courier New" w:eastAsia="Times New Roman" w:hAnsi="Courier New" w:cs="Courier New"/>
+          <w:sz w:val="20"/>
+          <w:szCs w:val="20"/>
+          <w:lang w:eastAsia="en-IN"/>
+        </w:rPr>
+      </w:pPr>
+      <w:r>
+        <w:rPr>
+          <w:rFonts w:ascii="Courier New" w:eastAsia="Times New Roman" w:hAnsi="Courier New" w:cs="Courier New"/>
+          <w:sz w:val="20"/>
+          <w:szCs w:val="20"/>
+          <w:lang w:eastAsia="en-IN"/>
+        </w:rPr>
+        <w:t>FROM (</w:t>
+      </w:r>
+    </w:p>
+    <w:p>
+      <w:pPr>
+        <w:rPr>
+          <w:rFonts w:ascii="Courier New" w:eastAsia="Times New Roman" w:hAnsi="Courier New" w:cs="Courier New"/>
+          <w:sz w:val="20"/>
+          <w:szCs w:val="20"/>
+          <w:lang w:eastAsia="en-IN"/>
+        </w:rPr>
+      </w:pPr>
+      <w:r>
+        <w:rPr>
+          <w:rFonts w:ascii="Courier New" w:eastAsia="Times New Roman" w:hAnsi="Courier New" w:cs="Courier New"/>
+          <w:sz w:val="20"/>
+          <w:szCs w:val="20"/>
+          <w:lang w:eastAsia="en-IN"/>
+        </w:rPr>
+        <w:t xml:space="preserve">    VALUES</w:t>
+      </w:r>
+    </w:p>
+    <w:p>
+      <w:pPr>
+        <w:rPr>
+          <w:rFonts w:ascii="Courier New" w:eastAsia="Times New Roman" w:hAnsi="Courier New" w:cs="Courier New"/>
+          <w:sz w:val="20"/>
+          <w:szCs w:val="20"/>
+          <w:lang w:eastAsia="en-IN"/>
+        </w:rPr>
+      </w:pPr>
+      <w:r>
+        <w:rPr>
+          <w:rFonts w:ascii="Courier New" w:eastAsia="Times New Roman" w:hAnsi="Courier New" w:cs="Courier New"/>
+          <w:sz w:val="20"/>
+          <w:szCs w:val="20"/>
+          <w:lang w:eastAsia="en-IN"/>
+        </w:rPr>
+        <w:t xml:space="preserve">        (</w:t>
+      </w:r>
+    </w:p>
+    <w:p>
+      <w:pPr>
+        <w:rPr>
+          <w:rFonts w:ascii="Courier New" w:eastAsia="Times New Roman" w:hAnsi="Courier New" w:cs="Courier New"/>
+          <w:sz w:val="20"/>
+          <w:szCs w:val="20"/>
+          <w:lang w:eastAsia="en-IN"/>
+        </w:rPr>
+      </w:pPr>
+      <w:r>
+        <w:rPr>
+          <w:rFonts w:ascii="Courier New" w:eastAsia="Times New Roman" w:hAnsi="Courier New" w:cs="Courier New"/>
+          <w:sz w:val="20"/>
+          <w:szCs w:val="20"/>
+          <w:lang w:eastAsia="en-IN"/>
+        </w:rPr>
+        <w:t xml:space="preserve">            'prod-ece1-filter-coffee',</w:t>
+      </w:r>
+    </w:p>
+    <w:p>
+      <w:pPr>
+        <w:rPr>
+          <w:rFonts w:ascii="Courier New" w:eastAsia="Times New Roman" w:hAnsi="Courier New" w:cs="Courier New"/>
+          <w:sz w:val="20"/>
+          <w:szCs w:val="20"/>
+          <w:lang w:eastAsia="en-IN"/>
+        </w:rPr>
+      </w:pPr>
+      <w:r>
+        <w:rPr>
+          <w:rFonts w:ascii="Courier New" w:eastAsia="Times New Roman" w:hAnsi="Courier New" w:cs="Courier New"/>
+          <w:sz w:val="20"/>
+          <w:szCs w:val="20"/>
+          <w:lang w:eastAsia="en-IN"/>
+        </w:rPr>
+        <w:t xml:space="preserve">            'ECE1-FILTER-COFFEE',</w:t>
+      </w:r>
+    </w:p>
+    <w:p>
+      <w:pPr>
+        <w:rPr>
+          <w:rFonts w:ascii="Courier New" w:eastAsia="Times New Roman" w:hAnsi="Courier New" w:cs="Courier New"/>
+          <w:sz w:val="20"/>
+          <w:szCs w:val="20"/>
+          <w:lang w:eastAsia="en-IN"/>
+        </w:rPr>
+      </w:pPr>
+      <w:r>
+        <w:rPr>
+          <w:rFonts w:ascii="Courier New" w:eastAsia="Times New Roman" w:hAnsi="Courier New" w:cs="Courier New"/>
+          <w:sz w:val="20"/>
+          <w:szCs w:val="20"/>
+          <w:lang w:eastAsia="en-IN"/>
+        </w:rPr>
+        <w:t xml:space="preserve">            'Filter Coffee',</w:t>
+      </w:r>
+    </w:p>
+    <w:p>
+      <w:pPr>
+        <w:rPr>
+          <w:rFonts w:ascii="Courier New" w:eastAsia="Times New Roman" w:hAnsi="Courier New" w:cs="Courier New"/>
+          <w:sz w:val="20"/>
+          <w:szCs w:val="20"/>
+          <w:lang w:eastAsia="en-IN"/>
+        </w:rPr>
+      </w:pPr>
+      <w:r>
+        <w:rPr>
+          <w:rFonts w:ascii="Courier New" w:eastAsia="Times New Roman" w:hAnsi="Courier New" w:cs="Courier New"/>
+          <w:sz w:val="20"/>
+          <w:szCs w:val="20"/>
+          <w:lang w:eastAsia="en-IN"/>
+        </w:rPr>
         <w:lastRenderedPageBreak/>
-        <w:t xml:space="preserve">    product_id,</w:t>
-      </w:r>
-    </w:p>
-    <w:p>
-      <w:pPr>
-        <w:rPr>
-          <w:rFonts w:ascii="Courier New" w:eastAsia="Times New Roman" w:hAnsi="Courier New" w:cs="Courier New"/>
-          <w:sz w:val="20"/>
-          <w:szCs w:val="20"/>
-          <w:lang w:eastAsia="en-IN"/>
-        </w:rPr>
-      </w:pPr>
-      <w:r>
-        <w:rPr>
-          <w:rFonts w:ascii="Courier New" w:eastAsia="Times New Roman" w:hAnsi="Courier New" w:cs="Courier New"/>
-          <w:sz w:val="20"/>
-          <w:szCs w:val="20"/>
-          <w:lang w:eastAsia="en-IN"/>
-        </w:rPr>
-        <w:t xml:space="preserve">    organization_id,</w:t>
-      </w:r>
-    </w:p>
-    <w:p>
-      <w:pPr>
-        <w:rPr>
-          <w:rFonts w:ascii="Courier New" w:eastAsia="Times New Roman" w:hAnsi="Courier New" w:cs="Courier New"/>
-          <w:sz w:val="20"/>
-          <w:szCs w:val="20"/>
-          <w:lang w:eastAsia="en-IN"/>
-        </w:rPr>
-      </w:pPr>
-      <w:r>
-        <w:rPr>
-          <w:rFonts w:ascii="Courier New" w:eastAsia="Times New Roman" w:hAnsi="Courier New" w:cs="Courier New"/>
-          <w:sz w:val="20"/>
-          <w:szCs w:val="20"/>
-          <w:lang w:eastAsia="en-IN"/>
-        </w:rPr>
-        <w:t xml:space="preserve">    product_code,</w:t>
-      </w:r>
-    </w:p>
-    <w:p>
-      <w:pPr>
-        <w:rPr>
-          <w:rFonts w:ascii="Courier New" w:eastAsia="Times New Roman" w:hAnsi="Courier New" w:cs="Courier New"/>
-          <w:sz w:val="20"/>
-          <w:szCs w:val="20"/>
-          <w:lang w:eastAsia="en-IN"/>
-        </w:rPr>
-      </w:pPr>
-      <w:r>
-        <w:rPr>
-          <w:rFonts w:ascii="Courier New" w:eastAsia="Times New Roman" w:hAnsi="Courier New" w:cs="Courier New"/>
-          <w:sz w:val="20"/>
-          <w:szCs w:val="20"/>
-          <w:lang w:eastAsia="en-IN"/>
-        </w:rPr>
-        <w:t xml:space="preserve">    product_name,</w:t>
-      </w:r>
-    </w:p>
-    <w:p>
-      <w:pPr>
-        <w:rPr>
-          <w:rFonts w:ascii="Courier New" w:eastAsia="Times New Roman" w:hAnsi="Courier New" w:cs="Courier New"/>
-          <w:sz w:val="20"/>
-          <w:szCs w:val="20"/>
-          <w:lang w:eastAsia="en-IN"/>
-        </w:rPr>
-      </w:pPr>
-      <w:r>
-        <w:rPr>
-          <w:rFonts w:ascii="Courier New" w:eastAsia="Times New Roman" w:hAnsi="Courier New" w:cs="Courier New"/>
-          <w:sz w:val="20"/>
-          <w:szCs w:val="20"/>
-          <w:lang w:eastAsia="en-IN"/>
-        </w:rPr>
-        <w:t xml:space="preserve">    description,</w:t>
-      </w:r>
-    </w:p>
-    <w:p>
-      <w:pPr>
-        <w:rPr>
-          <w:rFonts w:ascii="Courier New" w:eastAsia="Times New Roman" w:hAnsi="Courier New" w:cs="Courier New"/>
-          <w:sz w:val="20"/>
-          <w:szCs w:val="20"/>
-          <w:lang w:eastAsia="en-IN"/>
-        </w:rPr>
-      </w:pPr>
-      <w:r>
-        <w:rPr>
-          <w:rFonts w:ascii="Courier New" w:eastAsia="Times New Roman" w:hAnsi="Courier New" w:cs="Courier New"/>
-          <w:sz w:val="20"/>
-          <w:szCs w:val="20"/>
-          <w:lang w:eastAsia="en-IN"/>
-        </w:rPr>
-        <w:t xml:space="preserve">    status_id,</w:t>
-      </w:r>
-    </w:p>
-    <w:p>
-      <w:pPr>
-        <w:rPr>
-          <w:rFonts w:ascii="Courier New" w:eastAsia="Times New Roman" w:hAnsi="Courier New" w:cs="Courier New"/>
-          <w:sz w:val="20"/>
-          <w:szCs w:val="20"/>
-          <w:lang w:eastAsia="en-IN"/>
-        </w:rPr>
-      </w:pPr>
-      <w:r>
-        <w:rPr>
-          <w:rFonts w:ascii="Courier New" w:eastAsia="Times New Roman" w:hAnsi="Courier New" w:cs="Courier New"/>
-          <w:sz w:val="20"/>
-          <w:szCs w:val="20"/>
-          <w:lang w:eastAsia="en-IN"/>
-        </w:rPr>
-        <w:t xml:space="preserve">    created_at,</w:t>
-      </w:r>
-    </w:p>
-    <w:p>
-      <w:pPr>
-        <w:rPr>
-          <w:rFonts w:ascii="Courier New" w:eastAsia="Times New Roman" w:hAnsi="Courier New" w:cs="Courier New"/>
-          <w:sz w:val="20"/>
-          <w:szCs w:val="20"/>
-          <w:lang w:eastAsia="en-IN"/>
-        </w:rPr>
-      </w:pPr>
-      <w:r>
-        <w:rPr>
-          <w:rFonts w:ascii="Courier New" w:eastAsia="Times New Roman" w:hAnsi="Courier New" w:cs="Courier New"/>
-          <w:sz w:val="20"/>
-          <w:szCs w:val="20"/>
-          <w:lang w:eastAsia="en-IN"/>
-        </w:rPr>
-        <w:t xml:space="preserve">    created_by,</w:t>
-      </w:r>
-    </w:p>
-    <w:p>
-      <w:pPr>
-        <w:rPr>
-          <w:rFonts w:ascii="Courier New" w:eastAsia="Times New Roman" w:hAnsi="Courier New" w:cs="Courier New"/>
-          <w:sz w:val="20"/>
-          <w:szCs w:val="20"/>
-          <w:lang w:eastAsia="en-IN"/>
-        </w:rPr>
-      </w:pPr>
-      <w:r>
-        <w:rPr>
-          <w:rFonts w:ascii="Courier New" w:eastAsia="Times New Roman" w:hAnsi="Courier New" w:cs="Courier New"/>
-          <w:sz w:val="20"/>
-          <w:szCs w:val="20"/>
-          <w:lang w:eastAsia="en-IN"/>
-        </w:rPr>
-        <w:t xml:space="preserve">    updated_at,</w:t>
-      </w:r>
-    </w:p>
-    <w:p>
-      <w:pPr>
-        <w:rPr>
-          <w:rFonts w:ascii="Courier New" w:eastAsia="Times New Roman" w:hAnsi="Courier New" w:cs="Courier New"/>
-          <w:sz w:val="20"/>
-          <w:szCs w:val="20"/>
-          <w:lang w:eastAsia="en-IN"/>
-        </w:rPr>
-      </w:pPr>
-      <w:r>
-        <w:rPr>
-          <w:rFonts w:ascii="Courier New" w:eastAsia="Times New Roman" w:hAnsi="Courier New" w:cs="Courier New"/>
-          <w:sz w:val="20"/>
-          <w:szCs w:val="20"/>
-          <w:lang w:eastAsia="en-IN"/>
-        </w:rPr>
-        <w:t xml:space="preserve">    updated_by,</w:t>
-      </w:r>
-    </w:p>
-    <w:p>
-      <w:pPr>
-        <w:rPr>
-          <w:rFonts w:ascii="Courier New" w:eastAsia="Times New Roman" w:hAnsi="Courier New" w:cs="Courier New"/>
-          <w:sz w:val="20"/>
-          <w:szCs w:val="20"/>
-          <w:lang w:eastAsia="en-IN"/>
-        </w:rPr>
-      </w:pPr>
-      <w:r>
-        <w:rPr>
-          <w:rFonts w:ascii="Courier New" w:eastAsia="Times New Roman" w:hAnsi="Courier New" w:cs="Courier New"/>
-          <w:sz w:val="20"/>
-          <w:szCs w:val="20"/>
-          <w:lang w:eastAsia="en-IN"/>
-        </w:rPr>
-        <w:t xml:space="preserve">    is_deleted,</w:t>
-      </w:r>
-    </w:p>
-    <w:p>
-      <w:pPr>
-        <w:rPr>
-          <w:rFonts w:ascii="Courier New" w:eastAsia="Times New Roman" w:hAnsi="Courier New" w:cs="Courier New"/>
-          <w:sz w:val="20"/>
-          <w:szCs w:val="20"/>
-          <w:lang w:eastAsia="en-IN"/>
-        </w:rPr>
-      </w:pPr>
-      <w:r>
-        <w:rPr>
-          <w:rFonts w:ascii="Courier New" w:eastAsia="Times New Roman" w:hAnsi="Courier New" w:cs="Courier New"/>
-          <w:sz w:val="20"/>
-          <w:szCs w:val="20"/>
-          <w:lang w:eastAsia="en-IN"/>
-        </w:rPr>
-        <w:t xml:space="preserve">    version_no</w:t>
-      </w:r>
-    </w:p>
-    <w:p>
-      <w:pPr>
-        <w:rPr>
-          <w:rFonts w:ascii="Courier New" w:eastAsia="Times New Roman" w:hAnsi="Courier New" w:cs="Courier New"/>
-          <w:sz w:val="20"/>
-          <w:szCs w:val="20"/>
-          <w:lang w:eastAsia="en-IN"/>
-        </w:rPr>
-      </w:pPr>
-      <w:r>
-        <w:rPr>
-          <w:rFonts w:ascii="Courier New" w:eastAsia="Times New Roman" w:hAnsi="Courier New" w:cs="Courier New"/>
-          <w:sz w:val="20"/>
-          <w:szCs w:val="20"/>
-          <w:lang w:eastAsia="en-IN"/>
-        </w:rPr>
-        <w:t>)</w:t>
-      </w:r>
-    </w:p>
-    <w:p>
-      <w:pPr>
-        <w:rPr>
-          <w:rFonts w:ascii="Courier New" w:eastAsia="Times New Roman" w:hAnsi="Courier New" w:cs="Courier New"/>
-          <w:sz w:val="20"/>
-          <w:szCs w:val="20"/>
-          <w:lang w:eastAsia="en-IN"/>
-        </w:rPr>
-      </w:pPr>
-      <w:r>
-        <w:rPr>
-          <w:rFonts w:ascii="Courier New" w:eastAsia="Times New Roman" w:hAnsi="Courier New" w:cs="Courier New"/>
-          <w:sz w:val="20"/>
-          <w:szCs w:val="20"/>
-          <w:lang w:eastAsia="en-IN"/>
-        </w:rPr>
-        <w:t>SELECT</w:t>
-      </w:r>
-    </w:p>
-    <w:p>
-      <w:pPr>
-        <w:rPr>
-          <w:rFonts w:ascii="Courier New" w:eastAsia="Times New Roman" w:hAnsi="Courier New" w:cs="Courier New"/>
-          <w:sz w:val="20"/>
-          <w:szCs w:val="20"/>
-          <w:lang w:eastAsia="en-IN"/>
-        </w:rPr>
-      </w:pPr>
-      <w:r>
-        <w:rPr>
-          <w:rFonts w:ascii="Courier New" w:eastAsia="Times New Roman" w:hAnsi="Courier New" w:cs="Courier New"/>
-          <w:sz w:val="20"/>
-          <w:szCs w:val="20"/>
-          <w:lang w:eastAsia="en-IN"/>
-        </w:rPr>
-        <w:t xml:space="preserve">    v.product_id,</w:t>
-      </w:r>
-    </w:p>
-    <w:p>
-      <w:pPr>
-        <w:rPr>
-          <w:rFonts w:ascii="Courier New" w:eastAsia="Times New Roman" w:hAnsi="Courier New" w:cs="Courier New"/>
-          <w:sz w:val="20"/>
-          <w:szCs w:val="20"/>
-          <w:lang w:eastAsia="en-IN"/>
-        </w:rPr>
-      </w:pPr>
-      <w:r>
-        <w:rPr>
-          <w:rFonts w:ascii="Courier New" w:eastAsia="Times New Roman" w:hAnsi="Courier New" w:cs="Courier New"/>
-          <w:sz w:val="20"/>
-          <w:szCs w:val="20"/>
-          <w:lang w:eastAsia="en-IN"/>
-        </w:rPr>
-        <w:t xml:space="preserve">    'ORG_ece1b2f6-0e01-4d1b-ac11-3528e136cc1b',</w:t>
-      </w:r>
-    </w:p>
-    <w:p>
-      <w:pPr>
-        <w:rPr>
-          <w:rFonts w:ascii="Courier New" w:eastAsia="Times New Roman" w:hAnsi="Courier New" w:cs="Courier New"/>
-          <w:sz w:val="20"/>
-          <w:szCs w:val="20"/>
-          <w:lang w:eastAsia="en-IN"/>
-        </w:rPr>
-      </w:pPr>
-      <w:r>
-        <w:rPr>
-          <w:rFonts w:ascii="Courier New" w:eastAsia="Times New Roman" w:hAnsi="Courier New" w:cs="Courier New"/>
-          <w:sz w:val="20"/>
-          <w:szCs w:val="20"/>
-          <w:lang w:eastAsia="en-IN"/>
-        </w:rPr>
-        <w:t xml:space="preserve">    v.product_code,</w:t>
-      </w:r>
-    </w:p>
-    <w:p>
-      <w:pPr>
-        <w:rPr>
-          <w:rFonts w:ascii="Courier New" w:eastAsia="Times New Roman" w:hAnsi="Courier New" w:cs="Courier New"/>
-          <w:sz w:val="20"/>
-          <w:szCs w:val="20"/>
-          <w:lang w:eastAsia="en-IN"/>
-        </w:rPr>
-      </w:pPr>
-      <w:r>
-        <w:rPr>
-          <w:rFonts w:ascii="Courier New" w:eastAsia="Times New Roman" w:hAnsi="Courier New" w:cs="Courier New"/>
-          <w:sz w:val="20"/>
-          <w:szCs w:val="20"/>
-          <w:lang w:eastAsia="en-IN"/>
-        </w:rPr>
-        <w:t xml:space="preserve">    v.product_name,</w:t>
-      </w:r>
-    </w:p>
-    <w:p>
-      <w:pPr>
-        <w:rPr>
-          <w:rFonts w:ascii="Courier New" w:eastAsia="Times New Roman" w:hAnsi="Courier New" w:cs="Courier New"/>
-          <w:sz w:val="20"/>
-          <w:szCs w:val="20"/>
-          <w:lang w:eastAsia="en-IN"/>
-        </w:rPr>
-      </w:pPr>
-      <w:r>
-        <w:rPr>
-          <w:rFonts w:ascii="Courier New" w:eastAsia="Times New Roman" w:hAnsi="Courier New" w:cs="Courier New"/>
-          <w:sz w:val="20"/>
-          <w:szCs w:val="20"/>
-          <w:lang w:eastAsia="en-IN"/>
-        </w:rPr>
-        <w:t xml:space="preserve">    v.description,</w:t>
-      </w:r>
-    </w:p>
-    <w:p>
-      <w:pPr>
-        <w:rPr>
-          <w:rFonts w:ascii="Courier New" w:eastAsia="Times New Roman" w:hAnsi="Courier New" w:cs="Courier New"/>
-          <w:sz w:val="20"/>
-          <w:szCs w:val="20"/>
-          <w:lang w:eastAsia="en-IN"/>
-        </w:rPr>
-      </w:pPr>
-      <w:r>
-        <w:rPr>
-          <w:rFonts w:ascii="Courier New" w:eastAsia="Times New Roman" w:hAnsi="Courier New" w:cs="Courier New"/>
-          <w:sz w:val="20"/>
-          <w:szCs w:val="20"/>
-          <w:lang w:eastAsia="en-IN"/>
-        </w:rPr>
-        <w:t xml:space="preserve">    'entity-status-product-active',</w:t>
-      </w:r>
-    </w:p>
-    <w:p>
-      <w:pPr>
-        <w:rPr>
-          <w:rFonts w:ascii="Courier New" w:eastAsia="Times New Roman" w:hAnsi="Courier New" w:cs="Courier New"/>
-          <w:sz w:val="20"/>
-          <w:szCs w:val="20"/>
-          <w:lang w:eastAsia="en-IN"/>
-        </w:rPr>
-      </w:pPr>
-      <w:r>
-        <w:rPr>
-          <w:rFonts w:ascii="Courier New" w:eastAsia="Times New Roman" w:hAnsi="Courier New" w:cs="Courier New"/>
-          <w:sz w:val="20"/>
-          <w:szCs w:val="20"/>
-          <w:lang w:eastAsia="en-IN"/>
-        </w:rPr>
-        <w:t xml:space="preserve">    CURRENT_TIMESTAMP,</w:t>
-      </w:r>
-    </w:p>
-    <w:p>
-      <w:pPr>
-        <w:rPr>
-          <w:rFonts w:ascii="Courier New" w:eastAsia="Times New Roman" w:hAnsi="Courier New" w:cs="Courier New"/>
-          <w:sz w:val="20"/>
-          <w:szCs w:val="20"/>
-          <w:lang w:eastAsia="en-IN"/>
-        </w:rPr>
-      </w:pPr>
-      <w:r>
-        <w:rPr>
-          <w:rFonts w:ascii="Courier New" w:eastAsia="Times New Roman" w:hAnsi="Courier New" w:cs="Courier New"/>
-          <w:sz w:val="20"/>
-          <w:szCs w:val="20"/>
-          <w:lang w:eastAsia="en-IN"/>
-        </w:rPr>
-        <w:t xml:space="preserve">    o.updated_by,</w:t>
-      </w:r>
-    </w:p>
-    <w:p>
-      <w:pPr>
-        <w:rPr>
-          <w:rFonts w:ascii="Courier New" w:eastAsia="Times New Roman" w:hAnsi="Courier New" w:cs="Courier New"/>
-          <w:sz w:val="20"/>
-          <w:szCs w:val="20"/>
-          <w:lang w:eastAsia="en-IN"/>
-        </w:rPr>
-      </w:pPr>
-      <w:r>
-        <w:rPr>
-          <w:rFonts w:ascii="Courier New" w:eastAsia="Times New Roman" w:hAnsi="Courier New" w:cs="Courier New"/>
-          <w:sz w:val="20"/>
-          <w:szCs w:val="20"/>
-          <w:lang w:eastAsia="en-IN"/>
-        </w:rPr>
-        <w:t xml:space="preserve">    CURRENT_TIMESTAMP,</w:t>
-      </w:r>
-    </w:p>
-    <w:p>
-      <w:pPr>
-        <w:rPr>
-          <w:rFonts w:ascii="Courier New" w:eastAsia="Times New Roman" w:hAnsi="Courier New" w:cs="Courier New"/>
-          <w:sz w:val="20"/>
-          <w:szCs w:val="20"/>
-          <w:lang w:eastAsia="en-IN"/>
-        </w:rPr>
-      </w:pPr>
-      <w:r>
-        <w:rPr>
-          <w:rFonts w:ascii="Courier New" w:eastAsia="Times New Roman" w:hAnsi="Courier New" w:cs="Courier New"/>
-          <w:sz w:val="20"/>
-          <w:szCs w:val="20"/>
-          <w:lang w:eastAsia="en-IN"/>
-        </w:rPr>
-        <w:t xml:space="preserve">    o.updated_by,</w:t>
-      </w:r>
-    </w:p>
-    <w:p>
-      <w:pPr>
-        <w:rPr>
-          <w:rFonts w:ascii="Courier New" w:eastAsia="Times New Roman" w:hAnsi="Courier New" w:cs="Courier New"/>
-          <w:sz w:val="20"/>
-          <w:szCs w:val="20"/>
-          <w:lang w:eastAsia="en-IN"/>
-        </w:rPr>
-      </w:pPr>
-      <w:r>
-        <w:rPr>
-          <w:rFonts w:ascii="Courier New" w:eastAsia="Times New Roman" w:hAnsi="Courier New" w:cs="Courier New"/>
-          <w:sz w:val="20"/>
-          <w:szCs w:val="20"/>
-          <w:lang w:eastAsia="en-IN"/>
-        </w:rPr>
-        <w:t xml:space="preserve">    FALSE,</w:t>
-      </w:r>
-    </w:p>
-    <w:p>
-      <w:pPr>
-        <w:rPr>
-          <w:rFonts w:ascii="Courier New" w:eastAsia="Times New Roman" w:hAnsi="Courier New" w:cs="Courier New"/>
-          <w:sz w:val="20"/>
-          <w:szCs w:val="20"/>
-          <w:lang w:eastAsia="en-IN"/>
-        </w:rPr>
-      </w:pPr>
-      <w:r>
-        <w:rPr>
-          <w:rFonts w:ascii="Courier New" w:eastAsia="Times New Roman" w:hAnsi="Courier New" w:cs="Courier New"/>
-          <w:sz w:val="20"/>
-          <w:szCs w:val="20"/>
-          <w:lang w:eastAsia="en-IN"/>
-        </w:rPr>
-        <w:t xml:space="preserve">    1</w:t>
-      </w:r>
-    </w:p>
-    <w:p>
-      <w:pPr>
-        <w:rPr>
-          <w:rFonts w:ascii="Courier New" w:eastAsia="Times New Roman" w:hAnsi="Courier New" w:cs="Courier New"/>
-          <w:sz w:val="20"/>
-          <w:szCs w:val="20"/>
-          <w:lang w:eastAsia="en-IN"/>
-        </w:rPr>
-      </w:pPr>
-      <w:r>
-        <w:rPr>
-          <w:rFonts w:ascii="Courier New" w:eastAsia="Times New Roman" w:hAnsi="Courier New" w:cs="Courier New"/>
-          <w:sz w:val="20"/>
-          <w:szCs w:val="20"/>
-          <w:lang w:eastAsia="en-IN"/>
-        </w:rPr>
-        <w:t>FROM (</w:t>
-      </w:r>
-    </w:p>
-    <w:p>
-      <w:pPr>
-        <w:rPr>
-          <w:rFonts w:ascii="Courier New" w:eastAsia="Times New Roman" w:hAnsi="Courier New" w:cs="Courier New"/>
-          <w:sz w:val="20"/>
-          <w:szCs w:val="20"/>
-          <w:lang w:eastAsia="en-IN"/>
-        </w:rPr>
-      </w:pPr>
-      <w:r>
-        <w:rPr>
-          <w:rFonts w:ascii="Courier New" w:eastAsia="Times New Roman" w:hAnsi="Courier New" w:cs="Courier New"/>
-          <w:sz w:val="20"/>
-          <w:szCs w:val="20"/>
-          <w:lang w:eastAsia="en-IN"/>
-        </w:rPr>
-        <w:t xml:space="preserve">    VALUES</w:t>
+        <w:t xml:space="preserve">            'Freshly prepared filter coffee.'</w:t>
+      </w:r>
+    </w:p>
+    <w:p>
+      <w:pPr>
+        <w:rPr>
+          <w:rFonts w:ascii="Courier New" w:eastAsia="Times New Roman" w:hAnsi="Courier New" w:cs="Courier New"/>
+          <w:sz w:val="20"/>
+          <w:szCs w:val="20"/>
+          <w:lang w:eastAsia="en-IN"/>
+        </w:rPr>
+      </w:pPr>
+      <w:r>
+        <w:rPr>
+          <w:rFonts w:ascii="Courier New" w:eastAsia="Times New Roman" w:hAnsi="Courier New" w:cs="Courier New"/>
+          <w:sz w:val="20"/>
+          <w:szCs w:val="20"/>
+          <w:lang w:eastAsia="en-IN"/>
+        </w:rPr>
+        <w:t xml:space="preserve">        ),</w:t>
       </w:r>
     </w:p>
     <w:p>
@@ -1790,64 +1917,64 @@
           <w:szCs w:val="20"/>
           <w:lang w:eastAsia="en-IN"/>
         </w:rPr>
-        <w:t xml:space="preserve">            'prod-ece1-filter-coffee',</w:t>
-      </w:r>
-    </w:p>
-    <w:p>
-      <w:pPr>
-        <w:rPr>
-          <w:rFonts w:ascii="Courier New" w:eastAsia="Times New Roman" w:hAnsi="Courier New" w:cs="Courier New"/>
-          <w:sz w:val="20"/>
-          <w:szCs w:val="20"/>
-          <w:lang w:eastAsia="en-IN"/>
-        </w:rPr>
-      </w:pPr>
-      <w:r>
-        <w:rPr>
-          <w:rFonts w:ascii="Courier New" w:eastAsia="Times New Roman" w:hAnsi="Courier New" w:cs="Courier New"/>
-          <w:sz w:val="20"/>
-          <w:szCs w:val="20"/>
-          <w:lang w:eastAsia="en-IN"/>
-        </w:rPr>
-        <w:t xml:space="preserve">            'ECE1-FILTER-COFFEE',</w:t>
-      </w:r>
-    </w:p>
-    <w:p>
-      <w:pPr>
-        <w:rPr>
-          <w:rFonts w:ascii="Courier New" w:eastAsia="Times New Roman" w:hAnsi="Courier New" w:cs="Courier New"/>
-          <w:sz w:val="20"/>
-          <w:szCs w:val="20"/>
-          <w:lang w:eastAsia="en-IN"/>
-        </w:rPr>
-      </w:pPr>
-      <w:r>
-        <w:rPr>
-          <w:rFonts w:ascii="Courier New" w:eastAsia="Times New Roman" w:hAnsi="Courier New" w:cs="Courier New"/>
-          <w:sz w:val="20"/>
-          <w:szCs w:val="20"/>
-          <w:lang w:eastAsia="en-IN"/>
-        </w:rPr>
-        <w:t xml:space="preserve">            'Filter Coffee',</w:t>
-      </w:r>
-    </w:p>
-    <w:p>
-      <w:pPr>
-        <w:rPr>
-          <w:rFonts w:ascii="Courier New" w:eastAsia="Times New Roman" w:hAnsi="Courier New" w:cs="Courier New"/>
-          <w:sz w:val="20"/>
-          <w:szCs w:val="20"/>
-          <w:lang w:eastAsia="en-IN"/>
-        </w:rPr>
-      </w:pPr>
-      <w:r>
-        <w:rPr>
-          <w:rFonts w:ascii="Courier New" w:eastAsia="Times New Roman" w:hAnsi="Courier New" w:cs="Courier New"/>
-          <w:sz w:val="20"/>
-          <w:szCs w:val="20"/>
-          <w:lang w:eastAsia="en-IN"/>
-        </w:rPr>
-        <w:t xml:space="preserve">            'Freshly prepared filter coffee.'</w:t>
+        <w:t xml:space="preserve">            'prod-ece1-butter-croissant',</w:t>
+      </w:r>
+    </w:p>
+    <w:p>
+      <w:pPr>
+        <w:rPr>
+          <w:rFonts w:ascii="Courier New" w:eastAsia="Times New Roman" w:hAnsi="Courier New" w:cs="Courier New"/>
+          <w:sz w:val="20"/>
+          <w:szCs w:val="20"/>
+          <w:lang w:eastAsia="en-IN"/>
+        </w:rPr>
+      </w:pPr>
+      <w:r>
+        <w:rPr>
+          <w:rFonts w:ascii="Courier New" w:eastAsia="Times New Roman" w:hAnsi="Courier New" w:cs="Courier New"/>
+          <w:sz w:val="20"/>
+          <w:szCs w:val="20"/>
+          <w:lang w:eastAsia="en-IN"/>
+        </w:rPr>
+        <w:t xml:space="preserve">            'ECE1-BUTTER-CROISSANT',</w:t>
+      </w:r>
+    </w:p>
+    <w:p>
+      <w:pPr>
+        <w:rPr>
+          <w:rFonts w:ascii="Courier New" w:eastAsia="Times New Roman" w:hAnsi="Courier New" w:cs="Courier New"/>
+          <w:sz w:val="20"/>
+          <w:szCs w:val="20"/>
+          <w:lang w:eastAsia="en-IN"/>
+        </w:rPr>
+      </w:pPr>
+      <w:r>
+        <w:rPr>
+          <w:rFonts w:ascii="Courier New" w:eastAsia="Times New Roman" w:hAnsi="Courier New" w:cs="Courier New"/>
+          <w:sz w:val="20"/>
+          <w:szCs w:val="20"/>
+          <w:lang w:eastAsia="en-IN"/>
+        </w:rPr>
+        <w:t xml:space="preserve">            'Butter Croissant',</w:t>
+      </w:r>
+    </w:p>
+    <w:p>
+      <w:pPr>
+        <w:rPr>
+          <w:rFonts w:ascii="Courier New" w:eastAsia="Times New Roman" w:hAnsi="Courier New" w:cs="Courier New"/>
+          <w:sz w:val="20"/>
+          <w:szCs w:val="20"/>
+          <w:lang w:eastAsia="en-IN"/>
+        </w:rPr>
+      </w:pPr>
+      <w:r>
+        <w:rPr>
+          <w:rFonts w:ascii="Courier New" w:eastAsia="Times New Roman" w:hAnsi="Courier New" w:cs="Courier New"/>
+          <w:sz w:val="20"/>
+          <w:szCs w:val="20"/>
+          <w:lang w:eastAsia="en-IN"/>
+        </w:rPr>
+        <w:t xml:space="preserve">            'Fresh butter croissant.'</w:t>
       </w:r>
     </w:p>
     <w:p>
@@ -1885,615 +2012,501 @@
           <w:szCs w:val="20"/>
           <w:lang w:eastAsia="en-IN"/>
         </w:rPr>
+        <w:t xml:space="preserve">        (</w:t>
+      </w:r>
+    </w:p>
+    <w:p>
+      <w:pPr>
+        <w:rPr>
+          <w:rFonts w:ascii="Courier New" w:eastAsia="Times New Roman" w:hAnsi="Courier New" w:cs="Courier New"/>
+          <w:sz w:val="20"/>
+          <w:szCs w:val="20"/>
+          <w:lang w:eastAsia="en-IN"/>
+        </w:rPr>
+      </w:pPr>
+      <w:r>
+        <w:rPr>
+          <w:rFonts w:ascii="Courier New" w:eastAsia="Times New Roman" w:hAnsi="Courier New" w:cs="Courier New"/>
+          <w:sz w:val="20"/>
+          <w:szCs w:val="20"/>
+          <w:lang w:eastAsia="en-IN"/>
+        </w:rPr>
+        <w:t xml:space="preserve">            'prod-ece1-choc-cookie',</w:t>
+      </w:r>
+    </w:p>
+    <w:p>
+      <w:pPr>
+        <w:rPr>
+          <w:rFonts w:ascii="Courier New" w:eastAsia="Times New Roman" w:hAnsi="Courier New" w:cs="Courier New"/>
+          <w:sz w:val="20"/>
+          <w:szCs w:val="20"/>
+          <w:lang w:eastAsia="en-IN"/>
+        </w:rPr>
+      </w:pPr>
+      <w:r>
+        <w:rPr>
+          <w:rFonts w:ascii="Courier New" w:eastAsia="Times New Roman" w:hAnsi="Courier New" w:cs="Courier New"/>
+          <w:sz w:val="20"/>
+          <w:szCs w:val="20"/>
+          <w:lang w:eastAsia="en-IN"/>
+        </w:rPr>
+        <w:t xml:space="preserve">            'ECE1-CHOC-COOKIE',</w:t>
+      </w:r>
+    </w:p>
+    <w:p>
+      <w:pPr>
+        <w:rPr>
+          <w:rFonts w:ascii="Courier New" w:eastAsia="Times New Roman" w:hAnsi="Courier New" w:cs="Courier New"/>
+          <w:sz w:val="20"/>
+          <w:szCs w:val="20"/>
+          <w:lang w:eastAsia="en-IN"/>
+        </w:rPr>
+      </w:pPr>
+      <w:r>
+        <w:rPr>
+          <w:rFonts w:ascii="Courier New" w:eastAsia="Times New Roman" w:hAnsi="Courier New" w:cs="Courier New"/>
+          <w:sz w:val="20"/>
+          <w:szCs w:val="20"/>
+          <w:lang w:eastAsia="en-IN"/>
+        </w:rPr>
+        <w:t xml:space="preserve">            'Chocolate Cookie',</w:t>
+      </w:r>
+    </w:p>
+    <w:p>
+      <w:pPr>
+        <w:rPr>
+          <w:rFonts w:ascii="Courier New" w:eastAsia="Times New Roman" w:hAnsi="Courier New" w:cs="Courier New"/>
+          <w:sz w:val="20"/>
+          <w:szCs w:val="20"/>
+          <w:lang w:eastAsia="en-IN"/>
+        </w:rPr>
+      </w:pPr>
+      <w:r>
+        <w:rPr>
+          <w:rFonts w:ascii="Courier New" w:eastAsia="Times New Roman" w:hAnsi="Courier New" w:cs="Courier New"/>
+          <w:sz w:val="20"/>
+          <w:szCs w:val="20"/>
+          <w:lang w:eastAsia="en-IN"/>
+        </w:rPr>
+        <w:t xml:space="preserve">            'Chocolate cookie.'</w:t>
+      </w:r>
+    </w:p>
+    <w:p>
+      <w:pPr>
+        <w:rPr>
+          <w:rFonts w:ascii="Courier New" w:eastAsia="Times New Roman" w:hAnsi="Courier New" w:cs="Courier New"/>
+          <w:sz w:val="20"/>
+          <w:szCs w:val="20"/>
+          <w:lang w:eastAsia="en-IN"/>
+        </w:rPr>
+      </w:pPr>
+      <w:r>
+        <w:rPr>
+          <w:rFonts w:ascii="Courier New" w:eastAsia="Times New Roman" w:hAnsi="Courier New" w:cs="Courier New"/>
+          <w:sz w:val="20"/>
+          <w:szCs w:val="20"/>
+          <w:lang w:eastAsia="en-IN"/>
+        </w:rPr>
+        <w:t xml:space="preserve">        ),</w:t>
+      </w:r>
+    </w:p>
+    <w:p>
+      <w:pPr>
+        <w:rPr>
+          <w:rFonts w:ascii="Courier New" w:eastAsia="Times New Roman" w:hAnsi="Courier New" w:cs="Courier New"/>
+          <w:sz w:val="20"/>
+          <w:szCs w:val="20"/>
+          <w:lang w:eastAsia="en-IN"/>
+        </w:rPr>
+      </w:pPr>
+      <w:r>
+        <w:rPr>
+          <w:rFonts w:ascii="Courier New" w:eastAsia="Times New Roman" w:hAnsi="Courier New" w:cs="Courier New"/>
+          <w:sz w:val="20"/>
+          <w:szCs w:val="20"/>
+          <w:lang w:eastAsia="en-IN"/>
+        </w:rPr>
+        <w:t xml:space="preserve">        (</w:t>
+      </w:r>
+    </w:p>
+    <w:p>
+      <w:pPr>
+        <w:rPr>
+          <w:rFonts w:ascii="Courier New" w:eastAsia="Times New Roman" w:hAnsi="Courier New" w:cs="Courier New"/>
+          <w:sz w:val="20"/>
+          <w:szCs w:val="20"/>
+          <w:lang w:eastAsia="en-IN"/>
+        </w:rPr>
+      </w:pPr>
+      <w:r>
+        <w:rPr>
+          <w:rFonts w:ascii="Courier New" w:eastAsia="Times New Roman" w:hAnsi="Courier New" w:cs="Courier New"/>
+          <w:sz w:val="20"/>
+          <w:szCs w:val="20"/>
+          <w:lang w:eastAsia="en-IN"/>
+        </w:rPr>
+        <w:t xml:space="preserve">            'prod-ece1-caffe-latte',</w:t>
+      </w:r>
+    </w:p>
+    <w:p>
+      <w:pPr>
+        <w:rPr>
+          <w:rFonts w:ascii="Courier New" w:eastAsia="Times New Roman" w:hAnsi="Courier New" w:cs="Courier New"/>
+          <w:sz w:val="20"/>
+          <w:szCs w:val="20"/>
+          <w:lang w:eastAsia="en-IN"/>
+        </w:rPr>
+      </w:pPr>
+      <w:r>
+        <w:rPr>
+          <w:rFonts w:ascii="Courier New" w:eastAsia="Times New Roman" w:hAnsi="Courier New" w:cs="Courier New"/>
+          <w:sz w:val="20"/>
+          <w:szCs w:val="20"/>
+          <w:lang w:eastAsia="en-IN"/>
+        </w:rPr>
+        <w:t xml:space="preserve">            'ECE1-CAFFE-LATTE',</w:t>
+      </w:r>
+    </w:p>
+    <w:p>
+      <w:pPr>
+        <w:rPr>
+          <w:rFonts w:ascii="Courier New" w:eastAsia="Times New Roman" w:hAnsi="Courier New" w:cs="Courier New"/>
+          <w:sz w:val="20"/>
+          <w:szCs w:val="20"/>
+          <w:lang w:eastAsia="en-IN"/>
+        </w:rPr>
+      </w:pPr>
+      <w:r>
+        <w:rPr>
+          <w:rFonts w:ascii="Courier New" w:eastAsia="Times New Roman" w:hAnsi="Courier New" w:cs="Courier New"/>
+          <w:sz w:val="20"/>
+          <w:szCs w:val="20"/>
+          <w:lang w:eastAsia="en-IN"/>
+        </w:rPr>
+        <w:t xml:space="preserve">            'Caffe Latte',</w:t>
+      </w:r>
+    </w:p>
+    <w:p>
+      <w:pPr>
+        <w:rPr>
+          <w:rFonts w:ascii="Courier New" w:eastAsia="Times New Roman" w:hAnsi="Courier New" w:cs="Courier New"/>
+          <w:sz w:val="20"/>
+          <w:szCs w:val="20"/>
+          <w:lang w:eastAsia="en-IN"/>
+        </w:rPr>
+      </w:pPr>
+      <w:r>
+        <w:rPr>
+          <w:rFonts w:ascii="Courier New" w:eastAsia="Times New Roman" w:hAnsi="Courier New" w:cs="Courier New"/>
+          <w:sz w:val="20"/>
+          <w:szCs w:val="20"/>
+          <w:lang w:eastAsia="en-IN"/>
+        </w:rPr>
+        <w:t xml:space="preserve">            'Freshly prepared caffe latte.'</w:t>
+      </w:r>
+    </w:p>
+    <w:p>
+      <w:pPr>
+        <w:rPr>
+          <w:rFonts w:ascii="Courier New" w:eastAsia="Times New Roman" w:hAnsi="Courier New" w:cs="Courier New"/>
+          <w:sz w:val="20"/>
+          <w:szCs w:val="20"/>
+          <w:lang w:eastAsia="en-IN"/>
+        </w:rPr>
+      </w:pPr>
+      <w:r>
+        <w:rPr>
+          <w:rFonts w:ascii="Courier New" w:eastAsia="Times New Roman" w:hAnsi="Courier New" w:cs="Courier New"/>
+          <w:sz w:val="20"/>
+          <w:szCs w:val="20"/>
+          <w:lang w:eastAsia="en-IN"/>
+        </w:rPr>
+        <w:t xml:space="preserve">        ),</w:t>
+      </w:r>
+    </w:p>
+    <w:p>
+      <w:pPr>
+        <w:rPr>
+          <w:rFonts w:ascii="Courier New" w:eastAsia="Times New Roman" w:hAnsi="Courier New" w:cs="Courier New"/>
+          <w:sz w:val="20"/>
+          <w:szCs w:val="20"/>
+          <w:lang w:eastAsia="en-IN"/>
+        </w:rPr>
+      </w:pPr>
+      <w:r>
+        <w:rPr>
+          <w:rFonts w:ascii="Courier New" w:eastAsia="Times New Roman" w:hAnsi="Courier New" w:cs="Courier New"/>
+          <w:sz w:val="20"/>
+          <w:szCs w:val="20"/>
+          <w:lang w:eastAsia="en-IN"/>
+        </w:rPr>
+        <w:t xml:space="preserve">        (</w:t>
+      </w:r>
+    </w:p>
+    <w:p>
+      <w:pPr>
+        <w:rPr>
+          <w:rFonts w:ascii="Courier New" w:eastAsia="Times New Roman" w:hAnsi="Courier New" w:cs="Courier New"/>
+          <w:sz w:val="20"/>
+          <w:szCs w:val="20"/>
+          <w:lang w:eastAsia="en-IN"/>
+        </w:rPr>
+      </w:pPr>
+      <w:r>
+        <w:rPr>
+          <w:rFonts w:ascii="Courier New" w:eastAsia="Times New Roman" w:hAnsi="Courier New" w:cs="Courier New"/>
+          <w:sz w:val="20"/>
+          <w:szCs w:val="20"/>
+          <w:lang w:eastAsia="en-IN"/>
+        </w:rPr>
+        <w:t xml:space="preserve">            'prod-ece1-caffe-mocha',</w:t>
+      </w:r>
+    </w:p>
+    <w:p>
+      <w:pPr>
+        <w:rPr>
+          <w:rFonts w:ascii="Courier New" w:eastAsia="Times New Roman" w:hAnsi="Courier New" w:cs="Courier New"/>
+          <w:sz w:val="20"/>
+          <w:szCs w:val="20"/>
+          <w:lang w:eastAsia="en-IN"/>
+        </w:rPr>
+      </w:pPr>
+      <w:r>
+        <w:rPr>
+          <w:rFonts w:ascii="Courier New" w:eastAsia="Times New Roman" w:hAnsi="Courier New" w:cs="Courier New"/>
+          <w:sz w:val="20"/>
+          <w:szCs w:val="20"/>
+          <w:lang w:eastAsia="en-IN"/>
+        </w:rPr>
+        <w:t xml:space="preserve">            'ECE1-CAFFE-MOCHA',</w:t>
+      </w:r>
+    </w:p>
+    <w:p>
+      <w:pPr>
+        <w:rPr>
+          <w:rFonts w:ascii="Courier New" w:eastAsia="Times New Roman" w:hAnsi="Courier New" w:cs="Courier New"/>
+          <w:sz w:val="20"/>
+          <w:szCs w:val="20"/>
+          <w:lang w:eastAsia="en-IN"/>
+        </w:rPr>
+      </w:pPr>
+      <w:r>
+        <w:rPr>
+          <w:rFonts w:ascii="Courier New" w:eastAsia="Times New Roman" w:hAnsi="Courier New" w:cs="Courier New"/>
+          <w:sz w:val="20"/>
+          <w:szCs w:val="20"/>
+          <w:lang w:eastAsia="en-IN"/>
+        </w:rPr>
+        <w:t xml:space="preserve">            'Caffe Mocha',</w:t>
+      </w:r>
+    </w:p>
+    <w:p>
+      <w:pPr>
+        <w:rPr>
+          <w:rFonts w:ascii="Courier New" w:eastAsia="Times New Roman" w:hAnsi="Courier New" w:cs="Courier New"/>
+          <w:sz w:val="20"/>
+          <w:szCs w:val="20"/>
+          <w:lang w:eastAsia="en-IN"/>
+        </w:rPr>
+      </w:pPr>
+      <w:r>
+        <w:rPr>
+          <w:rFonts w:ascii="Courier New" w:eastAsia="Times New Roman" w:hAnsi="Courier New" w:cs="Courier New"/>
+          <w:sz w:val="20"/>
+          <w:szCs w:val="20"/>
+          <w:lang w:eastAsia="en-IN"/>
+        </w:rPr>
+        <w:t xml:space="preserve">            'Freshly prepared caffe mocha.'</w:t>
+      </w:r>
+    </w:p>
+    <w:p>
+      <w:pPr>
+        <w:rPr>
+          <w:rFonts w:ascii="Courier New" w:eastAsia="Times New Roman" w:hAnsi="Courier New" w:cs="Courier New"/>
+          <w:sz w:val="20"/>
+          <w:szCs w:val="20"/>
+          <w:lang w:eastAsia="en-IN"/>
+        </w:rPr>
+      </w:pPr>
+      <w:r>
+        <w:rPr>
+          <w:rFonts w:ascii="Courier New" w:eastAsia="Times New Roman" w:hAnsi="Courier New" w:cs="Courier New"/>
+          <w:sz w:val="20"/>
+          <w:szCs w:val="20"/>
+          <w:lang w:eastAsia="en-IN"/>
+        </w:rPr>
+        <w:t xml:space="preserve">        )</w:t>
+      </w:r>
+    </w:p>
+    <w:p>
+      <w:pPr>
+        <w:rPr>
+          <w:rFonts w:ascii="Courier New" w:eastAsia="Times New Roman" w:hAnsi="Courier New" w:cs="Courier New"/>
+          <w:sz w:val="20"/>
+          <w:szCs w:val="20"/>
+          <w:lang w:eastAsia="en-IN"/>
+        </w:rPr>
+      </w:pPr>
+      <w:r>
+        <w:rPr>
+          <w:rFonts w:ascii="Courier New" w:eastAsia="Times New Roman" w:hAnsi="Courier New" w:cs="Courier New"/>
+          <w:sz w:val="20"/>
+          <w:szCs w:val="20"/>
+          <w:lang w:eastAsia="en-IN"/>
+        </w:rPr>
+        <w:t>) AS v(product_id, product_code, product_name, description)</w:t>
+      </w:r>
+    </w:p>
+    <w:p>
+      <w:pPr>
+        <w:rPr>
+          <w:rFonts w:ascii="Courier New" w:eastAsia="Times New Roman" w:hAnsi="Courier New" w:cs="Courier New"/>
+          <w:sz w:val="20"/>
+          <w:szCs w:val="20"/>
+          <w:lang w:eastAsia="en-IN"/>
+        </w:rPr>
+      </w:pPr>
+      <w:r>
+        <w:rPr>
+          <w:rFonts w:ascii="Courier New" w:eastAsia="Times New Roman" w:hAnsi="Courier New" w:cs="Courier New"/>
+          <w:sz w:val="20"/>
+          <w:szCs w:val="20"/>
+          <w:lang w:eastAsia="en-IN"/>
+        </w:rPr>
+        <w:t>JOIN memginedev.organization o</w:t>
+      </w:r>
+    </w:p>
+    <w:p>
+      <w:pPr>
+        <w:rPr>
+          <w:rFonts w:ascii="Courier New" w:eastAsia="Times New Roman" w:hAnsi="Courier New" w:cs="Courier New"/>
+          <w:sz w:val="20"/>
+          <w:szCs w:val="20"/>
+          <w:lang w:eastAsia="en-IN"/>
+        </w:rPr>
+      </w:pPr>
+      <w:r>
+        <w:rPr>
+          <w:rFonts w:ascii="Courier New" w:eastAsia="Times New Roman" w:hAnsi="Courier New" w:cs="Courier New"/>
+          <w:sz w:val="20"/>
+          <w:szCs w:val="20"/>
+          <w:lang w:eastAsia="en-IN"/>
+        </w:rPr>
+        <w:t xml:space="preserve">  ON o.organization_id = 'ORG_ece1b2f6-0e01-4d1b-ac11-3528e136cc1b'</w:t>
+      </w:r>
+    </w:p>
+    <w:p>
+      <w:pPr>
+        <w:rPr>
+          <w:rFonts w:ascii="Courier New" w:eastAsia="Times New Roman" w:hAnsi="Courier New" w:cs="Courier New"/>
+          <w:sz w:val="20"/>
+          <w:szCs w:val="20"/>
+          <w:lang w:eastAsia="en-IN"/>
+        </w:rPr>
+      </w:pPr>
+      <w:r>
+        <w:rPr>
+          <w:rFonts w:ascii="Courier New" w:eastAsia="Times New Roman" w:hAnsi="Courier New" w:cs="Courier New"/>
+          <w:sz w:val="20"/>
+          <w:szCs w:val="20"/>
+          <w:lang w:eastAsia="en-IN"/>
+        </w:rPr>
+        <w:t>ON CONFLICT (product_id) DO UPDATE</w:t>
+      </w:r>
+    </w:p>
+    <w:p>
+      <w:pPr>
+        <w:rPr>
+          <w:rFonts w:ascii="Courier New" w:eastAsia="Times New Roman" w:hAnsi="Courier New" w:cs="Courier New"/>
+          <w:sz w:val="20"/>
+          <w:szCs w:val="20"/>
+          <w:lang w:eastAsia="en-IN"/>
+        </w:rPr>
+      </w:pPr>
+      <w:r>
+        <w:rPr>
+          <w:rFonts w:ascii="Courier New" w:eastAsia="Times New Roman" w:hAnsi="Courier New" w:cs="Courier New"/>
+          <w:sz w:val="20"/>
+          <w:szCs w:val="20"/>
+          <w:lang w:eastAsia="en-IN"/>
+        </w:rPr>
+        <w:t>SET</w:t>
+      </w:r>
+    </w:p>
+    <w:p>
+      <w:pPr>
+        <w:rPr>
+          <w:rFonts w:ascii="Courier New" w:eastAsia="Times New Roman" w:hAnsi="Courier New" w:cs="Courier New"/>
+          <w:sz w:val="20"/>
+          <w:szCs w:val="20"/>
+          <w:lang w:eastAsia="en-IN"/>
+        </w:rPr>
+      </w:pPr>
+      <w:r>
+        <w:rPr>
+          <w:rFonts w:ascii="Courier New" w:eastAsia="Times New Roman" w:hAnsi="Courier New" w:cs="Courier New"/>
+          <w:sz w:val="20"/>
+          <w:szCs w:val="20"/>
+          <w:lang w:eastAsia="en-IN"/>
+        </w:rPr>
+        <w:t xml:space="preserve">    organization_id = EXCLUDED.organization_id,</w:t>
+      </w:r>
+    </w:p>
+    <w:p>
+      <w:pPr>
+        <w:rPr>
+          <w:rFonts w:ascii="Courier New" w:eastAsia="Times New Roman" w:hAnsi="Courier New" w:cs="Courier New"/>
+          <w:sz w:val="20"/>
+          <w:szCs w:val="20"/>
+          <w:lang w:eastAsia="en-IN"/>
+        </w:rPr>
+      </w:pPr>
+      <w:r>
+        <w:rPr>
+          <w:rFonts w:ascii="Courier New" w:eastAsia="Times New Roman" w:hAnsi="Courier New" w:cs="Courier New"/>
+          <w:sz w:val="20"/>
+          <w:szCs w:val="20"/>
+          <w:lang w:eastAsia="en-IN"/>
+        </w:rPr>
+        <w:t xml:space="preserve">    product_code = EXCLUDED.product_code,</w:t>
+      </w:r>
+    </w:p>
+    <w:p>
+      <w:pPr>
+        <w:rPr>
+          <w:rFonts w:ascii="Courier New" w:eastAsia="Times New Roman" w:hAnsi="Courier New" w:cs="Courier New"/>
+          <w:sz w:val="20"/>
+          <w:szCs w:val="20"/>
+          <w:lang w:eastAsia="en-IN"/>
+        </w:rPr>
+      </w:pPr>
+      <w:r>
+        <w:rPr>
+          <w:rFonts w:ascii="Courier New" w:eastAsia="Times New Roman" w:hAnsi="Courier New" w:cs="Courier New"/>
+          <w:sz w:val="20"/>
+          <w:szCs w:val="20"/>
+          <w:lang w:eastAsia="en-IN"/>
+        </w:rPr>
+        <w:t xml:space="preserve">    product_name = EXCLUDED.product_name,</w:t>
+      </w:r>
+    </w:p>
+    <w:p>
+      <w:pPr>
+        <w:rPr>
+          <w:rFonts w:ascii="Courier New" w:eastAsia="Times New Roman" w:hAnsi="Courier New" w:cs="Courier New"/>
+          <w:sz w:val="20"/>
+          <w:szCs w:val="20"/>
+          <w:lang w:eastAsia="en-IN"/>
+        </w:rPr>
+      </w:pPr>
+      <w:r>
+        <w:rPr>
+          <w:rFonts w:ascii="Courier New" w:eastAsia="Times New Roman" w:hAnsi="Courier New" w:cs="Courier New"/>
+          <w:sz w:val="20"/>
+          <w:szCs w:val="20"/>
+          <w:lang w:eastAsia="en-IN"/>
+        </w:rPr>
         <w:lastRenderedPageBreak/>
-        <w:t xml:space="preserve">        (</w:t>
-      </w:r>
-    </w:p>
-    <w:p>
-      <w:pPr>
-        <w:rPr>
-          <w:rFonts w:ascii="Courier New" w:eastAsia="Times New Roman" w:hAnsi="Courier New" w:cs="Courier New"/>
-          <w:sz w:val="20"/>
-          <w:szCs w:val="20"/>
-          <w:lang w:eastAsia="en-IN"/>
-        </w:rPr>
-      </w:pPr>
-      <w:r>
-        <w:rPr>
-          <w:rFonts w:ascii="Courier New" w:eastAsia="Times New Roman" w:hAnsi="Courier New" w:cs="Courier New"/>
-          <w:sz w:val="20"/>
-          <w:szCs w:val="20"/>
-          <w:lang w:eastAsia="en-IN"/>
-        </w:rPr>
-        <w:t xml:space="preserve">            'prod-ece1-butter-croissant',</w:t>
-      </w:r>
-    </w:p>
-    <w:p>
-      <w:pPr>
-        <w:rPr>
-          <w:rFonts w:ascii="Courier New" w:eastAsia="Times New Roman" w:hAnsi="Courier New" w:cs="Courier New"/>
-          <w:sz w:val="20"/>
-          <w:szCs w:val="20"/>
-          <w:lang w:eastAsia="en-IN"/>
-        </w:rPr>
-      </w:pPr>
-      <w:r>
-        <w:rPr>
-          <w:rFonts w:ascii="Courier New" w:eastAsia="Times New Roman" w:hAnsi="Courier New" w:cs="Courier New"/>
-          <w:sz w:val="20"/>
-          <w:szCs w:val="20"/>
-          <w:lang w:eastAsia="en-IN"/>
-        </w:rPr>
-        <w:t xml:space="preserve">            'ECE1-BUTTER-CROISSANT',</w:t>
-      </w:r>
-    </w:p>
-    <w:p>
-      <w:pPr>
-        <w:rPr>
-          <w:rFonts w:ascii="Courier New" w:eastAsia="Times New Roman" w:hAnsi="Courier New" w:cs="Courier New"/>
-          <w:sz w:val="20"/>
-          <w:szCs w:val="20"/>
-          <w:lang w:eastAsia="en-IN"/>
-        </w:rPr>
-      </w:pPr>
-      <w:r>
-        <w:rPr>
-          <w:rFonts w:ascii="Courier New" w:eastAsia="Times New Roman" w:hAnsi="Courier New" w:cs="Courier New"/>
-          <w:sz w:val="20"/>
-          <w:szCs w:val="20"/>
-          <w:lang w:eastAsia="en-IN"/>
-        </w:rPr>
-        <w:t xml:space="preserve">            'Butter Croissant',</w:t>
-      </w:r>
-    </w:p>
-    <w:p>
-      <w:pPr>
-        <w:rPr>
-          <w:rFonts w:ascii="Courier New" w:eastAsia="Times New Roman" w:hAnsi="Courier New" w:cs="Courier New"/>
-          <w:sz w:val="20"/>
-          <w:szCs w:val="20"/>
-          <w:lang w:eastAsia="en-IN"/>
-        </w:rPr>
-      </w:pPr>
-      <w:r>
-        <w:rPr>
-          <w:rFonts w:ascii="Courier New" w:eastAsia="Times New Roman" w:hAnsi="Courier New" w:cs="Courier New"/>
-          <w:sz w:val="20"/>
-          <w:szCs w:val="20"/>
-          <w:lang w:eastAsia="en-IN"/>
-        </w:rPr>
-        <w:t xml:space="preserve">            'Fresh butter croissant.'</w:t>
-      </w:r>
-    </w:p>
-    <w:p>
-      <w:pPr>
-        <w:rPr>
-          <w:rFonts w:ascii="Courier New" w:eastAsia="Times New Roman" w:hAnsi="Courier New" w:cs="Courier New"/>
-          <w:sz w:val="20"/>
-          <w:szCs w:val="20"/>
-          <w:lang w:eastAsia="en-IN"/>
-        </w:rPr>
-      </w:pPr>
-      <w:r>
-        <w:rPr>
-          <w:rFonts w:ascii="Courier New" w:eastAsia="Times New Roman" w:hAnsi="Courier New" w:cs="Courier New"/>
-          <w:sz w:val="20"/>
-          <w:szCs w:val="20"/>
-          <w:lang w:eastAsia="en-IN"/>
-        </w:rPr>
-        <w:t xml:space="preserve">        ),</w:t>
-      </w:r>
-    </w:p>
-    <w:p>
-      <w:pPr>
-        <w:rPr>
-          <w:rFonts w:ascii="Courier New" w:eastAsia="Times New Roman" w:hAnsi="Courier New" w:cs="Courier New"/>
-          <w:sz w:val="20"/>
-          <w:szCs w:val="20"/>
-          <w:lang w:eastAsia="en-IN"/>
-        </w:rPr>
-      </w:pPr>
-      <w:r>
-        <w:rPr>
-          <w:rFonts w:ascii="Courier New" w:eastAsia="Times New Roman" w:hAnsi="Courier New" w:cs="Courier New"/>
-          <w:sz w:val="20"/>
-          <w:szCs w:val="20"/>
-          <w:lang w:eastAsia="en-IN"/>
-        </w:rPr>
-        <w:t xml:space="preserve">        (</w:t>
-      </w:r>
-    </w:p>
-    <w:p>
-      <w:pPr>
-        <w:rPr>
-          <w:rFonts w:ascii="Courier New" w:eastAsia="Times New Roman" w:hAnsi="Courier New" w:cs="Courier New"/>
-          <w:sz w:val="20"/>
-          <w:szCs w:val="20"/>
-          <w:lang w:eastAsia="en-IN"/>
-        </w:rPr>
-      </w:pPr>
-      <w:r>
-        <w:rPr>
-          <w:rFonts w:ascii="Courier New" w:eastAsia="Times New Roman" w:hAnsi="Courier New" w:cs="Courier New"/>
-          <w:sz w:val="20"/>
-          <w:szCs w:val="20"/>
-          <w:lang w:eastAsia="en-IN"/>
-        </w:rPr>
-        <w:t xml:space="preserve">            'prod-ece1-choc-cookie',</w:t>
-      </w:r>
-    </w:p>
-    <w:p>
-      <w:pPr>
-        <w:rPr>
-          <w:rFonts w:ascii="Courier New" w:eastAsia="Times New Roman" w:hAnsi="Courier New" w:cs="Courier New"/>
-          <w:sz w:val="20"/>
-          <w:szCs w:val="20"/>
-          <w:lang w:eastAsia="en-IN"/>
-        </w:rPr>
-      </w:pPr>
-      <w:r>
-        <w:rPr>
-          <w:rFonts w:ascii="Courier New" w:eastAsia="Times New Roman" w:hAnsi="Courier New" w:cs="Courier New"/>
-          <w:sz w:val="20"/>
-          <w:szCs w:val="20"/>
-          <w:lang w:eastAsia="en-IN"/>
-        </w:rPr>
-        <w:t xml:space="preserve">            'ECE1-CHOC-COOKIE',</w:t>
-      </w:r>
-    </w:p>
-    <w:p>
-      <w:pPr>
-        <w:rPr>
-          <w:rFonts w:ascii="Courier New" w:eastAsia="Times New Roman" w:hAnsi="Courier New" w:cs="Courier New"/>
-          <w:sz w:val="20"/>
-          <w:szCs w:val="20"/>
-          <w:lang w:eastAsia="en-IN"/>
-        </w:rPr>
-      </w:pPr>
-      <w:r>
-        <w:rPr>
-          <w:rFonts w:ascii="Courier New" w:eastAsia="Times New Roman" w:hAnsi="Courier New" w:cs="Courier New"/>
-          <w:sz w:val="20"/>
-          <w:szCs w:val="20"/>
-          <w:lang w:eastAsia="en-IN"/>
-        </w:rPr>
-        <w:t xml:space="preserve">            'Chocolate Cookie',</w:t>
-      </w:r>
-    </w:p>
-    <w:p>
-      <w:pPr>
-        <w:rPr>
-          <w:rFonts w:ascii="Courier New" w:eastAsia="Times New Roman" w:hAnsi="Courier New" w:cs="Courier New"/>
-          <w:sz w:val="20"/>
-          <w:szCs w:val="20"/>
-          <w:lang w:eastAsia="en-IN"/>
-        </w:rPr>
-      </w:pPr>
-      <w:r>
-        <w:rPr>
-          <w:rFonts w:ascii="Courier New" w:eastAsia="Times New Roman" w:hAnsi="Courier New" w:cs="Courier New"/>
-          <w:sz w:val="20"/>
-          <w:szCs w:val="20"/>
-          <w:lang w:eastAsia="en-IN"/>
-        </w:rPr>
-        <w:t xml:space="preserve">            'Chocolate cookie.'</w:t>
-      </w:r>
-    </w:p>
-    <w:p>
-      <w:pPr>
-        <w:rPr>
-          <w:rFonts w:ascii="Courier New" w:eastAsia="Times New Roman" w:hAnsi="Courier New" w:cs="Courier New"/>
-          <w:sz w:val="20"/>
-          <w:szCs w:val="20"/>
-          <w:lang w:eastAsia="en-IN"/>
-        </w:rPr>
-      </w:pPr>
-      <w:r>
-        <w:rPr>
-          <w:rFonts w:ascii="Courier New" w:eastAsia="Times New Roman" w:hAnsi="Courier New" w:cs="Courier New"/>
-          <w:sz w:val="20"/>
-          <w:szCs w:val="20"/>
-          <w:lang w:eastAsia="en-IN"/>
-        </w:rPr>
-        <w:t xml:space="preserve">        ),</w:t>
-      </w:r>
-    </w:p>
-    <w:p>
-      <w:pPr>
-        <w:rPr>
-          <w:rFonts w:ascii="Courier New" w:eastAsia="Times New Roman" w:hAnsi="Courier New" w:cs="Courier New"/>
-          <w:sz w:val="20"/>
-          <w:szCs w:val="20"/>
-          <w:lang w:eastAsia="en-IN"/>
-        </w:rPr>
-      </w:pPr>
-      <w:r>
-        <w:rPr>
-          <w:rFonts w:ascii="Courier New" w:eastAsia="Times New Roman" w:hAnsi="Courier New" w:cs="Courier New"/>
-          <w:sz w:val="20"/>
-          <w:szCs w:val="20"/>
-          <w:lang w:eastAsia="en-IN"/>
-        </w:rPr>
-        <w:t xml:space="preserve">        (</w:t>
-      </w:r>
-    </w:p>
-    <w:p>
-      <w:pPr>
-        <w:rPr>
-          <w:rFonts w:ascii="Courier New" w:eastAsia="Times New Roman" w:hAnsi="Courier New" w:cs="Courier New"/>
-          <w:sz w:val="20"/>
-          <w:szCs w:val="20"/>
-          <w:lang w:eastAsia="en-IN"/>
-        </w:rPr>
-      </w:pPr>
-      <w:r>
-        <w:rPr>
-          <w:rFonts w:ascii="Courier New" w:eastAsia="Times New Roman" w:hAnsi="Courier New" w:cs="Courier New"/>
-          <w:sz w:val="20"/>
-          <w:szCs w:val="20"/>
-          <w:lang w:eastAsia="en-IN"/>
-        </w:rPr>
-        <w:t xml:space="preserve">            'prod-ece1-caffe-latte',</w:t>
-      </w:r>
-    </w:p>
-    <w:p>
-      <w:pPr>
-        <w:rPr>
-          <w:rFonts w:ascii="Courier New" w:eastAsia="Times New Roman" w:hAnsi="Courier New" w:cs="Courier New"/>
-          <w:sz w:val="20"/>
-          <w:szCs w:val="20"/>
-          <w:lang w:eastAsia="en-IN"/>
-        </w:rPr>
-      </w:pPr>
-      <w:r>
-        <w:rPr>
-          <w:rFonts w:ascii="Courier New" w:eastAsia="Times New Roman" w:hAnsi="Courier New" w:cs="Courier New"/>
-          <w:sz w:val="20"/>
-          <w:szCs w:val="20"/>
-          <w:lang w:eastAsia="en-IN"/>
-        </w:rPr>
-        <w:t xml:space="preserve">            'ECE1-CAFFE-LATTE',</w:t>
-      </w:r>
-    </w:p>
-    <w:p>
-      <w:pPr>
-        <w:rPr>
-          <w:rFonts w:ascii="Courier New" w:eastAsia="Times New Roman" w:hAnsi="Courier New" w:cs="Courier New"/>
-          <w:sz w:val="20"/>
-          <w:szCs w:val="20"/>
-          <w:lang w:eastAsia="en-IN"/>
-        </w:rPr>
-      </w:pPr>
-      <w:r>
-        <w:rPr>
-          <w:rFonts w:ascii="Courier New" w:eastAsia="Times New Roman" w:hAnsi="Courier New" w:cs="Courier New"/>
-          <w:sz w:val="20"/>
-          <w:szCs w:val="20"/>
-          <w:lang w:eastAsia="en-IN"/>
-        </w:rPr>
-        <w:t xml:space="preserve">            'Caffe Latte',</w:t>
-      </w:r>
-    </w:p>
-    <w:p>
-      <w:pPr>
-        <w:rPr>
-          <w:rFonts w:ascii="Courier New" w:eastAsia="Times New Roman" w:hAnsi="Courier New" w:cs="Courier New"/>
-          <w:sz w:val="20"/>
-          <w:szCs w:val="20"/>
-          <w:lang w:eastAsia="en-IN"/>
-        </w:rPr>
-      </w:pPr>
-      <w:r>
-        <w:rPr>
-          <w:rFonts w:ascii="Courier New" w:eastAsia="Times New Roman" w:hAnsi="Courier New" w:cs="Courier New"/>
-          <w:sz w:val="20"/>
-          <w:szCs w:val="20"/>
-          <w:lang w:eastAsia="en-IN"/>
-        </w:rPr>
-        <w:t xml:space="preserve">            'Freshly prepared caffe latte.'</w:t>
-      </w:r>
-    </w:p>
-    <w:p>
-      <w:pPr>
-        <w:rPr>
-          <w:rFonts w:ascii="Courier New" w:eastAsia="Times New Roman" w:hAnsi="Courier New" w:cs="Courier New"/>
-          <w:sz w:val="20"/>
-          <w:szCs w:val="20"/>
-          <w:lang w:eastAsia="en-IN"/>
-        </w:rPr>
-      </w:pPr>
-      <w:r>
-        <w:rPr>
-          <w:rFonts w:ascii="Courier New" w:eastAsia="Times New Roman" w:hAnsi="Courier New" w:cs="Courier New"/>
-          <w:sz w:val="20"/>
-          <w:szCs w:val="20"/>
-          <w:lang w:eastAsia="en-IN"/>
-        </w:rPr>
-        <w:t xml:space="preserve">        ),</w:t>
-      </w:r>
-    </w:p>
-    <w:p>
-      <w:pPr>
-        <w:rPr>
-          <w:rFonts w:ascii="Courier New" w:eastAsia="Times New Roman" w:hAnsi="Courier New" w:cs="Courier New"/>
-          <w:sz w:val="20"/>
-          <w:szCs w:val="20"/>
-          <w:lang w:eastAsia="en-IN"/>
-        </w:rPr>
-      </w:pPr>
-      <w:r>
-        <w:rPr>
-          <w:rFonts w:ascii="Courier New" w:eastAsia="Times New Roman" w:hAnsi="Courier New" w:cs="Courier New"/>
-          <w:sz w:val="20"/>
-          <w:szCs w:val="20"/>
-          <w:lang w:eastAsia="en-IN"/>
-        </w:rPr>
-        <w:t xml:space="preserve">        (</w:t>
-      </w:r>
-    </w:p>
-    <w:p>
-      <w:pPr>
-        <w:rPr>
-          <w:rFonts w:ascii="Courier New" w:eastAsia="Times New Roman" w:hAnsi="Courier New" w:cs="Courier New"/>
-          <w:sz w:val="20"/>
-          <w:szCs w:val="20"/>
-          <w:lang w:eastAsia="en-IN"/>
-        </w:rPr>
-      </w:pPr>
-      <w:r>
-        <w:rPr>
-          <w:rFonts w:ascii="Courier New" w:eastAsia="Times New Roman" w:hAnsi="Courier New" w:cs="Courier New"/>
-          <w:sz w:val="20"/>
-          <w:szCs w:val="20"/>
-          <w:lang w:eastAsia="en-IN"/>
-        </w:rPr>
-        <w:t xml:space="preserve">            'prod-ece1-caffe-mocha',</w:t>
-      </w:r>
-    </w:p>
-    <w:p>
-      <w:pPr>
-        <w:rPr>
-          <w:rFonts w:ascii="Courier New" w:eastAsia="Times New Roman" w:hAnsi="Courier New" w:cs="Courier New"/>
-          <w:sz w:val="20"/>
-          <w:szCs w:val="20"/>
-          <w:lang w:eastAsia="en-IN"/>
-        </w:rPr>
-      </w:pPr>
-      <w:r>
-        <w:rPr>
-          <w:rFonts w:ascii="Courier New" w:eastAsia="Times New Roman" w:hAnsi="Courier New" w:cs="Courier New"/>
-          <w:sz w:val="20"/>
-          <w:szCs w:val="20"/>
-          <w:lang w:eastAsia="en-IN"/>
-        </w:rPr>
-        <w:t xml:space="preserve">            'ECE1-CAFFE-MOCHA',</w:t>
-      </w:r>
-    </w:p>
-    <w:p>
-      <w:pPr>
-        <w:rPr>
-          <w:rFonts w:ascii="Courier New" w:eastAsia="Times New Roman" w:hAnsi="Courier New" w:cs="Courier New"/>
-          <w:sz w:val="20"/>
-          <w:szCs w:val="20"/>
-          <w:lang w:eastAsia="en-IN"/>
-        </w:rPr>
-      </w:pPr>
-      <w:r>
-        <w:rPr>
-          <w:rFonts w:ascii="Courier New" w:eastAsia="Times New Roman" w:hAnsi="Courier New" w:cs="Courier New"/>
-          <w:sz w:val="20"/>
-          <w:szCs w:val="20"/>
-          <w:lang w:eastAsia="en-IN"/>
-        </w:rPr>
-        <w:t xml:space="preserve">            'Caffe Mocha',</w:t>
-      </w:r>
-    </w:p>
-    <w:p>
-      <w:pPr>
-        <w:rPr>
-          <w:rFonts w:ascii="Courier New" w:eastAsia="Times New Roman" w:hAnsi="Courier New" w:cs="Courier New"/>
-          <w:sz w:val="20"/>
-          <w:szCs w:val="20"/>
-          <w:lang w:eastAsia="en-IN"/>
-        </w:rPr>
-      </w:pPr>
-      <w:r>
-        <w:rPr>
-          <w:rFonts w:ascii="Courier New" w:eastAsia="Times New Roman" w:hAnsi="Courier New" w:cs="Courier New"/>
-          <w:sz w:val="20"/>
-          <w:szCs w:val="20"/>
-          <w:lang w:eastAsia="en-IN"/>
-        </w:rPr>
-        <w:t xml:space="preserve">            'Freshly prepared caffe mocha.'</w:t>
-      </w:r>
-    </w:p>
-    <w:p>
-      <w:pPr>
-        <w:rPr>
-          <w:rFonts w:ascii="Courier New" w:eastAsia="Times New Roman" w:hAnsi="Courier New" w:cs="Courier New"/>
-          <w:sz w:val="20"/>
-          <w:szCs w:val="20"/>
-          <w:lang w:eastAsia="en-IN"/>
-        </w:rPr>
-      </w:pPr>
-      <w:r>
-        <w:rPr>
-          <w:rFonts w:ascii="Courier New" w:eastAsia="Times New Roman" w:hAnsi="Courier New" w:cs="Courier New"/>
-          <w:sz w:val="20"/>
-          <w:szCs w:val="20"/>
-          <w:lang w:eastAsia="en-IN"/>
-        </w:rPr>
-        <w:t xml:space="preserve">        )</w:t>
-      </w:r>
-    </w:p>
-    <w:p>
-      <w:pPr>
-        <w:rPr>
-          <w:rFonts w:ascii="Courier New" w:eastAsia="Times New Roman" w:hAnsi="Courier New" w:cs="Courier New"/>
-          <w:sz w:val="20"/>
-          <w:szCs w:val="20"/>
-          <w:lang w:eastAsia="en-IN"/>
-        </w:rPr>
-      </w:pPr>
-      <w:r>
-        <w:rPr>
-          <w:rFonts w:ascii="Courier New" w:eastAsia="Times New Roman" w:hAnsi="Courier New" w:cs="Courier New"/>
-          <w:sz w:val="20"/>
-          <w:szCs w:val="20"/>
-          <w:lang w:eastAsia="en-IN"/>
-        </w:rPr>
-        <w:t>) AS v(product_id, product_code, product_name, description)</w:t>
-      </w:r>
-    </w:p>
-    <w:p>
-      <w:pPr>
-        <w:rPr>
-          <w:rFonts w:ascii="Courier New" w:eastAsia="Times New Roman" w:hAnsi="Courier New" w:cs="Courier New"/>
-          <w:sz w:val="20"/>
-          <w:szCs w:val="20"/>
-          <w:lang w:eastAsia="en-IN"/>
-        </w:rPr>
-      </w:pPr>
-      <w:r>
-        <w:rPr>
-          <w:rFonts w:ascii="Courier New" w:eastAsia="Times New Roman" w:hAnsi="Courier New" w:cs="Courier New"/>
-          <w:sz w:val="20"/>
-          <w:szCs w:val="20"/>
-          <w:lang w:eastAsia="en-IN"/>
-        </w:rPr>
-        <w:t>JOIN memginedev.organization o</w:t>
-      </w:r>
-    </w:p>
-    <w:p>
-      <w:pPr>
-        <w:rPr>
-          <w:rFonts w:ascii="Courier New" w:eastAsia="Times New Roman" w:hAnsi="Courier New" w:cs="Courier New"/>
-          <w:sz w:val="20"/>
-          <w:szCs w:val="20"/>
-          <w:lang w:eastAsia="en-IN"/>
-        </w:rPr>
-      </w:pPr>
-      <w:r>
-        <w:rPr>
-          <w:rFonts w:ascii="Courier New" w:eastAsia="Times New Roman" w:hAnsi="Courier New" w:cs="Courier New"/>
-          <w:sz w:val="20"/>
-          <w:szCs w:val="20"/>
-          <w:lang w:eastAsia="en-IN"/>
-        </w:rPr>
-        <w:t xml:space="preserve">  ON o.organization_id = 'ORG_ece1b2f6-0e01-4d1b-ac11-3528e136cc1b'</w:t>
-      </w:r>
-    </w:p>
-    <w:p>
-      <w:pPr>
-        <w:rPr>
-          <w:rFonts w:ascii="Courier New" w:eastAsia="Times New Roman" w:hAnsi="Courier New" w:cs="Courier New"/>
-          <w:sz w:val="20"/>
-          <w:szCs w:val="20"/>
-          <w:lang w:eastAsia="en-IN"/>
-        </w:rPr>
-      </w:pPr>
-      <w:r>
-        <w:rPr>
-          <w:rFonts w:ascii="Courier New" w:eastAsia="Times New Roman" w:hAnsi="Courier New" w:cs="Courier New"/>
-          <w:sz w:val="20"/>
-          <w:szCs w:val="20"/>
-          <w:lang w:eastAsia="en-IN"/>
-        </w:rPr>
-        <w:t>ON CONFLICT (product_id) DO UPDATE</w:t>
-      </w:r>
-    </w:p>
-    <w:p>
-      <w:pPr>
-        <w:rPr>
-          <w:rFonts w:ascii="Courier New" w:eastAsia="Times New Roman" w:hAnsi="Courier New" w:cs="Courier New"/>
-          <w:sz w:val="20"/>
-          <w:szCs w:val="20"/>
-          <w:lang w:eastAsia="en-IN"/>
-        </w:rPr>
-      </w:pPr>
-      <w:r>
-        <w:rPr>
-          <w:rFonts w:ascii="Courier New" w:eastAsia="Times New Roman" w:hAnsi="Courier New" w:cs="Courier New"/>
-          <w:sz w:val="20"/>
-          <w:szCs w:val="20"/>
-          <w:lang w:eastAsia="en-IN"/>
-        </w:rPr>
-        <w:t>SET</w:t>
-      </w:r>
-    </w:p>
-    <w:p>
-      <w:pPr>
-        <w:rPr>
-          <w:rFonts w:ascii="Courier New" w:eastAsia="Times New Roman" w:hAnsi="Courier New" w:cs="Courier New"/>
-          <w:sz w:val="20"/>
-          <w:szCs w:val="20"/>
-          <w:lang w:eastAsia="en-IN"/>
-        </w:rPr>
-      </w:pPr>
-      <w:r>
-        <w:rPr>
-          <w:rFonts w:ascii="Courier New" w:eastAsia="Times New Roman" w:hAnsi="Courier New" w:cs="Courier New"/>
-          <w:sz w:val="20"/>
-          <w:szCs w:val="20"/>
-          <w:lang w:eastAsia="en-IN"/>
-        </w:rPr>
-        <w:t xml:space="preserve">    organization_id = EXCLUDED.organization_id,</w:t>
-      </w:r>
-    </w:p>
-    <w:p>
-      <w:pPr>
-        <w:rPr>
-          <w:rFonts w:ascii="Courier New" w:eastAsia="Times New Roman" w:hAnsi="Courier New" w:cs="Courier New"/>
-          <w:sz w:val="20"/>
-          <w:szCs w:val="20"/>
-          <w:lang w:eastAsia="en-IN"/>
-        </w:rPr>
-      </w:pPr>
-      <w:r>
-        <w:rPr>
-          <w:rFonts w:ascii="Courier New" w:eastAsia="Times New Roman" w:hAnsi="Courier New" w:cs="Courier New"/>
-          <w:sz w:val="20"/>
-          <w:szCs w:val="20"/>
-          <w:lang w:eastAsia="en-IN"/>
-        </w:rPr>
-        <w:t xml:space="preserve">    product_code = EXCLUDED.product_code,</w:t>
-      </w:r>
-    </w:p>
-    <w:p>
-      <w:pPr>
-        <w:rPr>
-          <w:rFonts w:ascii="Courier New" w:eastAsia="Times New Roman" w:hAnsi="Courier New" w:cs="Courier New"/>
-          <w:sz w:val="20"/>
-          <w:szCs w:val="20"/>
-          <w:lang w:eastAsia="en-IN"/>
-        </w:rPr>
-      </w:pPr>
-      <w:r>
-        <w:rPr>
-          <w:rFonts w:ascii="Courier New" w:eastAsia="Times New Roman" w:hAnsi="Courier New" w:cs="Courier New"/>
-          <w:sz w:val="20"/>
-          <w:szCs w:val="20"/>
-          <w:lang w:eastAsia="en-IN"/>
-        </w:rPr>
-        <w:t xml:space="preserve">    product_name = EXCLUDED.product_name,</w:t>
-      </w:r>
-    </w:p>
-    <w:p>
-      <w:pPr>
-        <w:rPr>
-          <w:rFonts w:ascii="Courier New" w:eastAsia="Times New Roman" w:hAnsi="Courier New" w:cs="Courier New"/>
-          <w:sz w:val="20"/>
-          <w:szCs w:val="20"/>
-          <w:lang w:eastAsia="en-IN"/>
-        </w:rPr>
-      </w:pPr>
-      <w:r>
-        <w:rPr>
-          <w:rFonts w:ascii="Courier New" w:eastAsia="Times New Roman" w:hAnsi="Courier New" w:cs="Courier New"/>
-          <w:sz w:val="20"/>
-          <w:szCs w:val="20"/>
-          <w:lang w:eastAsia="en-IN"/>
-        </w:rPr>
         <w:t xml:space="preserve">    description = EXCLUDED.description,</w:t>
       </w:r>
     </w:p>
@@ -2532,7 +2545,6 @@
           <w:szCs w:val="20"/>
           <w:lang w:eastAsia="en-IN"/>
         </w:rPr>
-        <w:lastRenderedPageBreak/>
         <w:t xml:space="preserve">    updated_at = CURRENT_TIMESTAMP,</w:t>
       </w:r>
     </w:p>
@@ -3263,6 +3275,581 @@
         </w:rPr>
         <w:t>API Key : 41413bb9-379c-45a7-aad4-f9ab128b6e26=urn:aid:c8a26e96-9791-4ff8-bd77-36955012d5e0</w:t>
       </w:r>
+    </w:p>
+    <w:p>
+      <w:pPr>
+        <w:pStyle w:val="ListParagraph"/>
+        <w:rPr>
+          <w:rFonts w:ascii="Courier New" w:eastAsia="Times New Roman" w:hAnsi="Courier New" w:cs="Courier New"/>
+          <w:sz w:val="20"/>
+          <w:szCs w:val="20"/>
+          <w:lang w:eastAsia="en-IN"/>
+        </w:rPr>
+      </w:pPr>
+    </w:p>
+    <w:p>
+      <w:pPr>
+        <w:pStyle w:val="ListParagraph"/>
+        <w:rPr>
+          <w:rFonts w:ascii="Courier New" w:eastAsia="Times New Roman" w:hAnsi="Courier New" w:cs="Courier New"/>
+          <w:sz w:val="20"/>
+          <w:szCs w:val="20"/>
+          <w:lang w:eastAsia="en-IN"/>
+        </w:rPr>
+      </w:pPr>
+    </w:p>
+    <w:p>
+      <w:pPr>
+        <w:pStyle w:val="ListParagraph"/>
+        <w:rPr>
+          <w:rFonts w:ascii="Courier New" w:eastAsia="Times New Roman" w:hAnsi="Courier New" w:cs="Courier New"/>
+          <w:sz w:val="20"/>
+          <w:szCs w:val="20"/>
+          <w:lang w:eastAsia="en-IN"/>
+        </w:rPr>
+      </w:pPr>
+    </w:p>
+    <w:p>
+      <w:pPr>
+        <w:pStyle w:val="ListParagraph"/>
+        <w:rPr>
+          <w:rFonts w:ascii="Courier New" w:eastAsia="Times New Roman" w:hAnsi="Courier New" w:cs="Courier New"/>
+          <w:sz w:val="20"/>
+          <w:szCs w:val="20"/>
+          <w:lang w:eastAsia="en-IN"/>
+        </w:rPr>
+      </w:pPr>
+    </w:p>
+    <w:p>
+      <w:pPr>
+        <w:pStyle w:val="ListParagraph"/>
+        <w:rPr>
+          <w:rFonts w:ascii="Courier New" w:eastAsia="Times New Roman" w:hAnsi="Courier New" w:cs="Courier New"/>
+          <w:sz w:val="20"/>
+          <w:szCs w:val="20"/>
+          <w:lang w:eastAsia="en-IN"/>
+        </w:rPr>
+      </w:pPr>
+    </w:p>
+    <w:p>
+      <w:pPr>
+        <w:pStyle w:val="ListParagraph"/>
+        <w:rPr>
+          <w:rFonts w:ascii="Courier New" w:eastAsia="Times New Roman" w:hAnsi="Courier New" w:cs="Courier New"/>
+          <w:sz w:val="20"/>
+          <w:szCs w:val="20"/>
+          <w:lang w:eastAsia="en-IN"/>
+        </w:rPr>
+      </w:pPr>
+    </w:p>
+    <w:p>
+      <w:pPr>
+        <w:pStyle w:val="ListParagraph"/>
+        <w:rPr>
+          <w:rFonts w:ascii="Courier New" w:eastAsia="Times New Roman" w:hAnsi="Courier New" w:cs="Courier New"/>
+          <w:sz w:val="20"/>
+          <w:szCs w:val="20"/>
+          <w:lang w:eastAsia="en-IN"/>
+        </w:rPr>
+      </w:pPr>
+    </w:p>
+    <w:p>
+      <w:pPr>
+        <w:pStyle w:val="ListParagraph"/>
+        <w:rPr>
+          <w:rFonts w:ascii="Courier New" w:eastAsia="Times New Roman" w:hAnsi="Courier New" w:cs="Courier New"/>
+          <w:sz w:val="20"/>
+          <w:szCs w:val="20"/>
+          <w:lang w:eastAsia="en-IN"/>
+        </w:rPr>
+      </w:pPr>
+    </w:p>
+    <w:p>
+      <w:pPr>
+        <w:pStyle w:val="ListParagraph"/>
+        <w:rPr>
+          <w:rFonts w:ascii="Courier New" w:eastAsia="Times New Roman" w:hAnsi="Courier New" w:cs="Courier New"/>
+          <w:sz w:val="20"/>
+          <w:szCs w:val="20"/>
+          <w:lang w:eastAsia="en-IN"/>
+        </w:rPr>
+      </w:pPr>
+    </w:p>
+    <w:p>
+      <w:pPr>
+        <w:pStyle w:val="ListParagraph"/>
+        <w:rPr>
+          <w:rFonts w:ascii="Courier New" w:eastAsia="Times New Roman" w:hAnsi="Courier New" w:cs="Courier New"/>
+          <w:sz w:val="20"/>
+          <w:szCs w:val="20"/>
+          <w:lang w:eastAsia="en-IN"/>
+        </w:rPr>
+      </w:pPr>
+    </w:p>
+    <w:p>
+      <w:pPr>
+        <w:pStyle w:val="ListParagraph"/>
+        <w:rPr>
+          <w:rFonts w:ascii="Courier New" w:eastAsia="Times New Roman" w:hAnsi="Courier New" w:cs="Courier New"/>
+          <w:sz w:val="20"/>
+          <w:szCs w:val="20"/>
+          <w:lang w:eastAsia="en-IN"/>
+        </w:rPr>
+      </w:pPr>
+      <w:r>
+        <w:rPr>
+          <w:rFonts w:ascii="Courier New" w:eastAsia="Times New Roman" w:hAnsi="Courier New" w:cs="Courier New"/>
+          <w:sz w:val="20"/>
+          <w:szCs w:val="20"/>
+          <w:lang w:eastAsia="en-IN"/>
+        </w:rPr>
+        <w:lastRenderedPageBreak/>
+        <w:t>IOS –</w:t>
+      </w:r>
+    </w:p>
+    <w:p>
+      <w:pPr>
+        <w:pStyle w:val="ListParagraph"/>
+        <w:rPr>
+          <w:rFonts w:ascii="Courier New" w:eastAsia="Times New Roman" w:hAnsi="Courier New" w:cs="Courier New"/>
+          <w:sz w:val="20"/>
+          <w:szCs w:val="20"/>
+          <w:lang w:eastAsia="en-IN"/>
+        </w:rPr>
+      </w:pPr>
+    </w:p>
+    <w:p>
+      <w:pPr>
+        <w:pStyle w:val="ListParagraph"/>
+        <w:rPr>
+          <w:rFonts w:ascii="Courier New" w:eastAsia="Times New Roman" w:hAnsi="Courier New" w:cs="Courier New"/>
+          <w:sz w:val="20"/>
+          <w:szCs w:val="20"/>
+          <w:lang w:eastAsia="en-IN"/>
+        </w:rPr>
+      </w:pPr>
+      <w:r>
+        <w:rPr>
+          <w:rFonts w:ascii="Courier New" w:eastAsia="Times New Roman" w:hAnsi="Courier New" w:cs="Courier New"/>
+          <w:sz w:val="20"/>
+          <w:szCs w:val="20"/>
+          <w:lang w:eastAsia="en-IN"/>
+        </w:rPr>
+        <w:t>Platform</w:t>
+      </w:r>
+    </w:p>
+    <w:p>
+      <w:pPr>
+        <w:pStyle w:val="ListParagraph"/>
+        <w:rPr>
+          <w:rFonts w:ascii="Courier New" w:eastAsia="Times New Roman" w:hAnsi="Courier New" w:cs="Courier New"/>
+          <w:sz w:val="20"/>
+          <w:szCs w:val="20"/>
+          <w:lang w:eastAsia="en-IN"/>
+        </w:rPr>
+      </w:pPr>
+      <w:r>
+        <w:rPr>
+          <w:rFonts w:ascii="Courier New" w:eastAsia="Times New Roman" w:hAnsi="Courier New" w:cs="Courier New"/>
+          <w:sz w:val="20"/>
+          <w:szCs w:val="20"/>
+          <w:lang w:eastAsia="en-IN"/>
+        </w:rPr>
+        <w:t>iOS, iPadOS, macOS, tvOS, watchOS, visionOS</w:t>
+      </w:r>
+    </w:p>
+    <w:p>
+      <w:pPr>
+        <w:pStyle w:val="ListParagraph"/>
+        <w:rPr>
+          <w:rFonts w:ascii="Courier New" w:eastAsia="Times New Roman" w:hAnsi="Courier New" w:cs="Courier New"/>
+          <w:sz w:val="20"/>
+          <w:szCs w:val="20"/>
+          <w:lang w:eastAsia="en-IN"/>
+        </w:rPr>
+      </w:pPr>
+      <w:r>
+        <w:rPr>
+          <w:rFonts w:ascii="Courier New" w:eastAsia="Times New Roman" w:hAnsi="Courier New" w:cs="Courier New"/>
+          <w:sz w:val="20"/>
+          <w:szCs w:val="20"/>
+          <w:lang w:eastAsia="en-IN"/>
+        </w:rPr>
+        <w:t>App ID PrefixW4A6DW56WG (Team ID)</w:t>
+      </w:r>
+    </w:p>
+    <w:p>
+      <w:pPr>
+        <w:pStyle w:val="ListParagraph"/>
+        <w:rPr>
+          <w:rFonts w:ascii="Courier New" w:eastAsia="Times New Roman" w:hAnsi="Courier New" w:cs="Courier New"/>
+          <w:sz w:val="20"/>
+          <w:szCs w:val="20"/>
+          <w:lang w:eastAsia="en-IN"/>
+        </w:rPr>
+      </w:pPr>
+      <w:r>
+        <w:rPr>
+          <w:rFonts w:ascii="Courier New" w:eastAsia="Times New Roman" w:hAnsi="Courier New" w:cs="Courier New"/>
+          <w:sz w:val="20"/>
+          <w:szCs w:val="20"/>
+          <w:lang w:eastAsia="en-IN"/>
+        </w:rPr>
+        <w:t>DescriptionMemgine</w:t>
+      </w:r>
+    </w:p>
+    <w:p>
+      <w:pPr>
+        <w:pStyle w:val="ListParagraph"/>
+        <w:rPr>
+          <w:rFonts w:ascii="Courier New" w:eastAsia="Times New Roman" w:hAnsi="Courier New" w:cs="Courier New"/>
+          <w:sz w:val="20"/>
+          <w:szCs w:val="20"/>
+          <w:lang w:eastAsia="en-IN"/>
+        </w:rPr>
+      </w:pPr>
+      <w:r>
+        <w:rPr>
+          <w:rFonts w:ascii="Courier New" w:eastAsia="Times New Roman" w:hAnsi="Courier New" w:cs="Courier New"/>
+          <w:sz w:val="20"/>
+          <w:szCs w:val="20"/>
+          <w:lang w:eastAsia="en-IN"/>
+        </w:rPr>
+        <w:t>Bundle ID</w:t>
+      </w:r>
+    </w:p>
+    <w:p>
+      <w:pPr>
+        <w:pStyle w:val="ListParagraph"/>
+        <w:rPr>
+          <w:rFonts w:ascii="Courier New" w:eastAsia="Times New Roman" w:hAnsi="Courier New" w:cs="Courier New"/>
+          <w:sz w:val="20"/>
+          <w:szCs w:val="20"/>
+          <w:lang w:eastAsia="en-IN"/>
+        </w:rPr>
+      </w:pPr>
+      <w:r>
+        <w:rPr>
+          <w:rFonts w:ascii="Courier New" w:eastAsia="Times New Roman" w:hAnsi="Courier New" w:cs="Courier New"/>
+          <w:sz w:val="20"/>
+          <w:szCs w:val="20"/>
+          <w:lang w:eastAsia="en-IN"/>
+        </w:rPr>
+        <w:t>com.mynikatech.memgine (explicit)</w:t>
+      </w:r>
+    </w:p>
+    <w:p>
+      <w:pPr>
+        <w:pStyle w:val="ListParagraph"/>
+        <w:rPr>
+          <w:rFonts w:ascii="Courier New" w:eastAsia="Times New Roman" w:hAnsi="Courier New" w:cs="Courier New"/>
+          <w:sz w:val="20"/>
+          <w:szCs w:val="20"/>
+          <w:lang w:eastAsia="en-IN"/>
+        </w:rPr>
+      </w:pPr>
+    </w:p>
+    <w:p>
+      <w:pPr>
+        <w:pStyle w:val="ListParagraph"/>
+        <w:rPr>
+          <w:rFonts w:ascii="Courier New" w:eastAsia="Times New Roman" w:hAnsi="Courier New" w:cs="Courier New"/>
+          <w:sz w:val="20"/>
+          <w:szCs w:val="20"/>
+          <w:lang w:eastAsia="en-IN"/>
+        </w:rPr>
+      </w:pPr>
+      <w:r>
+        <w:rPr>
+          <w:rFonts w:ascii="Courier New" w:eastAsia="Times New Roman" w:hAnsi="Courier New" w:cs="Courier New"/>
+          <w:sz w:val="20"/>
+          <w:szCs w:val="20"/>
+          <w:lang w:eastAsia="en-IN"/>
+        </w:rPr>
+        <w:t>Using Api Key ID: L5X33BT555 ([Expo] EAS Submit rzQWWcDJWv)</w:t>
+      </w:r>
+    </w:p>
+    <w:p>
+      <w:pPr>
+        <w:pStyle w:val="ListParagraph"/>
+        <w:rPr>
+          <w:rFonts w:ascii="Courier New" w:eastAsia="Times New Roman" w:hAnsi="Courier New" w:cs="Courier New"/>
+          <w:sz w:val="20"/>
+          <w:szCs w:val="20"/>
+          <w:lang w:eastAsia="en-IN"/>
+        </w:rPr>
+      </w:pPr>
+    </w:p>
+    <w:p>
+      <w:pPr>
+        <w:pStyle w:val="ListParagraph"/>
+        <w:rPr>
+          <w:rFonts w:ascii="Courier New" w:eastAsia="Times New Roman" w:hAnsi="Courier New" w:cs="Courier New"/>
+          <w:sz w:val="20"/>
+          <w:szCs w:val="20"/>
+          <w:lang w:eastAsia="en-IN"/>
+        </w:rPr>
+      </w:pPr>
+      <w:r>
+        <w:rPr>
+          <w:rFonts w:ascii="Courier New" w:eastAsia="Times New Roman" w:hAnsi="Courier New" w:cs="Courier New"/>
+          <w:sz w:val="20"/>
+          <w:szCs w:val="20"/>
+          <w:lang w:eastAsia="en-IN"/>
+        </w:rPr>
+        <w:t>ASC App ID:                 6818282654</w:t>
+      </w:r>
+    </w:p>
+    <w:p>
+      <w:pPr>
+        <w:pStyle w:val="ListParagraph"/>
+        <w:rPr>
+          <w:rFonts w:ascii="Courier New" w:eastAsia="Times New Roman" w:hAnsi="Courier New" w:cs="Courier New"/>
+          <w:sz w:val="20"/>
+          <w:szCs w:val="20"/>
+          <w:lang w:eastAsia="en-IN"/>
+        </w:rPr>
+      </w:pPr>
+      <w:r>
+        <w:rPr>
+          <w:rFonts w:ascii="Courier New" w:eastAsia="Times New Roman" w:hAnsi="Courier New" w:cs="Courier New"/>
+          <w:sz w:val="20"/>
+          <w:szCs w:val="20"/>
+          <w:lang w:eastAsia="en-IN"/>
+        </w:rPr>
+        <w:t>Project ID:                 dc8ea0cd-8020-48d0-b998-1858412a880e</w:t>
+      </w:r>
+    </w:p>
+    <w:p>
+      <w:pPr>
+        <w:pStyle w:val="ListParagraph"/>
+        <w:rPr>
+          <w:rFonts w:ascii="Courier New" w:eastAsia="Times New Roman" w:hAnsi="Courier New" w:cs="Courier New"/>
+          <w:sz w:val="20"/>
+          <w:szCs w:val="20"/>
+          <w:lang w:eastAsia="en-IN"/>
+        </w:rPr>
+      </w:pPr>
+      <w:r>
+        <w:rPr>
+          <w:rFonts w:ascii="Courier New" w:eastAsia="Times New Roman" w:hAnsi="Courier New" w:cs="Courier New"/>
+          <w:sz w:val="20"/>
+          <w:szCs w:val="20"/>
+          <w:lang w:eastAsia="en-IN"/>
+        </w:rPr>
+        <w:t xml:space="preserve">App Store Connect API Key:  </w:t>
+      </w:r>
+    </w:p>
+    <w:p>
+      <w:pPr>
+        <w:pStyle w:val="ListParagraph"/>
+        <w:rPr>
+          <w:rFonts w:ascii="Courier New" w:eastAsia="Times New Roman" w:hAnsi="Courier New" w:cs="Courier New"/>
+          <w:sz w:val="20"/>
+          <w:szCs w:val="20"/>
+          <w:lang w:eastAsia="en-IN"/>
+        </w:rPr>
+      </w:pPr>
+      <w:r>
+        <w:rPr>
+          <w:rFonts w:ascii="Courier New" w:eastAsia="Times New Roman" w:hAnsi="Courier New" w:cs="Courier New"/>
+          <w:sz w:val="20"/>
+          <w:szCs w:val="20"/>
+          <w:lang w:eastAsia="en-IN"/>
+        </w:rPr>
+        <w:t xml:space="preserve">    Key Name  :  [Expo] EAS Submit rzQWWcDJWv</w:t>
+      </w:r>
+    </w:p>
+    <w:p>
+      <w:pPr>
+        <w:pStyle w:val="ListParagraph"/>
+        <w:rPr>
+          <w:rFonts w:ascii="Courier New" w:eastAsia="Times New Roman" w:hAnsi="Courier New" w:cs="Courier New"/>
+          <w:sz w:val="20"/>
+          <w:szCs w:val="20"/>
+          <w:lang w:eastAsia="en-IN"/>
+        </w:rPr>
+      </w:pPr>
+      <w:r>
+        <w:rPr>
+          <w:rFonts w:ascii="Courier New" w:eastAsia="Times New Roman" w:hAnsi="Courier New" w:cs="Courier New"/>
+          <w:sz w:val="20"/>
+          <w:szCs w:val="20"/>
+          <w:lang w:eastAsia="en-IN"/>
+        </w:rPr>
+        <w:t xml:space="preserve">    Key ID    :  L5X33BT555</w:t>
+      </w:r>
+    </w:p>
+    <w:p>
+      <w:pPr>
+        <w:pStyle w:val="ListParagraph"/>
+        <w:rPr>
+          <w:rFonts w:ascii="Courier New" w:eastAsia="Times New Roman" w:hAnsi="Courier New" w:cs="Courier New"/>
+          <w:sz w:val="20"/>
+          <w:szCs w:val="20"/>
+          <w:lang w:eastAsia="en-IN"/>
+        </w:rPr>
+      </w:pPr>
+      <w:r>
+        <w:rPr>
+          <w:rFonts w:ascii="Courier New" w:eastAsia="Times New Roman" w:hAnsi="Courier New" w:cs="Courier New"/>
+          <w:sz w:val="20"/>
+          <w:szCs w:val="20"/>
+          <w:lang w:eastAsia="en-IN"/>
+        </w:rPr>
+        <w:t xml:space="preserve">    Key Source:  EAS servers</w:t>
+      </w:r>
+    </w:p>
+    <w:p>
+      <w:pPr>
+        <w:pStyle w:val="ListParagraph"/>
+        <w:rPr>
+          <w:rFonts w:ascii="Courier New" w:eastAsia="Times New Roman" w:hAnsi="Courier New" w:cs="Courier New"/>
+          <w:sz w:val="20"/>
+          <w:szCs w:val="20"/>
+          <w:lang w:eastAsia="en-IN"/>
+        </w:rPr>
+      </w:pPr>
+      <w:r>
+        <w:rPr>
+          <w:rFonts w:ascii="Courier New" w:eastAsia="Times New Roman" w:hAnsi="Courier New" w:cs="Courier New"/>
+          <w:sz w:val="20"/>
+          <w:szCs w:val="20"/>
+          <w:lang w:eastAsia="en-IN"/>
+        </w:rPr>
+        <w:t xml:space="preserve">Build:                      </w:t>
+      </w:r>
+    </w:p>
+    <w:p>
+      <w:pPr>
+        <w:pStyle w:val="ListParagraph"/>
+        <w:rPr>
+          <w:rFonts w:ascii="Courier New" w:eastAsia="Times New Roman" w:hAnsi="Courier New" w:cs="Courier New"/>
+          <w:sz w:val="20"/>
+          <w:szCs w:val="20"/>
+          <w:lang w:eastAsia="en-IN"/>
+        </w:rPr>
+      </w:pPr>
+      <w:r>
+        <w:rPr>
+          <w:rFonts w:ascii="Courier New" w:eastAsia="Times New Roman" w:hAnsi="Courier New" w:cs="Courier New"/>
+          <w:sz w:val="20"/>
+          <w:szCs w:val="20"/>
+          <w:lang w:eastAsia="en-IN"/>
+        </w:rPr>
+        <w:t xml:space="preserve">    Build ID    :  313385b3-1558-46f2-8836-1388308d5d85</w:t>
+      </w:r>
+    </w:p>
+    <w:p>
+      <w:pPr>
+        <w:pStyle w:val="ListParagraph"/>
+        <w:rPr>
+          <w:rFonts w:ascii="Courier New" w:eastAsia="Times New Roman" w:hAnsi="Courier New" w:cs="Courier New"/>
+          <w:sz w:val="20"/>
+          <w:szCs w:val="20"/>
+          <w:lang w:eastAsia="en-IN"/>
+        </w:rPr>
+      </w:pPr>
+      <w:r>
+        <w:rPr>
+          <w:rFonts w:ascii="Courier New" w:eastAsia="Times New Roman" w:hAnsi="Courier New" w:cs="Courier New"/>
+          <w:sz w:val="20"/>
+          <w:szCs w:val="20"/>
+          <w:lang w:eastAsia="en-IN"/>
+        </w:rPr>
+        <w:t xml:space="preserve">    Build Date  :  2/10/2026, 2:12:48 am</w:t>
+      </w:r>
+    </w:p>
+    <w:p>
+      <w:pPr>
+        <w:pStyle w:val="ListParagraph"/>
+        <w:rPr>
+          <w:rFonts w:ascii="Courier New" w:eastAsia="Times New Roman" w:hAnsi="Courier New" w:cs="Courier New"/>
+          <w:sz w:val="20"/>
+          <w:szCs w:val="20"/>
+          <w:lang w:eastAsia="en-IN"/>
+        </w:rPr>
+      </w:pPr>
+      <w:r>
+        <w:rPr>
+          <w:rFonts w:ascii="Courier New" w:eastAsia="Times New Roman" w:hAnsi="Courier New" w:cs="Courier New"/>
+          <w:sz w:val="20"/>
+          <w:szCs w:val="20"/>
+          <w:lang w:eastAsia="en-IN"/>
+        </w:rPr>
+        <w:t xml:space="preserve">    App Version :  1.0.0</w:t>
+      </w:r>
+    </w:p>
+    <w:p>
+      <w:pPr>
+        <w:pStyle w:val="ListParagraph"/>
+        <w:rPr>
+          <w:rFonts w:ascii="Courier New" w:eastAsia="Times New Roman" w:hAnsi="Courier New" w:cs="Courier New"/>
+          <w:sz w:val="20"/>
+          <w:szCs w:val="20"/>
+          <w:lang w:eastAsia="en-IN"/>
+        </w:rPr>
+      </w:pPr>
+      <w:r>
+        <w:rPr>
+          <w:rFonts w:ascii="Courier New" w:eastAsia="Times New Roman" w:hAnsi="Courier New" w:cs="Courier New"/>
+          <w:sz w:val="20"/>
+          <w:szCs w:val="20"/>
+          <w:lang w:eastAsia="en-IN"/>
+        </w:rPr>
+        <w:t xml:space="preserve">    Build number:  1</w:t>
+      </w:r>
+    </w:p>
+    <w:p>
+      <w:pPr>
+        <w:pStyle w:val="ListParagraph"/>
+        <w:rPr>
+          <w:rFonts w:ascii="Courier New" w:eastAsia="Times New Roman" w:hAnsi="Courier New" w:cs="Courier New"/>
+          <w:sz w:val="20"/>
+          <w:szCs w:val="20"/>
+          <w:lang w:eastAsia="en-IN"/>
+        </w:rPr>
+      </w:pPr>
+    </w:p>
+    <w:p>
+      <w:pPr>
+        <w:pStyle w:val="ListParagraph"/>
+        <w:rPr>
+          <w:rFonts w:ascii="Courier New" w:eastAsia="Times New Roman" w:hAnsi="Courier New" w:cs="Courier New"/>
+          <w:sz w:val="20"/>
+          <w:szCs w:val="20"/>
+          <w:lang w:eastAsia="en-IN"/>
+        </w:rPr>
+      </w:pPr>
+      <w:r>
+        <w:rPr>
+          <w:rFonts w:ascii="Segoe UI Symbol" w:eastAsia="Times New Roman" w:hAnsi="Segoe UI Symbol" w:cs="Segoe UI Symbol"/>
+          <w:sz w:val="20"/>
+          <w:szCs w:val="20"/>
+          <w:lang w:eastAsia="en-IN"/>
+        </w:rPr>
+        <w:t>✔</w:t>
+      </w:r>
+      <w:r>
+        <w:rPr>
+          <w:rFonts w:ascii="Courier New" w:eastAsia="Times New Roman" w:hAnsi="Courier New" w:cs="Courier New"/>
+          <w:sz w:val="20"/>
+          <w:szCs w:val="20"/>
+          <w:lang w:eastAsia="en-IN"/>
+        </w:rPr>
+        <w:t xml:space="preserve"> Scheduled iOS submission</w:t>
+      </w:r>
+    </w:p>
+    <w:p>
+      <w:pPr>
+        <w:pStyle w:val="ListParagraph"/>
+        <w:rPr>
+          <w:rFonts w:ascii="Courier New" w:eastAsia="Times New Roman" w:hAnsi="Courier New" w:cs="Courier New"/>
+          <w:sz w:val="20"/>
+          <w:szCs w:val="20"/>
+          <w:lang w:eastAsia="en-IN"/>
+        </w:rPr>
+      </w:pPr>
     </w:p>
     <w:p>
       <w:pPr>

</xml_diff>

<commit_message>
QR scanner fixes and initial theme DB strutcure
</commit_message>
<xml_diff>
--- a/docs/Memgine DEV environment set UP.docx
+++ b/docs/Memgine DEV environment set UP.docx
@@ -4,6 +4,23 @@
   <w:body>
     <w:p>
       <w:r>
+        <w:t>Frontend compile and restart</w:t>
+      </w:r>
+    </w:p>
+    <w:p>
+      <w:r>
+        <w:t>npx tsc --noEmit</w:t>
+      </w:r>
+    </w:p>
+    <w:p/>
+    <w:p>
+      <w:r>
+        <w:t>cd D:\MynikaTech\memgine\frontend; npx expo start --clear --web</w:t>
+      </w:r>
+    </w:p>
+    <w:p/>
+    <w:p>
+      <w:r>
         <w:t>DEV environment set UP</w:t>
       </w:r>
     </w:p>
@@ -160,6 +177,7 @@
     </w:p>
     <w:p>
       <w:r>
+        <w:lastRenderedPageBreak/>
         <w:t>.\DB\env\dev\bootstrap-dev-memgine.ps1 -MasterSecretArn $master -LiquibaseSecretArn $liquibase -RuntimeSecretArn $runtime -DatabaseHost 127.0.0.1 -DatabasePort 15432</w:t>
       </w:r>
     </w:p>
@@ -170,11 +188,7 @@
     </w:p>
     <w:p>
       <w:r>
-        <w:t xml:space="preserve">$raw = aws secretsmanager get-secret-value --profile memgine --region ca-central-1 --secret-id $runtime --query SecretString --output text; $obj = $raw | ConvertFrom-Json; Write-Host </w:t>
-      </w:r>
-      <w:r>
-        <w:lastRenderedPageBreak/>
-        <w:t>"username=$($obj.username) host=$($obj.host) port=$($obj.port) database=$($obj.database) schema=$($obj.schema) passwordPresent=$(-not [string]::IsNullOrWhiteSpace($obj.password))"</w:t>
+        <w:t>$raw = aws secretsmanager get-secret-value --profile memgine --region ca-central-1 --secret-id $runtime --query SecretString --output text; $obj = $raw | ConvertFrom-Json; Write-Host "username=$($obj.username) host=$($obj.host) port=$($obj.port) database=$($obj.database) schema=$($obj.schema) passwordPresent=$(-not [string]::IsNullOrWhiteSpace($obj.password))"</w:t>
       </w:r>
     </w:p>
     <w:p/>
@@ -284,7 +298,11 @@
     </w:p>
     <w:p>
       <w:r>
-        <w:t>$bytes=New-Object byte[] 64; $rng=[System.Security.Cryptography.RandomNumberGenerator]::Create(); $rng.GetBytes($bytes); $pepper=[Convert]::ToBase64String($bytes); aws secretsmanager put-secret-value --profile memgine --region ca-central-1 --secret-id memgine/dev/otp-pepper --secret-string $pepper --no-cli-pager; $rng.Dispose(); Remove-Variable pepper,bytes,rng</w:t>
+        <w:t xml:space="preserve">$bytes=New-Object byte[] 64; $rng=[System.Security.Cryptography.RandomNumberGenerator]::Create(); $rng.GetBytes($bytes); </w:t>
+      </w:r>
+      <w:r>
+        <w:lastRenderedPageBreak/>
+        <w:t>$pepper=[Convert]::ToBase64String($bytes); aws secretsmanager put-secret-value --profile memgine --region ca-central-1 --secret-id memgine/dev/otp-pepper --secret-string $pepper --no-cli-pager; $rng.Dispose(); Remove-Variable pepper,bytes,rng</w:t>
       </w:r>
     </w:p>
     <w:p>
@@ -320,130 +338,130 @@
     </w:p>
     <w:p>
       <w:r>
+        <w:t xml:space="preserve">    "VersionId": "3dc7aa0d-da3a-4763-9519-af9d9536bc9d",</w:t>
+      </w:r>
+    </w:p>
+    <w:p>
+      <w:r>
+        <w:t xml:space="preserve">    "VersionStages": [</w:t>
+      </w:r>
+    </w:p>
+    <w:p>
+      <w:r>
+        <w:t xml:space="preserve">        "AWSCURRENT"</w:t>
+      </w:r>
+    </w:p>
+    <w:p>
+      <w:r>
+        <w:t xml:space="preserve">    ]</w:t>
+      </w:r>
+    </w:p>
+    <w:p>
+      <w:r>
+        <w:t>}</w:t>
+      </w:r>
+    </w:p>
+    <w:p>
+      <w:r>
+        <w:t xml:space="preserve">SSH to EC2 - </w:t>
+      </w:r>
+      <w:r>
+        <w:t>aws ssm start-session --profile memgine --region ca-central-1 --target i-02a49b07c1b9979a5</w:t>
+      </w:r>
+    </w:p>
+    <w:p>
+      <w:r>
+        <w:t xml:space="preserve">cd D:\MynikaTech\memgine; </w:t>
+      </w:r>
+      <w:proofErr w:type="gramStart"/>
+      <w:r>
+        <w:t>.\gradlew.bat :server</w:t>
+      </w:r>
+      <w:proofErr w:type="gramEnd"/>
+      <w:r>
+        <w:t>:compileKotlin --no-daemon --console=plain</w:t>
+      </w:r>
+    </w:p>
+    <w:p/>
+    <w:p>
+      <w:r>
+        <w:t>Complete deplyment end to end</w:t>
+      </w:r>
+    </w:p>
+    <w:p>
+      <w:r>
+        <w:t>.\server\scripts\setup-host.ps1 -Environment dev</w:t>
+      </w:r>
+    </w:p>
+    <w:p/>
+    <w:p>
+      <w:r>
+        <w:t>.\server\scripts\deploy-release.ps1 -Environment dev</w:t>
+      </w:r>
+    </w:p>
+    <w:p>
+      <w:r>
+        <w:t>.\server\scripts\build-backend.ps1 -Environment dev</w:t>
+      </w:r>
+    </w:p>
+    <w:p>
+      <w:r>
+        <w:t>.\server\scripts\build-frontend.ps1 -Environment dev</w:t>
+      </w:r>
+    </w:p>
+    <w:p>
+      <w:r>
+        <w:t>.\server\scripts\publish-release.ps1 -Environment dev</w:t>
+      </w:r>
+    </w:p>
+    <w:p>
+      <w:r>
+        <w:t>.\server\scripts\deploy-release.ps1 -Environment dev</w:t>
+      </w:r>
+    </w:p>
+    <w:p>
+      <w:r>
+        <w:t>.\server\scripts\deploy-release.ps1 -Environment dev -ReleaseId &lt;release-id&gt;</w:t>
+      </w:r>
+    </w:p>
+    <w:p>
+      <w:r>
+        <w:t>.\server\scripts\remote-backend.ps1 -Environment dev -Action status</w:t>
+      </w:r>
+    </w:p>
+    <w:p>
+      <w:r>
+        <w:t>.\server\scripts\remote-backend.ps1 -Environment dev -Action stop</w:t>
+      </w:r>
+    </w:p>
+    <w:p>
+      <w:r>
+        <w:t>.\server\scripts\remote-backend.ps1 -Environment dev -Action start</w:t>
+      </w:r>
+    </w:p>
+    <w:p>
+      <w:r>
+        <w:t>.\server\scripts\remote-backend.ps1 -Environment dev -Action restart</w:t>
+      </w:r>
+    </w:p>
+    <w:p>
+      <w:r>
+        <w:t>.\server\scripts\health-check.ps1 -Environment dev</w:t>
+      </w:r>
+    </w:p>
+    <w:p>
+      <w:r>
+        <w:t>.\server\scripts\remote-maintenance.ps1 -Environment dev -Action sync-scripts</w:t>
+      </w:r>
+    </w:p>
+    <w:p>
+      <w:r>
+        <w:t>.\server\scripts\remote-maintenance.ps1 -Environment dev -Action configure-nginx</w:t>
+      </w:r>
+    </w:p>
+    <w:p>
+      <w:r>
         <w:lastRenderedPageBreak/>
-        <w:t xml:space="preserve">    "VersionId": "3dc7aa0d-da3a-4763-9519-af9d9536bc9d",</w:t>
-      </w:r>
-    </w:p>
-    <w:p>
-      <w:r>
-        <w:t xml:space="preserve">    "VersionStages": [</w:t>
-      </w:r>
-    </w:p>
-    <w:p>
-      <w:r>
-        <w:t xml:space="preserve">        "AWSCURRENT"</w:t>
-      </w:r>
-    </w:p>
-    <w:p>
-      <w:r>
-        <w:t xml:space="preserve">    ]</w:t>
-      </w:r>
-    </w:p>
-    <w:p>
-      <w:r>
-        <w:t>}</w:t>
-      </w:r>
-    </w:p>
-    <w:p>
-      <w:r>
-        <w:t xml:space="preserve">SSH to EC2 - </w:t>
-      </w:r>
-      <w:r>
-        <w:t>aws ssm start-session --profile memgine --region ca-central-1 --target i-02a49b07c1b9979a5</w:t>
-      </w:r>
-    </w:p>
-    <w:p>
-      <w:r>
-        <w:t xml:space="preserve">cd D:\MynikaTech\memgine; </w:t>
-      </w:r>
-      <w:proofErr w:type="gramStart"/>
-      <w:r>
-        <w:t>.\gradlew.bat :server</w:t>
-      </w:r>
-      <w:proofErr w:type="gramEnd"/>
-      <w:r>
-        <w:t>:compileKotlin --no-daemon --console=plain</w:t>
-      </w:r>
-    </w:p>
-    <w:p/>
-    <w:p>
-      <w:r>
-        <w:t>Complete deplyment end to end</w:t>
-      </w:r>
-    </w:p>
-    <w:p>
-      <w:r>
-        <w:t>.\server\scripts\setup-host.ps1 -Environment dev</w:t>
-      </w:r>
-    </w:p>
-    <w:p/>
-    <w:p>
-      <w:r>
-        <w:t>.\server\scripts\deploy-release.ps1 -Environment dev</w:t>
-      </w:r>
-    </w:p>
-    <w:p>
-      <w:r>
-        <w:t>.\server\scripts\build-backend.ps1 -Environment dev</w:t>
-      </w:r>
-    </w:p>
-    <w:p>
-      <w:r>
-        <w:t>.\server\scripts\build-frontend.ps1 -Environment dev</w:t>
-      </w:r>
-    </w:p>
-    <w:p>
-      <w:r>
-        <w:t>.\server\scripts\publish-release.ps1 -Environment dev</w:t>
-      </w:r>
-    </w:p>
-    <w:p>
-      <w:r>
-        <w:t>.\server\scripts\deploy-release.ps1 -Environment dev</w:t>
-      </w:r>
-    </w:p>
-    <w:p>
-      <w:r>
-        <w:t>.\server\scripts\deploy-release.ps1 -Environment dev -ReleaseId &lt;release-id&gt;</w:t>
-      </w:r>
-    </w:p>
-    <w:p>
-      <w:r>
-        <w:t>.\server\scripts\remote-backend.ps1 -Environment dev -Action status</w:t>
-      </w:r>
-    </w:p>
-    <w:p>
-      <w:r>
-        <w:t>.\server\scripts\remote-backend.ps1 -Environment dev -Action stop</w:t>
-      </w:r>
-    </w:p>
-    <w:p>
-      <w:r>
-        <w:t>.\server\scripts\remote-backend.ps1 -Environment dev -Action start</w:t>
-      </w:r>
-    </w:p>
-    <w:p>
-      <w:r>
-        <w:t>.\server\scripts\remote-backend.ps1 -Environment dev -Action restart</w:t>
-      </w:r>
-    </w:p>
-    <w:p>
-      <w:r>
-        <w:t>.\server\scripts\health-check.ps1 -Environment dev</w:t>
-      </w:r>
-    </w:p>
-    <w:p>
-      <w:r>
-        <w:t>.\server\scripts\remote-maintenance.ps1 -Environment dev -Action sync-scripts</w:t>
-      </w:r>
-    </w:p>
-    <w:p>
-      <w:r>
-        <w:t>.\server\scripts\remote-maintenance.ps1 -Environment dev -Action configure-nginx</w:t>
-      </w:r>
-    </w:p>
-    <w:p>
-      <w:r>
         <w:t>.\server\scripts\remote-maintenance.ps1 -Environment dev -Action rollback -ReleaseId &lt;release-id&gt;</w:t>
       </w:r>
     </w:p>
@@ -640,7 +658,6 @@
     <w:p/>
     <w:p>
       <w:r>
-        <w:lastRenderedPageBreak/>
         <w:t>$localHash</w:t>
       </w:r>
       <w:proofErr w:type="gramStart"/>
@@ -1405,56 +1422,706 @@
           <w:szCs w:val="20"/>
           <w:lang w:eastAsia="en-IN"/>
         </w:rPr>
+        <w:t>--</w:t>
+      </w:r>
+    </w:p>
+    <w:p>
+      <w:pPr>
+        <w:rPr>
+          <w:rFonts w:ascii="Courier New" w:eastAsia="Times New Roman" w:hAnsi="Courier New" w:cs="Courier New"/>
+          <w:sz w:val="20"/>
+          <w:szCs w:val="20"/>
+          <w:lang w:eastAsia="en-IN"/>
+        </w:rPr>
+      </w:pPr>
+      <w:r>
+        <w:rPr>
+          <w:rFonts w:ascii="Courier New" w:eastAsia="Times New Roman" w:hAnsi="Courier New" w:cs="Courier New"/>
+          <w:sz w:val="20"/>
+          <w:szCs w:val="20"/>
+          <w:lang w:eastAsia="en-IN"/>
+        </w:rPr>
+        <w:t>-- Safe to rerun. Existing rows with the same product_id are updated.</w:t>
+      </w:r>
+    </w:p>
+    <w:p>
+      <w:pPr>
+        <w:rPr>
+          <w:rFonts w:ascii="Courier New" w:eastAsia="Times New Roman" w:hAnsi="Courier New" w:cs="Courier New"/>
+          <w:sz w:val="20"/>
+          <w:szCs w:val="20"/>
+          <w:lang w:eastAsia="en-IN"/>
+        </w:rPr>
+      </w:pPr>
+    </w:p>
+    <w:p>
+      <w:pPr>
+        <w:rPr>
+          <w:rFonts w:ascii="Courier New" w:eastAsia="Times New Roman" w:hAnsi="Courier New" w:cs="Courier New"/>
+          <w:sz w:val="20"/>
+          <w:szCs w:val="20"/>
+          <w:lang w:eastAsia="en-IN"/>
+        </w:rPr>
+      </w:pPr>
+      <w:r>
+        <w:rPr>
+          <w:rFonts w:ascii="Courier New" w:eastAsia="Times New Roman" w:hAnsi="Courier New" w:cs="Courier New"/>
+          <w:sz w:val="20"/>
+          <w:szCs w:val="20"/>
+          <w:lang w:eastAsia="en-IN"/>
+        </w:rPr>
+        <w:t xml:space="preserve">INSERT INTO </w:t>
+      </w:r>
+      <w:proofErr w:type="gramStart"/>
+      <w:r>
+        <w:rPr>
+          <w:rFonts w:ascii="Courier New" w:eastAsia="Times New Roman" w:hAnsi="Courier New" w:cs="Courier New"/>
+          <w:sz w:val="20"/>
+          <w:szCs w:val="20"/>
+          <w:lang w:eastAsia="en-IN"/>
+        </w:rPr>
+        <w:t>memginedev.product</w:t>
+      </w:r>
+      <w:proofErr w:type="gramEnd"/>
+      <w:r>
+        <w:rPr>
+          <w:rFonts w:ascii="Courier New" w:eastAsia="Times New Roman" w:hAnsi="Courier New" w:cs="Courier New"/>
+          <w:sz w:val="20"/>
+          <w:szCs w:val="20"/>
+          <w:lang w:eastAsia="en-IN"/>
+        </w:rPr>
+        <w:t xml:space="preserve"> (</w:t>
+      </w:r>
+    </w:p>
+    <w:p>
+      <w:pPr>
+        <w:rPr>
+          <w:rFonts w:ascii="Courier New" w:eastAsia="Times New Roman" w:hAnsi="Courier New" w:cs="Courier New"/>
+          <w:sz w:val="20"/>
+          <w:szCs w:val="20"/>
+          <w:lang w:eastAsia="en-IN"/>
+        </w:rPr>
+      </w:pPr>
+      <w:r>
+        <w:rPr>
+          <w:rFonts w:ascii="Courier New" w:eastAsia="Times New Roman" w:hAnsi="Courier New" w:cs="Courier New"/>
+          <w:sz w:val="20"/>
+          <w:szCs w:val="20"/>
+          <w:lang w:eastAsia="en-IN"/>
+        </w:rPr>
+        <w:t xml:space="preserve">    product_id,</w:t>
+      </w:r>
+    </w:p>
+    <w:p>
+      <w:pPr>
+        <w:rPr>
+          <w:rFonts w:ascii="Courier New" w:eastAsia="Times New Roman" w:hAnsi="Courier New" w:cs="Courier New"/>
+          <w:sz w:val="20"/>
+          <w:szCs w:val="20"/>
+          <w:lang w:eastAsia="en-IN"/>
+        </w:rPr>
+      </w:pPr>
+      <w:r>
+        <w:rPr>
+          <w:rFonts w:ascii="Courier New" w:eastAsia="Times New Roman" w:hAnsi="Courier New" w:cs="Courier New"/>
+          <w:sz w:val="20"/>
+          <w:szCs w:val="20"/>
+          <w:lang w:eastAsia="en-IN"/>
+        </w:rPr>
+        <w:t xml:space="preserve">    organization_id,</w:t>
+      </w:r>
+    </w:p>
+    <w:p>
+      <w:pPr>
+        <w:rPr>
+          <w:rFonts w:ascii="Courier New" w:eastAsia="Times New Roman" w:hAnsi="Courier New" w:cs="Courier New"/>
+          <w:sz w:val="20"/>
+          <w:szCs w:val="20"/>
+          <w:lang w:eastAsia="en-IN"/>
+        </w:rPr>
+      </w:pPr>
+      <w:r>
+        <w:rPr>
+          <w:rFonts w:ascii="Courier New" w:eastAsia="Times New Roman" w:hAnsi="Courier New" w:cs="Courier New"/>
+          <w:sz w:val="20"/>
+          <w:szCs w:val="20"/>
+          <w:lang w:eastAsia="en-IN"/>
+        </w:rPr>
+        <w:t xml:space="preserve">    product_code,</w:t>
+      </w:r>
+    </w:p>
+    <w:p>
+      <w:pPr>
+        <w:rPr>
+          <w:rFonts w:ascii="Courier New" w:eastAsia="Times New Roman" w:hAnsi="Courier New" w:cs="Courier New"/>
+          <w:sz w:val="20"/>
+          <w:szCs w:val="20"/>
+          <w:lang w:eastAsia="en-IN"/>
+        </w:rPr>
+      </w:pPr>
+      <w:r>
+        <w:rPr>
+          <w:rFonts w:ascii="Courier New" w:eastAsia="Times New Roman" w:hAnsi="Courier New" w:cs="Courier New"/>
+          <w:sz w:val="20"/>
+          <w:szCs w:val="20"/>
+          <w:lang w:eastAsia="en-IN"/>
+        </w:rPr>
+        <w:t xml:space="preserve">    product_name,</w:t>
+      </w:r>
+    </w:p>
+    <w:p>
+      <w:pPr>
+        <w:rPr>
+          <w:rFonts w:ascii="Courier New" w:eastAsia="Times New Roman" w:hAnsi="Courier New" w:cs="Courier New"/>
+          <w:sz w:val="20"/>
+          <w:szCs w:val="20"/>
+          <w:lang w:eastAsia="en-IN"/>
+        </w:rPr>
+      </w:pPr>
+      <w:r>
+        <w:rPr>
+          <w:rFonts w:ascii="Courier New" w:eastAsia="Times New Roman" w:hAnsi="Courier New" w:cs="Courier New"/>
+          <w:sz w:val="20"/>
+          <w:szCs w:val="20"/>
+          <w:lang w:eastAsia="en-IN"/>
+        </w:rPr>
+        <w:t xml:space="preserve">    description,</w:t>
+      </w:r>
+    </w:p>
+    <w:p>
+      <w:pPr>
+        <w:rPr>
+          <w:rFonts w:ascii="Courier New" w:eastAsia="Times New Roman" w:hAnsi="Courier New" w:cs="Courier New"/>
+          <w:sz w:val="20"/>
+          <w:szCs w:val="20"/>
+          <w:lang w:eastAsia="en-IN"/>
+        </w:rPr>
+      </w:pPr>
+      <w:r>
+        <w:rPr>
+          <w:rFonts w:ascii="Courier New" w:eastAsia="Times New Roman" w:hAnsi="Courier New" w:cs="Courier New"/>
+          <w:sz w:val="20"/>
+          <w:szCs w:val="20"/>
+          <w:lang w:eastAsia="en-IN"/>
+        </w:rPr>
+        <w:t xml:space="preserve">    status_id,</w:t>
+      </w:r>
+    </w:p>
+    <w:p>
+      <w:pPr>
+        <w:rPr>
+          <w:rFonts w:ascii="Courier New" w:eastAsia="Times New Roman" w:hAnsi="Courier New" w:cs="Courier New"/>
+          <w:sz w:val="20"/>
+          <w:szCs w:val="20"/>
+          <w:lang w:eastAsia="en-IN"/>
+        </w:rPr>
+      </w:pPr>
+      <w:r>
+        <w:rPr>
+          <w:rFonts w:ascii="Courier New" w:eastAsia="Times New Roman" w:hAnsi="Courier New" w:cs="Courier New"/>
+          <w:sz w:val="20"/>
+          <w:szCs w:val="20"/>
+          <w:lang w:eastAsia="en-IN"/>
+        </w:rPr>
+        <w:t xml:space="preserve">    created_at,</w:t>
+      </w:r>
+    </w:p>
+    <w:p>
+      <w:pPr>
+        <w:rPr>
+          <w:rFonts w:ascii="Courier New" w:eastAsia="Times New Roman" w:hAnsi="Courier New" w:cs="Courier New"/>
+          <w:sz w:val="20"/>
+          <w:szCs w:val="20"/>
+          <w:lang w:eastAsia="en-IN"/>
+        </w:rPr>
+      </w:pPr>
+      <w:r>
+        <w:rPr>
+          <w:rFonts w:ascii="Courier New" w:eastAsia="Times New Roman" w:hAnsi="Courier New" w:cs="Courier New"/>
+          <w:sz w:val="20"/>
+          <w:szCs w:val="20"/>
+          <w:lang w:eastAsia="en-IN"/>
+        </w:rPr>
+        <w:t xml:space="preserve">    created_by,</w:t>
+      </w:r>
+    </w:p>
+    <w:p>
+      <w:pPr>
+        <w:rPr>
+          <w:rFonts w:ascii="Courier New" w:eastAsia="Times New Roman" w:hAnsi="Courier New" w:cs="Courier New"/>
+          <w:sz w:val="20"/>
+          <w:szCs w:val="20"/>
+          <w:lang w:eastAsia="en-IN"/>
+        </w:rPr>
+      </w:pPr>
+      <w:r>
+        <w:rPr>
+          <w:rFonts w:ascii="Courier New" w:eastAsia="Times New Roman" w:hAnsi="Courier New" w:cs="Courier New"/>
+          <w:sz w:val="20"/>
+          <w:szCs w:val="20"/>
+          <w:lang w:eastAsia="en-IN"/>
+        </w:rPr>
+        <w:t xml:space="preserve">    updated_at,</w:t>
+      </w:r>
+    </w:p>
+    <w:p>
+      <w:pPr>
+        <w:rPr>
+          <w:rFonts w:ascii="Courier New" w:eastAsia="Times New Roman" w:hAnsi="Courier New" w:cs="Courier New"/>
+          <w:sz w:val="20"/>
+          <w:szCs w:val="20"/>
+          <w:lang w:eastAsia="en-IN"/>
+        </w:rPr>
+      </w:pPr>
+      <w:r>
+        <w:rPr>
+          <w:rFonts w:ascii="Courier New" w:eastAsia="Times New Roman" w:hAnsi="Courier New" w:cs="Courier New"/>
+          <w:sz w:val="20"/>
+          <w:szCs w:val="20"/>
+          <w:lang w:eastAsia="en-IN"/>
+        </w:rPr>
+        <w:t xml:space="preserve">    updated_by,</w:t>
+      </w:r>
+    </w:p>
+    <w:p>
+      <w:pPr>
+        <w:rPr>
+          <w:rFonts w:ascii="Courier New" w:eastAsia="Times New Roman" w:hAnsi="Courier New" w:cs="Courier New"/>
+          <w:sz w:val="20"/>
+          <w:szCs w:val="20"/>
+          <w:lang w:eastAsia="en-IN"/>
+        </w:rPr>
+      </w:pPr>
+      <w:r>
+        <w:rPr>
+          <w:rFonts w:ascii="Courier New" w:eastAsia="Times New Roman" w:hAnsi="Courier New" w:cs="Courier New"/>
+          <w:sz w:val="20"/>
+          <w:szCs w:val="20"/>
+          <w:lang w:eastAsia="en-IN"/>
+        </w:rPr>
+        <w:t xml:space="preserve">    is_deleted,</w:t>
+      </w:r>
+    </w:p>
+    <w:p>
+      <w:pPr>
+        <w:rPr>
+          <w:rFonts w:ascii="Courier New" w:eastAsia="Times New Roman" w:hAnsi="Courier New" w:cs="Courier New"/>
+          <w:sz w:val="20"/>
+          <w:szCs w:val="20"/>
+          <w:lang w:eastAsia="en-IN"/>
+        </w:rPr>
+      </w:pPr>
+      <w:r>
+        <w:rPr>
+          <w:rFonts w:ascii="Courier New" w:eastAsia="Times New Roman" w:hAnsi="Courier New" w:cs="Courier New"/>
+          <w:sz w:val="20"/>
+          <w:szCs w:val="20"/>
+          <w:lang w:eastAsia="en-IN"/>
+        </w:rPr>
+        <w:t xml:space="preserve">    version_no</w:t>
+      </w:r>
+    </w:p>
+    <w:p>
+      <w:pPr>
+        <w:rPr>
+          <w:rFonts w:ascii="Courier New" w:eastAsia="Times New Roman" w:hAnsi="Courier New" w:cs="Courier New"/>
+          <w:sz w:val="20"/>
+          <w:szCs w:val="20"/>
+          <w:lang w:eastAsia="en-IN"/>
+        </w:rPr>
+      </w:pPr>
+      <w:r>
+        <w:rPr>
+          <w:rFonts w:ascii="Courier New" w:eastAsia="Times New Roman" w:hAnsi="Courier New" w:cs="Courier New"/>
+          <w:sz w:val="20"/>
+          <w:szCs w:val="20"/>
+          <w:lang w:eastAsia="en-IN"/>
+        </w:rPr>
+        <w:t>)</w:t>
+      </w:r>
+    </w:p>
+    <w:p>
+      <w:pPr>
+        <w:rPr>
+          <w:rFonts w:ascii="Courier New" w:eastAsia="Times New Roman" w:hAnsi="Courier New" w:cs="Courier New"/>
+          <w:sz w:val="20"/>
+          <w:szCs w:val="20"/>
+          <w:lang w:eastAsia="en-IN"/>
+        </w:rPr>
+      </w:pPr>
+      <w:r>
+        <w:rPr>
+          <w:rFonts w:ascii="Courier New" w:eastAsia="Times New Roman" w:hAnsi="Courier New" w:cs="Courier New"/>
+          <w:sz w:val="20"/>
+          <w:szCs w:val="20"/>
+          <w:lang w:eastAsia="en-IN"/>
+        </w:rPr>
+        <w:t>SELECT</w:t>
+      </w:r>
+    </w:p>
+    <w:p>
+      <w:pPr>
+        <w:rPr>
+          <w:rFonts w:ascii="Courier New" w:eastAsia="Times New Roman" w:hAnsi="Courier New" w:cs="Courier New"/>
+          <w:sz w:val="20"/>
+          <w:szCs w:val="20"/>
+          <w:lang w:eastAsia="en-IN"/>
+        </w:rPr>
+      </w:pPr>
+      <w:r>
+        <w:rPr>
+          <w:rFonts w:ascii="Courier New" w:eastAsia="Times New Roman" w:hAnsi="Courier New" w:cs="Courier New"/>
+          <w:sz w:val="20"/>
+          <w:szCs w:val="20"/>
+          <w:lang w:eastAsia="en-IN"/>
+        </w:rPr>
+        <w:t xml:space="preserve">    v.product_id,</w:t>
+      </w:r>
+    </w:p>
+    <w:p>
+      <w:pPr>
+        <w:rPr>
+          <w:rFonts w:ascii="Courier New" w:eastAsia="Times New Roman" w:hAnsi="Courier New" w:cs="Courier New"/>
+          <w:sz w:val="20"/>
+          <w:szCs w:val="20"/>
+          <w:lang w:eastAsia="en-IN"/>
+        </w:rPr>
+      </w:pPr>
+      <w:r>
+        <w:rPr>
+          <w:rFonts w:ascii="Courier New" w:eastAsia="Times New Roman" w:hAnsi="Courier New" w:cs="Courier New"/>
+          <w:sz w:val="20"/>
+          <w:szCs w:val="20"/>
+          <w:lang w:eastAsia="en-IN"/>
+        </w:rPr>
+        <w:t xml:space="preserve">    'ORG_ece1b2f6-0e01-4d1b-ac11-3528e136cc1b',</w:t>
+      </w:r>
+    </w:p>
+    <w:p>
+      <w:pPr>
+        <w:rPr>
+          <w:rFonts w:ascii="Courier New" w:eastAsia="Times New Roman" w:hAnsi="Courier New" w:cs="Courier New"/>
+          <w:sz w:val="20"/>
+          <w:szCs w:val="20"/>
+          <w:lang w:eastAsia="en-IN"/>
+        </w:rPr>
+      </w:pPr>
+      <w:r>
+        <w:rPr>
+          <w:rFonts w:ascii="Courier New" w:eastAsia="Times New Roman" w:hAnsi="Courier New" w:cs="Courier New"/>
+          <w:sz w:val="20"/>
+          <w:szCs w:val="20"/>
+          <w:lang w:eastAsia="en-IN"/>
+        </w:rPr>
+        <w:t xml:space="preserve">    v.product_code,</w:t>
+      </w:r>
+    </w:p>
+    <w:p>
+      <w:pPr>
+        <w:rPr>
+          <w:rFonts w:ascii="Courier New" w:eastAsia="Times New Roman" w:hAnsi="Courier New" w:cs="Courier New"/>
+          <w:sz w:val="20"/>
+          <w:szCs w:val="20"/>
+          <w:lang w:eastAsia="en-IN"/>
+        </w:rPr>
+      </w:pPr>
+      <w:r>
+        <w:rPr>
+          <w:rFonts w:ascii="Courier New" w:eastAsia="Times New Roman" w:hAnsi="Courier New" w:cs="Courier New"/>
+          <w:sz w:val="20"/>
+          <w:szCs w:val="20"/>
+          <w:lang w:eastAsia="en-IN"/>
+        </w:rPr>
+        <w:t xml:space="preserve">    v.product_name,</w:t>
+      </w:r>
+    </w:p>
+    <w:p>
+      <w:pPr>
+        <w:rPr>
+          <w:rFonts w:ascii="Courier New" w:eastAsia="Times New Roman" w:hAnsi="Courier New" w:cs="Courier New"/>
+          <w:sz w:val="20"/>
+          <w:szCs w:val="20"/>
+          <w:lang w:eastAsia="en-IN"/>
+        </w:rPr>
+      </w:pPr>
+      <w:r>
+        <w:rPr>
+          <w:rFonts w:ascii="Courier New" w:eastAsia="Times New Roman" w:hAnsi="Courier New" w:cs="Courier New"/>
+          <w:sz w:val="20"/>
+          <w:szCs w:val="20"/>
+          <w:lang w:eastAsia="en-IN"/>
+        </w:rPr>
+        <w:t xml:space="preserve">    v.description,</w:t>
+      </w:r>
+    </w:p>
+    <w:p>
+      <w:pPr>
+        <w:rPr>
+          <w:rFonts w:ascii="Courier New" w:eastAsia="Times New Roman" w:hAnsi="Courier New" w:cs="Courier New"/>
+          <w:sz w:val="20"/>
+          <w:szCs w:val="20"/>
+          <w:lang w:eastAsia="en-IN"/>
+        </w:rPr>
+      </w:pPr>
+      <w:r>
+        <w:rPr>
+          <w:rFonts w:ascii="Courier New" w:eastAsia="Times New Roman" w:hAnsi="Courier New" w:cs="Courier New"/>
+          <w:sz w:val="20"/>
+          <w:szCs w:val="20"/>
+          <w:lang w:eastAsia="en-IN"/>
+        </w:rPr>
+        <w:t xml:space="preserve">    '</w:t>
+      </w:r>
+      <w:proofErr w:type="gramStart"/>
+      <w:r>
+        <w:rPr>
+          <w:rFonts w:ascii="Courier New" w:eastAsia="Times New Roman" w:hAnsi="Courier New" w:cs="Courier New"/>
+          <w:sz w:val="20"/>
+          <w:szCs w:val="20"/>
+          <w:lang w:eastAsia="en-IN"/>
+        </w:rPr>
+        <w:t>entity</w:t>
+      </w:r>
+      <w:proofErr w:type="gramEnd"/>
+      <w:r>
+        <w:rPr>
+          <w:rFonts w:ascii="Courier New" w:eastAsia="Times New Roman" w:hAnsi="Courier New" w:cs="Courier New"/>
+          <w:sz w:val="20"/>
+          <w:szCs w:val="20"/>
+          <w:lang w:eastAsia="en-IN"/>
+        </w:rPr>
+        <w:t>-status-product-active',</w:t>
+      </w:r>
+    </w:p>
+    <w:p>
+      <w:pPr>
+        <w:rPr>
+          <w:rFonts w:ascii="Courier New" w:eastAsia="Times New Roman" w:hAnsi="Courier New" w:cs="Courier New"/>
+          <w:sz w:val="20"/>
+          <w:szCs w:val="20"/>
+          <w:lang w:eastAsia="en-IN"/>
+        </w:rPr>
+      </w:pPr>
+      <w:r>
+        <w:rPr>
+          <w:rFonts w:ascii="Courier New" w:eastAsia="Times New Roman" w:hAnsi="Courier New" w:cs="Courier New"/>
+          <w:sz w:val="20"/>
+          <w:szCs w:val="20"/>
+          <w:lang w:eastAsia="en-IN"/>
+        </w:rPr>
+        <w:t xml:space="preserve">    CURRENT_TIMESTAMP,</w:t>
+      </w:r>
+    </w:p>
+    <w:p>
+      <w:pPr>
+        <w:rPr>
+          <w:rFonts w:ascii="Courier New" w:eastAsia="Times New Roman" w:hAnsi="Courier New" w:cs="Courier New"/>
+          <w:sz w:val="20"/>
+          <w:szCs w:val="20"/>
+          <w:lang w:eastAsia="en-IN"/>
+        </w:rPr>
+      </w:pPr>
+      <w:r>
+        <w:rPr>
+          <w:rFonts w:ascii="Courier New" w:eastAsia="Times New Roman" w:hAnsi="Courier New" w:cs="Courier New"/>
+          <w:sz w:val="20"/>
+          <w:szCs w:val="20"/>
+          <w:lang w:eastAsia="en-IN"/>
+        </w:rPr>
+        <w:t xml:space="preserve">    </w:t>
+      </w:r>
+      <w:proofErr w:type="gramStart"/>
+      <w:r>
+        <w:rPr>
+          <w:rFonts w:ascii="Courier New" w:eastAsia="Times New Roman" w:hAnsi="Courier New" w:cs="Courier New"/>
+          <w:sz w:val="20"/>
+          <w:szCs w:val="20"/>
+          <w:lang w:eastAsia="en-IN"/>
+        </w:rPr>
+        <w:t>o.updated</w:t>
+      </w:r>
+      <w:proofErr w:type="gramEnd"/>
+      <w:r>
+        <w:rPr>
+          <w:rFonts w:ascii="Courier New" w:eastAsia="Times New Roman" w:hAnsi="Courier New" w:cs="Courier New"/>
+          <w:sz w:val="20"/>
+          <w:szCs w:val="20"/>
+          <w:lang w:eastAsia="en-IN"/>
+        </w:rPr>
+        <w:t>_by,</w:t>
+      </w:r>
+    </w:p>
+    <w:p>
+      <w:pPr>
+        <w:rPr>
+          <w:rFonts w:ascii="Courier New" w:eastAsia="Times New Roman" w:hAnsi="Courier New" w:cs="Courier New"/>
+          <w:sz w:val="20"/>
+          <w:szCs w:val="20"/>
+          <w:lang w:eastAsia="en-IN"/>
+        </w:rPr>
+      </w:pPr>
+      <w:r>
+        <w:rPr>
+          <w:rFonts w:ascii="Courier New" w:eastAsia="Times New Roman" w:hAnsi="Courier New" w:cs="Courier New"/>
+          <w:sz w:val="20"/>
+          <w:szCs w:val="20"/>
+          <w:lang w:eastAsia="en-IN"/>
+        </w:rPr>
+        <w:t xml:space="preserve">    CURRENT_TIMESTAMP,</w:t>
+      </w:r>
+    </w:p>
+    <w:p>
+      <w:pPr>
+        <w:rPr>
+          <w:rFonts w:ascii="Courier New" w:eastAsia="Times New Roman" w:hAnsi="Courier New" w:cs="Courier New"/>
+          <w:sz w:val="20"/>
+          <w:szCs w:val="20"/>
+          <w:lang w:eastAsia="en-IN"/>
+        </w:rPr>
+      </w:pPr>
+      <w:r>
+        <w:rPr>
+          <w:rFonts w:ascii="Courier New" w:eastAsia="Times New Roman" w:hAnsi="Courier New" w:cs="Courier New"/>
+          <w:sz w:val="20"/>
+          <w:szCs w:val="20"/>
+          <w:lang w:eastAsia="en-IN"/>
+        </w:rPr>
+        <w:t xml:space="preserve">    </w:t>
+      </w:r>
+      <w:proofErr w:type="gramStart"/>
+      <w:r>
+        <w:rPr>
+          <w:rFonts w:ascii="Courier New" w:eastAsia="Times New Roman" w:hAnsi="Courier New" w:cs="Courier New"/>
+          <w:sz w:val="20"/>
+          <w:szCs w:val="20"/>
+          <w:lang w:eastAsia="en-IN"/>
+        </w:rPr>
+        <w:t>o.updated</w:t>
+      </w:r>
+      <w:proofErr w:type="gramEnd"/>
+      <w:r>
+        <w:rPr>
+          <w:rFonts w:ascii="Courier New" w:eastAsia="Times New Roman" w:hAnsi="Courier New" w:cs="Courier New"/>
+          <w:sz w:val="20"/>
+          <w:szCs w:val="20"/>
+          <w:lang w:eastAsia="en-IN"/>
+        </w:rPr>
+        <w:t>_by,</w:t>
+      </w:r>
+    </w:p>
+    <w:p>
+      <w:pPr>
+        <w:rPr>
+          <w:rFonts w:ascii="Courier New" w:eastAsia="Times New Roman" w:hAnsi="Courier New" w:cs="Courier New"/>
+          <w:sz w:val="20"/>
+          <w:szCs w:val="20"/>
+          <w:lang w:eastAsia="en-IN"/>
+        </w:rPr>
+      </w:pPr>
+      <w:r>
+        <w:rPr>
+          <w:rFonts w:ascii="Courier New" w:eastAsia="Times New Roman" w:hAnsi="Courier New" w:cs="Courier New"/>
+          <w:sz w:val="20"/>
+          <w:szCs w:val="20"/>
+          <w:lang w:eastAsia="en-IN"/>
+        </w:rPr>
         <w:lastRenderedPageBreak/>
-        <w:t>--</w:t>
-      </w:r>
-    </w:p>
-    <w:p>
-      <w:pPr>
-        <w:rPr>
-          <w:rFonts w:ascii="Courier New" w:eastAsia="Times New Roman" w:hAnsi="Courier New" w:cs="Courier New"/>
-          <w:sz w:val="20"/>
-          <w:szCs w:val="20"/>
-          <w:lang w:eastAsia="en-IN"/>
-        </w:rPr>
-      </w:pPr>
-      <w:r>
-        <w:rPr>
-          <w:rFonts w:ascii="Courier New" w:eastAsia="Times New Roman" w:hAnsi="Courier New" w:cs="Courier New"/>
-          <w:sz w:val="20"/>
-          <w:szCs w:val="20"/>
-          <w:lang w:eastAsia="en-IN"/>
-        </w:rPr>
-        <w:t>-- Safe to rerun. Existing rows with the same product_id are updated.</w:t>
-      </w:r>
-    </w:p>
-    <w:p>
-      <w:pPr>
-        <w:rPr>
-          <w:rFonts w:ascii="Courier New" w:eastAsia="Times New Roman" w:hAnsi="Courier New" w:cs="Courier New"/>
-          <w:sz w:val="20"/>
-          <w:szCs w:val="20"/>
-          <w:lang w:eastAsia="en-IN"/>
-        </w:rPr>
-      </w:pPr>
-    </w:p>
-    <w:p>
-      <w:pPr>
-        <w:rPr>
-          <w:rFonts w:ascii="Courier New" w:eastAsia="Times New Roman" w:hAnsi="Courier New" w:cs="Courier New"/>
-          <w:sz w:val="20"/>
-          <w:szCs w:val="20"/>
-          <w:lang w:eastAsia="en-IN"/>
-        </w:rPr>
-      </w:pPr>
-      <w:r>
-        <w:rPr>
-          <w:rFonts w:ascii="Courier New" w:eastAsia="Times New Roman" w:hAnsi="Courier New" w:cs="Courier New"/>
-          <w:sz w:val="20"/>
-          <w:szCs w:val="20"/>
-          <w:lang w:eastAsia="en-IN"/>
-        </w:rPr>
-        <w:t xml:space="preserve">INSERT INTO </w:t>
+        <w:t xml:space="preserve">    FALSE,</w:t>
+      </w:r>
+    </w:p>
+    <w:p>
+      <w:pPr>
+        <w:rPr>
+          <w:rFonts w:ascii="Courier New" w:eastAsia="Times New Roman" w:hAnsi="Courier New" w:cs="Courier New"/>
+          <w:sz w:val="20"/>
+          <w:szCs w:val="20"/>
+          <w:lang w:eastAsia="en-IN"/>
+        </w:rPr>
+      </w:pPr>
+      <w:r>
+        <w:rPr>
+          <w:rFonts w:ascii="Courier New" w:eastAsia="Times New Roman" w:hAnsi="Courier New" w:cs="Courier New"/>
+          <w:sz w:val="20"/>
+          <w:szCs w:val="20"/>
+          <w:lang w:eastAsia="en-IN"/>
+        </w:rPr>
+        <w:t xml:space="preserve">    1</w:t>
+      </w:r>
+    </w:p>
+    <w:p>
+      <w:pPr>
+        <w:rPr>
+          <w:rFonts w:ascii="Courier New" w:eastAsia="Times New Roman" w:hAnsi="Courier New" w:cs="Courier New"/>
+          <w:sz w:val="20"/>
+          <w:szCs w:val="20"/>
+          <w:lang w:eastAsia="en-IN"/>
+        </w:rPr>
+      </w:pPr>
+      <w:r>
+        <w:rPr>
+          <w:rFonts w:ascii="Courier New" w:eastAsia="Times New Roman" w:hAnsi="Courier New" w:cs="Courier New"/>
+          <w:sz w:val="20"/>
+          <w:szCs w:val="20"/>
+          <w:lang w:eastAsia="en-IN"/>
+        </w:rPr>
+        <w:t>FROM (</w:t>
+      </w:r>
+    </w:p>
+    <w:p>
+      <w:pPr>
+        <w:rPr>
+          <w:rFonts w:ascii="Courier New" w:eastAsia="Times New Roman" w:hAnsi="Courier New" w:cs="Courier New"/>
+          <w:sz w:val="20"/>
+          <w:szCs w:val="20"/>
+          <w:lang w:eastAsia="en-IN"/>
+        </w:rPr>
+      </w:pPr>
+      <w:r>
+        <w:rPr>
+          <w:rFonts w:ascii="Courier New" w:eastAsia="Times New Roman" w:hAnsi="Courier New" w:cs="Courier New"/>
+          <w:sz w:val="20"/>
+          <w:szCs w:val="20"/>
+          <w:lang w:eastAsia="en-IN"/>
+        </w:rPr>
+        <w:t xml:space="preserve">    VALUES</w:t>
+      </w:r>
+    </w:p>
+    <w:p>
+      <w:pPr>
+        <w:rPr>
+          <w:rFonts w:ascii="Courier New" w:eastAsia="Times New Roman" w:hAnsi="Courier New" w:cs="Courier New"/>
+          <w:sz w:val="20"/>
+          <w:szCs w:val="20"/>
+          <w:lang w:eastAsia="en-IN"/>
+        </w:rPr>
+      </w:pPr>
+      <w:r>
+        <w:rPr>
+          <w:rFonts w:ascii="Courier New" w:eastAsia="Times New Roman" w:hAnsi="Courier New" w:cs="Courier New"/>
+          <w:sz w:val="20"/>
+          <w:szCs w:val="20"/>
+          <w:lang w:eastAsia="en-IN"/>
+        </w:rPr>
+        <w:t xml:space="preserve">        (</w:t>
+      </w:r>
+    </w:p>
+    <w:p>
+      <w:pPr>
+        <w:rPr>
+          <w:rFonts w:ascii="Courier New" w:eastAsia="Times New Roman" w:hAnsi="Courier New" w:cs="Courier New"/>
+          <w:sz w:val="20"/>
+          <w:szCs w:val="20"/>
+          <w:lang w:eastAsia="en-IN"/>
+        </w:rPr>
+      </w:pPr>
+      <w:r>
+        <w:rPr>
+          <w:rFonts w:ascii="Courier New" w:eastAsia="Times New Roman" w:hAnsi="Courier New" w:cs="Courier New"/>
+          <w:sz w:val="20"/>
+          <w:szCs w:val="20"/>
+          <w:lang w:eastAsia="en-IN"/>
+        </w:rPr>
+        <w:t xml:space="preserve">            '</w:t>
       </w:r>
       <w:proofErr w:type="gramStart"/>
       <w:r>
@@ -1464,7 +2131,7 @@
           <w:szCs w:val="20"/>
           <w:lang w:eastAsia="en-IN"/>
         </w:rPr>
-        <w:t>memginedev.product</w:t>
+        <w:t>prod</w:t>
       </w:r>
       <w:proofErr w:type="gramEnd"/>
       <w:r>
@@ -1474,387 +2141,121 @@
           <w:szCs w:val="20"/>
           <w:lang w:eastAsia="en-IN"/>
         </w:rPr>
-        <w:t xml:space="preserve"> (</w:t>
-      </w:r>
-    </w:p>
-    <w:p>
-      <w:pPr>
-        <w:rPr>
-          <w:rFonts w:ascii="Courier New" w:eastAsia="Times New Roman" w:hAnsi="Courier New" w:cs="Courier New"/>
-          <w:sz w:val="20"/>
-          <w:szCs w:val="20"/>
-          <w:lang w:eastAsia="en-IN"/>
-        </w:rPr>
-      </w:pPr>
-      <w:r>
-        <w:rPr>
-          <w:rFonts w:ascii="Courier New" w:eastAsia="Times New Roman" w:hAnsi="Courier New" w:cs="Courier New"/>
-          <w:sz w:val="20"/>
-          <w:szCs w:val="20"/>
-          <w:lang w:eastAsia="en-IN"/>
-        </w:rPr>
-        <w:t xml:space="preserve">    product_id,</w:t>
-      </w:r>
-    </w:p>
-    <w:p>
-      <w:pPr>
-        <w:rPr>
-          <w:rFonts w:ascii="Courier New" w:eastAsia="Times New Roman" w:hAnsi="Courier New" w:cs="Courier New"/>
-          <w:sz w:val="20"/>
-          <w:szCs w:val="20"/>
-          <w:lang w:eastAsia="en-IN"/>
-        </w:rPr>
-      </w:pPr>
-      <w:r>
-        <w:rPr>
-          <w:rFonts w:ascii="Courier New" w:eastAsia="Times New Roman" w:hAnsi="Courier New" w:cs="Courier New"/>
-          <w:sz w:val="20"/>
-          <w:szCs w:val="20"/>
-          <w:lang w:eastAsia="en-IN"/>
-        </w:rPr>
-        <w:t xml:space="preserve">    organization_id,</w:t>
-      </w:r>
-    </w:p>
-    <w:p>
-      <w:pPr>
-        <w:rPr>
-          <w:rFonts w:ascii="Courier New" w:eastAsia="Times New Roman" w:hAnsi="Courier New" w:cs="Courier New"/>
-          <w:sz w:val="20"/>
-          <w:szCs w:val="20"/>
-          <w:lang w:eastAsia="en-IN"/>
-        </w:rPr>
-      </w:pPr>
-      <w:r>
-        <w:rPr>
-          <w:rFonts w:ascii="Courier New" w:eastAsia="Times New Roman" w:hAnsi="Courier New" w:cs="Courier New"/>
-          <w:sz w:val="20"/>
-          <w:szCs w:val="20"/>
-          <w:lang w:eastAsia="en-IN"/>
-        </w:rPr>
-        <w:t xml:space="preserve">    product_code,</w:t>
-      </w:r>
-    </w:p>
-    <w:p>
-      <w:pPr>
-        <w:rPr>
-          <w:rFonts w:ascii="Courier New" w:eastAsia="Times New Roman" w:hAnsi="Courier New" w:cs="Courier New"/>
-          <w:sz w:val="20"/>
-          <w:szCs w:val="20"/>
-          <w:lang w:eastAsia="en-IN"/>
-        </w:rPr>
-      </w:pPr>
-      <w:r>
-        <w:rPr>
-          <w:rFonts w:ascii="Courier New" w:eastAsia="Times New Roman" w:hAnsi="Courier New" w:cs="Courier New"/>
-          <w:sz w:val="20"/>
-          <w:szCs w:val="20"/>
-          <w:lang w:eastAsia="en-IN"/>
-        </w:rPr>
-        <w:t xml:space="preserve">    product_name,</w:t>
-      </w:r>
-    </w:p>
-    <w:p>
-      <w:pPr>
-        <w:rPr>
-          <w:rFonts w:ascii="Courier New" w:eastAsia="Times New Roman" w:hAnsi="Courier New" w:cs="Courier New"/>
-          <w:sz w:val="20"/>
-          <w:szCs w:val="20"/>
-          <w:lang w:eastAsia="en-IN"/>
-        </w:rPr>
-      </w:pPr>
-      <w:r>
-        <w:rPr>
-          <w:rFonts w:ascii="Courier New" w:eastAsia="Times New Roman" w:hAnsi="Courier New" w:cs="Courier New"/>
-          <w:sz w:val="20"/>
-          <w:szCs w:val="20"/>
-          <w:lang w:eastAsia="en-IN"/>
-        </w:rPr>
-        <w:t xml:space="preserve">    description,</w:t>
-      </w:r>
-    </w:p>
-    <w:p>
-      <w:pPr>
-        <w:rPr>
-          <w:rFonts w:ascii="Courier New" w:eastAsia="Times New Roman" w:hAnsi="Courier New" w:cs="Courier New"/>
-          <w:sz w:val="20"/>
-          <w:szCs w:val="20"/>
-          <w:lang w:eastAsia="en-IN"/>
-        </w:rPr>
-      </w:pPr>
-      <w:r>
-        <w:rPr>
-          <w:rFonts w:ascii="Courier New" w:eastAsia="Times New Roman" w:hAnsi="Courier New" w:cs="Courier New"/>
-          <w:sz w:val="20"/>
-          <w:szCs w:val="20"/>
-          <w:lang w:eastAsia="en-IN"/>
-        </w:rPr>
-        <w:t xml:space="preserve">    status_id,</w:t>
-      </w:r>
-    </w:p>
-    <w:p>
-      <w:pPr>
-        <w:rPr>
-          <w:rFonts w:ascii="Courier New" w:eastAsia="Times New Roman" w:hAnsi="Courier New" w:cs="Courier New"/>
-          <w:sz w:val="20"/>
-          <w:szCs w:val="20"/>
-          <w:lang w:eastAsia="en-IN"/>
-        </w:rPr>
-      </w:pPr>
-      <w:r>
-        <w:rPr>
-          <w:rFonts w:ascii="Courier New" w:eastAsia="Times New Roman" w:hAnsi="Courier New" w:cs="Courier New"/>
-          <w:sz w:val="20"/>
-          <w:szCs w:val="20"/>
-          <w:lang w:eastAsia="en-IN"/>
-        </w:rPr>
-        <w:t xml:space="preserve">    created_at,</w:t>
-      </w:r>
-    </w:p>
-    <w:p>
-      <w:pPr>
-        <w:rPr>
-          <w:rFonts w:ascii="Courier New" w:eastAsia="Times New Roman" w:hAnsi="Courier New" w:cs="Courier New"/>
-          <w:sz w:val="20"/>
-          <w:szCs w:val="20"/>
-          <w:lang w:eastAsia="en-IN"/>
-        </w:rPr>
-      </w:pPr>
-      <w:r>
-        <w:rPr>
-          <w:rFonts w:ascii="Courier New" w:eastAsia="Times New Roman" w:hAnsi="Courier New" w:cs="Courier New"/>
-          <w:sz w:val="20"/>
-          <w:szCs w:val="20"/>
-          <w:lang w:eastAsia="en-IN"/>
-        </w:rPr>
-        <w:t xml:space="preserve">    created_by,</w:t>
-      </w:r>
-    </w:p>
-    <w:p>
-      <w:pPr>
-        <w:rPr>
-          <w:rFonts w:ascii="Courier New" w:eastAsia="Times New Roman" w:hAnsi="Courier New" w:cs="Courier New"/>
-          <w:sz w:val="20"/>
-          <w:szCs w:val="20"/>
-          <w:lang w:eastAsia="en-IN"/>
-        </w:rPr>
-      </w:pPr>
-      <w:r>
-        <w:rPr>
-          <w:rFonts w:ascii="Courier New" w:eastAsia="Times New Roman" w:hAnsi="Courier New" w:cs="Courier New"/>
-          <w:sz w:val="20"/>
-          <w:szCs w:val="20"/>
-          <w:lang w:eastAsia="en-IN"/>
-        </w:rPr>
-        <w:t xml:space="preserve">    updated_at,</w:t>
-      </w:r>
-    </w:p>
-    <w:p>
-      <w:pPr>
-        <w:rPr>
-          <w:rFonts w:ascii="Courier New" w:eastAsia="Times New Roman" w:hAnsi="Courier New" w:cs="Courier New"/>
-          <w:sz w:val="20"/>
-          <w:szCs w:val="20"/>
-          <w:lang w:eastAsia="en-IN"/>
-        </w:rPr>
-      </w:pPr>
-      <w:r>
-        <w:rPr>
-          <w:rFonts w:ascii="Courier New" w:eastAsia="Times New Roman" w:hAnsi="Courier New" w:cs="Courier New"/>
-          <w:sz w:val="20"/>
-          <w:szCs w:val="20"/>
-          <w:lang w:eastAsia="en-IN"/>
-        </w:rPr>
-        <w:t xml:space="preserve">    updated_by,</w:t>
-      </w:r>
-    </w:p>
-    <w:p>
-      <w:pPr>
-        <w:rPr>
-          <w:rFonts w:ascii="Courier New" w:eastAsia="Times New Roman" w:hAnsi="Courier New" w:cs="Courier New"/>
-          <w:sz w:val="20"/>
-          <w:szCs w:val="20"/>
-          <w:lang w:eastAsia="en-IN"/>
-        </w:rPr>
-      </w:pPr>
-      <w:r>
-        <w:rPr>
-          <w:rFonts w:ascii="Courier New" w:eastAsia="Times New Roman" w:hAnsi="Courier New" w:cs="Courier New"/>
-          <w:sz w:val="20"/>
-          <w:szCs w:val="20"/>
-          <w:lang w:eastAsia="en-IN"/>
-        </w:rPr>
-        <w:t xml:space="preserve">    is_deleted,</w:t>
-      </w:r>
-    </w:p>
-    <w:p>
-      <w:pPr>
-        <w:rPr>
-          <w:rFonts w:ascii="Courier New" w:eastAsia="Times New Roman" w:hAnsi="Courier New" w:cs="Courier New"/>
-          <w:sz w:val="20"/>
-          <w:szCs w:val="20"/>
-          <w:lang w:eastAsia="en-IN"/>
-        </w:rPr>
-      </w:pPr>
-      <w:r>
-        <w:rPr>
-          <w:rFonts w:ascii="Courier New" w:eastAsia="Times New Roman" w:hAnsi="Courier New" w:cs="Courier New"/>
-          <w:sz w:val="20"/>
-          <w:szCs w:val="20"/>
-          <w:lang w:eastAsia="en-IN"/>
-        </w:rPr>
-        <w:t xml:space="preserve">    version_no</w:t>
-      </w:r>
-    </w:p>
-    <w:p>
-      <w:pPr>
-        <w:rPr>
-          <w:rFonts w:ascii="Courier New" w:eastAsia="Times New Roman" w:hAnsi="Courier New" w:cs="Courier New"/>
-          <w:sz w:val="20"/>
-          <w:szCs w:val="20"/>
-          <w:lang w:eastAsia="en-IN"/>
-        </w:rPr>
-      </w:pPr>
-      <w:r>
-        <w:rPr>
-          <w:rFonts w:ascii="Courier New" w:eastAsia="Times New Roman" w:hAnsi="Courier New" w:cs="Courier New"/>
-          <w:sz w:val="20"/>
-          <w:szCs w:val="20"/>
-          <w:lang w:eastAsia="en-IN"/>
-        </w:rPr>
-        <w:t>)</w:t>
-      </w:r>
-    </w:p>
-    <w:p>
-      <w:pPr>
-        <w:rPr>
-          <w:rFonts w:ascii="Courier New" w:eastAsia="Times New Roman" w:hAnsi="Courier New" w:cs="Courier New"/>
-          <w:sz w:val="20"/>
-          <w:szCs w:val="20"/>
-          <w:lang w:eastAsia="en-IN"/>
-        </w:rPr>
-      </w:pPr>
-      <w:r>
-        <w:rPr>
-          <w:rFonts w:ascii="Courier New" w:eastAsia="Times New Roman" w:hAnsi="Courier New" w:cs="Courier New"/>
-          <w:sz w:val="20"/>
-          <w:szCs w:val="20"/>
-          <w:lang w:eastAsia="en-IN"/>
-        </w:rPr>
-        <w:t>SELECT</w:t>
-      </w:r>
-    </w:p>
-    <w:p>
-      <w:pPr>
-        <w:rPr>
-          <w:rFonts w:ascii="Courier New" w:eastAsia="Times New Roman" w:hAnsi="Courier New" w:cs="Courier New"/>
-          <w:sz w:val="20"/>
-          <w:szCs w:val="20"/>
-          <w:lang w:eastAsia="en-IN"/>
-        </w:rPr>
-      </w:pPr>
-      <w:r>
-        <w:rPr>
-          <w:rFonts w:ascii="Courier New" w:eastAsia="Times New Roman" w:hAnsi="Courier New" w:cs="Courier New"/>
-          <w:sz w:val="20"/>
-          <w:szCs w:val="20"/>
-          <w:lang w:eastAsia="en-IN"/>
-        </w:rPr>
-        <w:t xml:space="preserve">    v.product_id,</w:t>
-      </w:r>
-    </w:p>
-    <w:p>
-      <w:pPr>
-        <w:rPr>
-          <w:rFonts w:ascii="Courier New" w:eastAsia="Times New Roman" w:hAnsi="Courier New" w:cs="Courier New"/>
-          <w:sz w:val="20"/>
-          <w:szCs w:val="20"/>
-          <w:lang w:eastAsia="en-IN"/>
-        </w:rPr>
-      </w:pPr>
-      <w:r>
-        <w:rPr>
-          <w:rFonts w:ascii="Courier New" w:eastAsia="Times New Roman" w:hAnsi="Courier New" w:cs="Courier New"/>
-          <w:sz w:val="20"/>
-          <w:szCs w:val="20"/>
-          <w:lang w:eastAsia="en-IN"/>
-        </w:rPr>
-        <w:t xml:space="preserve">    'ORG_ece1b2f6-0e01-4d1b-ac11-3528e136cc1b',</w:t>
-      </w:r>
-    </w:p>
-    <w:p>
-      <w:pPr>
-        <w:rPr>
-          <w:rFonts w:ascii="Courier New" w:eastAsia="Times New Roman" w:hAnsi="Courier New" w:cs="Courier New"/>
-          <w:sz w:val="20"/>
-          <w:szCs w:val="20"/>
-          <w:lang w:eastAsia="en-IN"/>
-        </w:rPr>
-      </w:pPr>
-      <w:r>
-        <w:rPr>
-          <w:rFonts w:ascii="Courier New" w:eastAsia="Times New Roman" w:hAnsi="Courier New" w:cs="Courier New"/>
-          <w:sz w:val="20"/>
-          <w:szCs w:val="20"/>
-          <w:lang w:eastAsia="en-IN"/>
-        </w:rPr>
-        <w:t xml:space="preserve">    v.product_code,</w:t>
-      </w:r>
-    </w:p>
-    <w:p>
-      <w:pPr>
-        <w:rPr>
-          <w:rFonts w:ascii="Courier New" w:eastAsia="Times New Roman" w:hAnsi="Courier New" w:cs="Courier New"/>
-          <w:sz w:val="20"/>
-          <w:szCs w:val="20"/>
-          <w:lang w:eastAsia="en-IN"/>
-        </w:rPr>
-      </w:pPr>
-      <w:r>
-        <w:rPr>
-          <w:rFonts w:ascii="Courier New" w:eastAsia="Times New Roman" w:hAnsi="Courier New" w:cs="Courier New"/>
-          <w:sz w:val="20"/>
-          <w:szCs w:val="20"/>
-          <w:lang w:eastAsia="en-IN"/>
-        </w:rPr>
-        <w:t xml:space="preserve">    v.product_name,</w:t>
-      </w:r>
-    </w:p>
-    <w:p>
-      <w:pPr>
-        <w:rPr>
-          <w:rFonts w:ascii="Courier New" w:eastAsia="Times New Roman" w:hAnsi="Courier New" w:cs="Courier New"/>
-          <w:sz w:val="20"/>
-          <w:szCs w:val="20"/>
-          <w:lang w:eastAsia="en-IN"/>
-        </w:rPr>
-      </w:pPr>
-      <w:r>
-        <w:rPr>
-          <w:rFonts w:ascii="Courier New" w:eastAsia="Times New Roman" w:hAnsi="Courier New" w:cs="Courier New"/>
-          <w:sz w:val="20"/>
-          <w:szCs w:val="20"/>
-          <w:lang w:eastAsia="en-IN"/>
-        </w:rPr>
-        <w:t xml:space="preserve">    v.description,</w:t>
-      </w:r>
-    </w:p>
-    <w:p>
-      <w:pPr>
-        <w:rPr>
-          <w:rFonts w:ascii="Courier New" w:eastAsia="Times New Roman" w:hAnsi="Courier New" w:cs="Courier New"/>
-          <w:sz w:val="20"/>
-          <w:szCs w:val="20"/>
-          <w:lang w:eastAsia="en-IN"/>
-        </w:rPr>
-      </w:pPr>
-      <w:r>
-        <w:rPr>
-          <w:rFonts w:ascii="Courier New" w:eastAsia="Times New Roman" w:hAnsi="Courier New" w:cs="Courier New"/>
-          <w:sz w:val="20"/>
-          <w:szCs w:val="20"/>
-          <w:lang w:eastAsia="en-IN"/>
-        </w:rPr>
-        <w:t xml:space="preserve">    '</w:t>
+        <w:t>-ece1-filter-coffee',</w:t>
+      </w:r>
+    </w:p>
+    <w:p>
+      <w:pPr>
+        <w:rPr>
+          <w:rFonts w:ascii="Courier New" w:eastAsia="Times New Roman" w:hAnsi="Courier New" w:cs="Courier New"/>
+          <w:sz w:val="20"/>
+          <w:szCs w:val="20"/>
+          <w:lang w:eastAsia="en-IN"/>
+        </w:rPr>
+      </w:pPr>
+      <w:r>
+        <w:rPr>
+          <w:rFonts w:ascii="Courier New" w:eastAsia="Times New Roman" w:hAnsi="Courier New" w:cs="Courier New"/>
+          <w:sz w:val="20"/>
+          <w:szCs w:val="20"/>
+          <w:lang w:eastAsia="en-IN"/>
+        </w:rPr>
+        <w:t xml:space="preserve">            'ECE1-FILTER-COFFEE',</w:t>
+      </w:r>
+    </w:p>
+    <w:p>
+      <w:pPr>
+        <w:rPr>
+          <w:rFonts w:ascii="Courier New" w:eastAsia="Times New Roman" w:hAnsi="Courier New" w:cs="Courier New"/>
+          <w:sz w:val="20"/>
+          <w:szCs w:val="20"/>
+          <w:lang w:eastAsia="en-IN"/>
+        </w:rPr>
+      </w:pPr>
+      <w:r>
+        <w:rPr>
+          <w:rFonts w:ascii="Courier New" w:eastAsia="Times New Roman" w:hAnsi="Courier New" w:cs="Courier New"/>
+          <w:sz w:val="20"/>
+          <w:szCs w:val="20"/>
+          <w:lang w:eastAsia="en-IN"/>
+        </w:rPr>
+        <w:t xml:space="preserve">            'Filter Coffee',</w:t>
+      </w:r>
+    </w:p>
+    <w:p>
+      <w:pPr>
+        <w:rPr>
+          <w:rFonts w:ascii="Courier New" w:eastAsia="Times New Roman" w:hAnsi="Courier New" w:cs="Courier New"/>
+          <w:sz w:val="20"/>
+          <w:szCs w:val="20"/>
+          <w:lang w:eastAsia="en-IN"/>
+        </w:rPr>
+      </w:pPr>
+      <w:r>
+        <w:rPr>
+          <w:rFonts w:ascii="Courier New" w:eastAsia="Times New Roman" w:hAnsi="Courier New" w:cs="Courier New"/>
+          <w:sz w:val="20"/>
+          <w:szCs w:val="20"/>
+          <w:lang w:eastAsia="en-IN"/>
+        </w:rPr>
+        <w:t xml:space="preserve">            'Freshly prepared filter coffee.'</w:t>
+      </w:r>
+    </w:p>
+    <w:p>
+      <w:pPr>
+        <w:rPr>
+          <w:rFonts w:ascii="Courier New" w:eastAsia="Times New Roman" w:hAnsi="Courier New" w:cs="Courier New"/>
+          <w:sz w:val="20"/>
+          <w:szCs w:val="20"/>
+          <w:lang w:eastAsia="en-IN"/>
+        </w:rPr>
+      </w:pPr>
+      <w:r>
+        <w:rPr>
+          <w:rFonts w:ascii="Courier New" w:eastAsia="Times New Roman" w:hAnsi="Courier New" w:cs="Courier New"/>
+          <w:sz w:val="20"/>
+          <w:szCs w:val="20"/>
+          <w:lang w:eastAsia="en-IN"/>
+        </w:rPr>
+        <w:t xml:space="preserve">        ),</w:t>
+      </w:r>
+    </w:p>
+    <w:p>
+      <w:pPr>
+        <w:rPr>
+          <w:rFonts w:ascii="Courier New" w:eastAsia="Times New Roman" w:hAnsi="Courier New" w:cs="Courier New"/>
+          <w:sz w:val="20"/>
+          <w:szCs w:val="20"/>
+          <w:lang w:eastAsia="en-IN"/>
+        </w:rPr>
+      </w:pPr>
+      <w:r>
+        <w:rPr>
+          <w:rFonts w:ascii="Courier New" w:eastAsia="Times New Roman" w:hAnsi="Courier New" w:cs="Courier New"/>
+          <w:sz w:val="20"/>
+          <w:szCs w:val="20"/>
+          <w:lang w:eastAsia="en-IN"/>
+        </w:rPr>
+        <w:t xml:space="preserve">        (</w:t>
+      </w:r>
+    </w:p>
+    <w:p>
+      <w:pPr>
+        <w:rPr>
+          <w:rFonts w:ascii="Courier New" w:eastAsia="Times New Roman" w:hAnsi="Courier New" w:cs="Courier New"/>
+          <w:sz w:val="20"/>
+          <w:szCs w:val="20"/>
+          <w:lang w:eastAsia="en-IN"/>
+        </w:rPr>
+      </w:pPr>
+      <w:r>
+        <w:rPr>
+          <w:rFonts w:ascii="Courier New" w:eastAsia="Times New Roman" w:hAnsi="Courier New" w:cs="Courier New"/>
+          <w:sz w:val="20"/>
+          <w:szCs w:val="20"/>
+          <w:lang w:eastAsia="en-IN"/>
+        </w:rPr>
+        <w:t xml:space="preserve">            '</w:t>
       </w:r>
       <w:proofErr w:type="gramStart"/>
       <w:r>
@@ -1864,7 +2265,7 @@
           <w:szCs w:val="20"/>
           <w:lang w:eastAsia="en-IN"/>
         </w:rPr>
-        <w:t>entity</w:t>
+        <w:t>prod</w:t>
       </w:r>
       <w:proofErr w:type="gramEnd"/>
       <w:r>
@@ -1874,45 +2275,121 @@
           <w:szCs w:val="20"/>
           <w:lang w:eastAsia="en-IN"/>
         </w:rPr>
-        <w:t>-status-product-active',</w:t>
-      </w:r>
-    </w:p>
-    <w:p>
-      <w:pPr>
-        <w:rPr>
-          <w:rFonts w:ascii="Courier New" w:eastAsia="Times New Roman" w:hAnsi="Courier New" w:cs="Courier New"/>
-          <w:sz w:val="20"/>
-          <w:szCs w:val="20"/>
-          <w:lang w:eastAsia="en-IN"/>
-        </w:rPr>
-      </w:pPr>
-      <w:r>
-        <w:rPr>
-          <w:rFonts w:ascii="Courier New" w:eastAsia="Times New Roman" w:hAnsi="Courier New" w:cs="Courier New"/>
-          <w:sz w:val="20"/>
-          <w:szCs w:val="20"/>
-          <w:lang w:eastAsia="en-IN"/>
-        </w:rPr>
-        <w:t xml:space="preserve">    CURRENT_TIMESTAMP,</w:t>
-      </w:r>
-    </w:p>
-    <w:p>
-      <w:pPr>
-        <w:rPr>
-          <w:rFonts w:ascii="Courier New" w:eastAsia="Times New Roman" w:hAnsi="Courier New" w:cs="Courier New"/>
-          <w:sz w:val="20"/>
-          <w:szCs w:val="20"/>
-          <w:lang w:eastAsia="en-IN"/>
-        </w:rPr>
-      </w:pPr>
-      <w:r>
-        <w:rPr>
-          <w:rFonts w:ascii="Courier New" w:eastAsia="Times New Roman" w:hAnsi="Courier New" w:cs="Courier New"/>
-          <w:sz w:val="20"/>
-          <w:szCs w:val="20"/>
-          <w:lang w:eastAsia="en-IN"/>
-        </w:rPr>
-        <w:t xml:space="preserve">    </w:t>
+        <w:t>-ece1-butter-croissant',</w:t>
+      </w:r>
+    </w:p>
+    <w:p>
+      <w:pPr>
+        <w:rPr>
+          <w:rFonts w:ascii="Courier New" w:eastAsia="Times New Roman" w:hAnsi="Courier New" w:cs="Courier New"/>
+          <w:sz w:val="20"/>
+          <w:szCs w:val="20"/>
+          <w:lang w:eastAsia="en-IN"/>
+        </w:rPr>
+      </w:pPr>
+      <w:r>
+        <w:rPr>
+          <w:rFonts w:ascii="Courier New" w:eastAsia="Times New Roman" w:hAnsi="Courier New" w:cs="Courier New"/>
+          <w:sz w:val="20"/>
+          <w:szCs w:val="20"/>
+          <w:lang w:eastAsia="en-IN"/>
+        </w:rPr>
+        <w:t xml:space="preserve">            'ECE1-BUTTER-CROISSANT',</w:t>
+      </w:r>
+    </w:p>
+    <w:p>
+      <w:pPr>
+        <w:rPr>
+          <w:rFonts w:ascii="Courier New" w:eastAsia="Times New Roman" w:hAnsi="Courier New" w:cs="Courier New"/>
+          <w:sz w:val="20"/>
+          <w:szCs w:val="20"/>
+          <w:lang w:eastAsia="en-IN"/>
+        </w:rPr>
+      </w:pPr>
+      <w:r>
+        <w:rPr>
+          <w:rFonts w:ascii="Courier New" w:eastAsia="Times New Roman" w:hAnsi="Courier New" w:cs="Courier New"/>
+          <w:sz w:val="20"/>
+          <w:szCs w:val="20"/>
+          <w:lang w:eastAsia="en-IN"/>
+        </w:rPr>
+        <w:t xml:space="preserve">            'Butter Croissant',</w:t>
+      </w:r>
+    </w:p>
+    <w:p>
+      <w:pPr>
+        <w:rPr>
+          <w:rFonts w:ascii="Courier New" w:eastAsia="Times New Roman" w:hAnsi="Courier New" w:cs="Courier New"/>
+          <w:sz w:val="20"/>
+          <w:szCs w:val="20"/>
+          <w:lang w:eastAsia="en-IN"/>
+        </w:rPr>
+      </w:pPr>
+      <w:r>
+        <w:rPr>
+          <w:rFonts w:ascii="Courier New" w:eastAsia="Times New Roman" w:hAnsi="Courier New" w:cs="Courier New"/>
+          <w:sz w:val="20"/>
+          <w:szCs w:val="20"/>
+          <w:lang w:eastAsia="en-IN"/>
+        </w:rPr>
+        <w:t xml:space="preserve">            'Fresh butter croissant.'</w:t>
+      </w:r>
+    </w:p>
+    <w:p>
+      <w:pPr>
+        <w:rPr>
+          <w:rFonts w:ascii="Courier New" w:eastAsia="Times New Roman" w:hAnsi="Courier New" w:cs="Courier New"/>
+          <w:sz w:val="20"/>
+          <w:szCs w:val="20"/>
+          <w:lang w:eastAsia="en-IN"/>
+        </w:rPr>
+      </w:pPr>
+      <w:r>
+        <w:rPr>
+          <w:rFonts w:ascii="Courier New" w:eastAsia="Times New Roman" w:hAnsi="Courier New" w:cs="Courier New"/>
+          <w:sz w:val="20"/>
+          <w:szCs w:val="20"/>
+          <w:lang w:eastAsia="en-IN"/>
+        </w:rPr>
+        <w:t xml:space="preserve">        ),</w:t>
+      </w:r>
+    </w:p>
+    <w:p>
+      <w:pPr>
+        <w:rPr>
+          <w:rFonts w:ascii="Courier New" w:eastAsia="Times New Roman" w:hAnsi="Courier New" w:cs="Courier New"/>
+          <w:sz w:val="20"/>
+          <w:szCs w:val="20"/>
+          <w:lang w:eastAsia="en-IN"/>
+        </w:rPr>
+      </w:pPr>
+      <w:r>
+        <w:rPr>
+          <w:rFonts w:ascii="Courier New" w:eastAsia="Times New Roman" w:hAnsi="Courier New" w:cs="Courier New"/>
+          <w:sz w:val="20"/>
+          <w:szCs w:val="20"/>
+          <w:lang w:eastAsia="en-IN"/>
+        </w:rPr>
+        <w:t xml:space="preserve">        (</w:t>
+      </w:r>
+    </w:p>
+    <w:p>
+      <w:pPr>
+        <w:rPr>
+          <w:rFonts w:ascii="Courier New" w:eastAsia="Times New Roman" w:hAnsi="Courier New" w:cs="Courier New"/>
+          <w:sz w:val="20"/>
+          <w:szCs w:val="20"/>
+          <w:lang w:eastAsia="en-IN"/>
+        </w:rPr>
+      </w:pPr>
+      <w:r>
+        <w:rPr>
+          <w:rFonts w:ascii="Courier New" w:eastAsia="Times New Roman" w:hAnsi="Courier New" w:cs="Courier New"/>
+          <w:sz w:val="20"/>
+          <w:szCs w:val="20"/>
+          <w:lang w:eastAsia="en-IN"/>
+        </w:rPr>
+        <w:t xml:space="preserve">            '</w:t>
       </w:r>
       <w:proofErr w:type="gramStart"/>
       <w:r>
@@ -1922,7 +2399,7 @@
           <w:szCs w:val="20"/>
           <w:lang w:eastAsia="en-IN"/>
         </w:rPr>
-        <w:t>o.updated</w:t>
+        <w:t>prod</w:t>
       </w:r>
       <w:proofErr w:type="gramEnd"/>
       <w:r>
@@ -1932,45 +2409,121 @@
           <w:szCs w:val="20"/>
           <w:lang w:eastAsia="en-IN"/>
         </w:rPr>
-        <w:t>_by,</w:t>
-      </w:r>
-    </w:p>
-    <w:p>
-      <w:pPr>
-        <w:rPr>
-          <w:rFonts w:ascii="Courier New" w:eastAsia="Times New Roman" w:hAnsi="Courier New" w:cs="Courier New"/>
-          <w:sz w:val="20"/>
-          <w:szCs w:val="20"/>
-          <w:lang w:eastAsia="en-IN"/>
-        </w:rPr>
-      </w:pPr>
-      <w:r>
-        <w:rPr>
-          <w:rFonts w:ascii="Courier New" w:eastAsia="Times New Roman" w:hAnsi="Courier New" w:cs="Courier New"/>
-          <w:sz w:val="20"/>
-          <w:szCs w:val="20"/>
-          <w:lang w:eastAsia="en-IN"/>
-        </w:rPr>
-        <w:t xml:space="preserve">    CURRENT_TIMESTAMP,</w:t>
-      </w:r>
-    </w:p>
-    <w:p>
-      <w:pPr>
-        <w:rPr>
-          <w:rFonts w:ascii="Courier New" w:eastAsia="Times New Roman" w:hAnsi="Courier New" w:cs="Courier New"/>
-          <w:sz w:val="20"/>
-          <w:szCs w:val="20"/>
-          <w:lang w:eastAsia="en-IN"/>
-        </w:rPr>
-      </w:pPr>
-      <w:r>
-        <w:rPr>
-          <w:rFonts w:ascii="Courier New" w:eastAsia="Times New Roman" w:hAnsi="Courier New" w:cs="Courier New"/>
-          <w:sz w:val="20"/>
-          <w:szCs w:val="20"/>
-          <w:lang w:eastAsia="en-IN"/>
-        </w:rPr>
-        <w:t xml:space="preserve">    </w:t>
+        <w:t>-ece1-choc-cookie',</w:t>
+      </w:r>
+    </w:p>
+    <w:p>
+      <w:pPr>
+        <w:rPr>
+          <w:rFonts w:ascii="Courier New" w:eastAsia="Times New Roman" w:hAnsi="Courier New" w:cs="Courier New"/>
+          <w:sz w:val="20"/>
+          <w:szCs w:val="20"/>
+          <w:lang w:eastAsia="en-IN"/>
+        </w:rPr>
+      </w:pPr>
+      <w:r>
+        <w:rPr>
+          <w:rFonts w:ascii="Courier New" w:eastAsia="Times New Roman" w:hAnsi="Courier New" w:cs="Courier New"/>
+          <w:sz w:val="20"/>
+          <w:szCs w:val="20"/>
+          <w:lang w:eastAsia="en-IN"/>
+        </w:rPr>
+        <w:t xml:space="preserve">            'ECE1-CHOC-COOKIE',</w:t>
+      </w:r>
+    </w:p>
+    <w:p>
+      <w:pPr>
+        <w:rPr>
+          <w:rFonts w:ascii="Courier New" w:eastAsia="Times New Roman" w:hAnsi="Courier New" w:cs="Courier New"/>
+          <w:sz w:val="20"/>
+          <w:szCs w:val="20"/>
+          <w:lang w:eastAsia="en-IN"/>
+        </w:rPr>
+      </w:pPr>
+      <w:r>
+        <w:rPr>
+          <w:rFonts w:ascii="Courier New" w:eastAsia="Times New Roman" w:hAnsi="Courier New" w:cs="Courier New"/>
+          <w:sz w:val="20"/>
+          <w:szCs w:val="20"/>
+          <w:lang w:eastAsia="en-IN"/>
+        </w:rPr>
+        <w:t xml:space="preserve">            'Chocolate Cookie',</w:t>
+      </w:r>
+    </w:p>
+    <w:p>
+      <w:pPr>
+        <w:rPr>
+          <w:rFonts w:ascii="Courier New" w:eastAsia="Times New Roman" w:hAnsi="Courier New" w:cs="Courier New"/>
+          <w:sz w:val="20"/>
+          <w:szCs w:val="20"/>
+          <w:lang w:eastAsia="en-IN"/>
+        </w:rPr>
+      </w:pPr>
+      <w:r>
+        <w:rPr>
+          <w:rFonts w:ascii="Courier New" w:eastAsia="Times New Roman" w:hAnsi="Courier New" w:cs="Courier New"/>
+          <w:sz w:val="20"/>
+          <w:szCs w:val="20"/>
+          <w:lang w:eastAsia="en-IN"/>
+        </w:rPr>
+        <w:t xml:space="preserve">            'Chocolate cookie.'</w:t>
+      </w:r>
+    </w:p>
+    <w:p>
+      <w:pPr>
+        <w:rPr>
+          <w:rFonts w:ascii="Courier New" w:eastAsia="Times New Roman" w:hAnsi="Courier New" w:cs="Courier New"/>
+          <w:sz w:val="20"/>
+          <w:szCs w:val="20"/>
+          <w:lang w:eastAsia="en-IN"/>
+        </w:rPr>
+      </w:pPr>
+      <w:r>
+        <w:rPr>
+          <w:rFonts w:ascii="Courier New" w:eastAsia="Times New Roman" w:hAnsi="Courier New" w:cs="Courier New"/>
+          <w:sz w:val="20"/>
+          <w:szCs w:val="20"/>
+          <w:lang w:eastAsia="en-IN"/>
+        </w:rPr>
+        <w:t xml:space="preserve">        ),</w:t>
+      </w:r>
+    </w:p>
+    <w:p>
+      <w:pPr>
+        <w:rPr>
+          <w:rFonts w:ascii="Courier New" w:eastAsia="Times New Roman" w:hAnsi="Courier New" w:cs="Courier New"/>
+          <w:sz w:val="20"/>
+          <w:szCs w:val="20"/>
+          <w:lang w:eastAsia="en-IN"/>
+        </w:rPr>
+      </w:pPr>
+      <w:r>
+        <w:rPr>
+          <w:rFonts w:ascii="Courier New" w:eastAsia="Times New Roman" w:hAnsi="Courier New" w:cs="Courier New"/>
+          <w:sz w:val="20"/>
+          <w:szCs w:val="20"/>
+          <w:lang w:eastAsia="en-IN"/>
+        </w:rPr>
+        <w:t xml:space="preserve">        (</w:t>
+      </w:r>
+    </w:p>
+    <w:p>
+      <w:pPr>
+        <w:rPr>
+          <w:rFonts w:ascii="Courier New" w:eastAsia="Times New Roman" w:hAnsi="Courier New" w:cs="Courier New"/>
+          <w:sz w:val="20"/>
+          <w:szCs w:val="20"/>
+          <w:lang w:eastAsia="en-IN"/>
+        </w:rPr>
+      </w:pPr>
+      <w:r>
+        <w:rPr>
+          <w:rFonts w:ascii="Courier New" w:eastAsia="Times New Roman" w:hAnsi="Courier New" w:cs="Courier New"/>
+          <w:sz w:val="20"/>
+          <w:szCs w:val="20"/>
+          <w:lang w:eastAsia="en-IN"/>
+        </w:rPr>
+        <w:t xml:space="preserve">            '</w:t>
       </w:r>
       <w:proofErr w:type="gramStart"/>
       <w:r>
@@ -1980,7 +2533,7 @@
           <w:szCs w:val="20"/>
           <w:lang w:eastAsia="en-IN"/>
         </w:rPr>
-        <w:t>o.updated</w:t>
+        <w:t>prod</w:t>
       </w:r>
       <w:proofErr w:type="gramEnd"/>
       <w:r>
@@ -1990,83 +2543,83 @@
           <w:szCs w:val="20"/>
           <w:lang w:eastAsia="en-IN"/>
         </w:rPr>
-        <w:t>_by,</w:t>
-      </w:r>
-    </w:p>
-    <w:p>
-      <w:pPr>
-        <w:rPr>
-          <w:rFonts w:ascii="Courier New" w:eastAsia="Times New Roman" w:hAnsi="Courier New" w:cs="Courier New"/>
-          <w:sz w:val="20"/>
-          <w:szCs w:val="20"/>
-          <w:lang w:eastAsia="en-IN"/>
-        </w:rPr>
-      </w:pPr>
-      <w:r>
-        <w:rPr>
-          <w:rFonts w:ascii="Courier New" w:eastAsia="Times New Roman" w:hAnsi="Courier New" w:cs="Courier New"/>
-          <w:sz w:val="20"/>
-          <w:szCs w:val="20"/>
-          <w:lang w:eastAsia="en-IN"/>
-        </w:rPr>
-        <w:t xml:space="preserve">    FALSE,</w:t>
-      </w:r>
-    </w:p>
-    <w:p>
-      <w:pPr>
-        <w:rPr>
-          <w:rFonts w:ascii="Courier New" w:eastAsia="Times New Roman" w:hAnsi="Courier New" w:cs="Courier New"/>
-          <w:sz w:val="20"/>
-          <w:szCs w:val="20"/>
-          <w:lang w:eastAsia="en-IN"/>
-        </w:rPr>
-      </w:pPr>
-      <w:r>
-        <w:rPr>
-          <w:rFonts w:ascii="Courier New" w:eastAsia="Times New Roman" w:hAnsi="Courier New" w:cs="Courier New"/>
-          <w:sz w:val="20"/>
-          <w:szCs w:val="20"/>
-          <w:lang w:eastAsia="en-IN"/>
-        </w:rPr>
-        <w:t xml:space="preserve">    1</w:t>
-      </w:r>
-    </w:p>
-    <w:p>
-      <w:pPr>
-        <w:rPr>
-          <w:rFonts w:ascii="Courier New" w:eastAsia="Times New Roman" w:hAnsi="Courier New" w:cs="Courier New"/>
-          <w:sz w:val="20"/>
-          <w:szCs w:val="20"/>
-          <w:lang w:eastAsia="en-IN"/>
-        </w:rPr>
-      </w:pPr>
-      <w:r>
-        <w:rPr>
-          <w:rFonts w:ascii="Courier New" w:eastAsia="Times New Roman" w:hAnsi="Courier New" w:cs="Courier New"/>
-          <w:sz w:val="20"/>
-          <w:szCs w:val="20"/>
-          <w:lang w:eastAsia="en-IN"/>
-        </w:rPr>
-        <w:t>FROM (</w:t>
-      </w:r>
-    </w:p>
-    <w:p>
-      <w:pPr>
-        <w:rPr>
-          <w:rFonts w:ascii="Courier New" w:eastAsia="Times New Roman" w:hAnsi="Courier New" w:cs="Courier New"/>
-          <w:sz w:val="20"/>
-          <w:szCs w:val="20"/>
-          <w:lang w:eastAsia="en-IN"/>
-        </w:rPr>
-      </w:pPr>
-      <w:r>
-        <w:rPr>
-          <w:rFonts w:ascii="Courier New" w:eastAsia="Times New Roman" w:hAnsi="Courier New" w:cs="Courier New"/>
-          <w:sz w:val="20"/>
-          <w:szCs w:val="20"/>
-          <w:lang w:eastAsia="en-IN"/>
-        </w:rPr>
-        <w:t xml:space="preserve">    VALUES</w:t>
+        <w:t>-ece1-caffe-latte',</w:t>
+      </w:r>
+    </w:p>
+    <w:p>
+      <w:pPr>
+        <w:rPr>
+          <w:rFonts w:ascii="Courier New" w:eastAsia="Times New Roman" w:hAnsi="Courier New" w:cs="Courier New"/>
+          <w:sz w:val="20"/>
+          <w:szCs w:val="20"/>
+          <w:lang w:eastAsia="en-IN"/>
+        </w:rPr>
+      </w:pPr>
+      <w:r>
+        <w:rPr>
+          <w:rFonts w:ascii="Courier New" w:eastAsia="Times New Roman" w:hAnsi="Courier New" w:cs="Courier New"/>
+          <w:sz w:val="20"/>
+          <w:szCs w:val="20"/>
+          <w:lang w:eastAsia="en-IN"/>
+        </w:rPr>
+        <w:t xml:space="preserve">            'ECE1-CAFFE-LATTE',</w:t>
+      </w:r>
+    </w:p>
+    <w:p>
+      <w:pPr>
+        <w:rPr>
+          <w:rFonts w:ascii="Courier New" w:eastAsia="Times New Roman" w:hAnsi="Courier New" w:cs="Courier New"/>
+          <w:sz w:val="20"/>
+          <w:szCs w:val="20"/>
+          <w:lang w:eastAsia="en-IN"/>
+        </w:rPr>
+      </w:pPr>
+      <w:r>
+        <w:rPr>
+          <w:rFonts w:ascii="Courier New" w:eastAsia="Times New Roman" w:hAnsi="Courier New" w:cs="Courier New"/>
+          <w:sz w:val="20"/>
+          <w:szCs w:val="20"/>
+          <w:lang w:eastAsia="en-IN"/>
+        </w:rPr>
+        <w:t xml:space="preserve">            'Caffe Latte',</w:t>
+      </w:r>
+    </w:p>
+    <w:p>
+      <w:pPr>
+        <w:rPr>
+          <w:rFonts w:ascii="Courier New" w:eastAsia="Times New Roman" w:hAnsi="Courier New" w:cs="Courier New"/>
+          <w:sz w:val="20"/>
+          <w:szCs w:val="20"/>
+          <w:lang w:eastAsia="en-IN"/>
+        </w:rPr>
+      </w:pPr>
+      <w:r>
+        <w:rPr>
+          <w:rFonts w:ascii="Courier New" w:eastAsia="Times New Roman" w:hAnsi="Courier New" w:cs="Courier New"/>
+          <w:sz w:val="20"/>
+          <w:szCs w:val="20"/>
+          <w:lang w:eastAsia="en-IN"/>
+        </w:rPr>
+        <w:t xml:space="preserve">            'Freshly prepared caffe latte.'</w:t>
+      </w:r>
+    </w:p>
+    <w:p>
+      <w:pPr>
+        <w:rPr>
+          <w:rFonts w:ascii="Courier New" w:eastAsia="Times New Roman" w:hAnsi="Courier New" w:cs="Courier New"/>
+          <w:sz w:val="20"/>
+          <w:szCs w:val="20"/>
+          <w:lang w:eastAsia="en-IN"/>
+        </w:rPr>
+      </w:pPr>
+      <w:r>
+        <w:rPr>
+          <w:rFonts w:ascii="Courier New" w:eastAsia="Times New Roman" w:hAnsi="Courier New" w:cs="Courier New"/>
+          <w:sz w:val="20"/>
+          <w:szCs w:val="20"/>
+          <w:lang w:eastAsia="en-IN"/>
+        </w:rPr>
+        <w:t xml:space="preserve">        ),</w:t>
       </w:r>
     </w:p>
     <w:p>
@@ -2124,7 +2677,83 @@
           <w:szCs w:val="20"/>
           <w:lang w:eastAsia="en-IN"/>
         </w:rPr>
-        <w:t>-ece1-filter-coffee',</w:t>
+        <w:t>-ece1-caffe-mocha',</w:t>
+      </w:r>
+    </w:p>
+    <w:p>
+      <w:pPr>
+        <w:rPr>
+          <w:rFonts w:ascii="Courier New" w:eastAsia="Times New Roman" w:hAnsi="Courier New" w:cs="Courier New"/>
+          <w:sz w:val="20"/>
+          <w:szCs w:val="20"/>
+          <w:lang w:eastAsia="en-IN"/>
+        </w:rPr>
+      </w:pPr>
+      <w:r>
+        <w:rPr>
+          <w:rFonts w:ascii="Courier New" w:eastAsia="Times New Roman" w:hAnsi="Courier New" w:cs="Courier New"/>
+          <w:sz w:val="20"/>
+          <w:szCs w:val="20"/>
+          <w:lang w:eastAsia="en-IN"/>
+        </w:rPr>
+        <w:t xml:space="preserve">            'ECE1-CAFFE-MOCHA',</w:t>
+      </w:r>
+    </w:p>
+    <w:p>
+      <w:pPr>
+        <w:rPr>
+          <w:rFonts w:ascii="Courier New" w:eastAsia="Times New Roman" w:hAnsi="Courier New" w:cs="Courier New"/>
+          <w:sz w:val="20"/>
+          <w:szCs w:val="20"/>
+          <w:lang w:eastAsia="en-IN"/>
+        </w:rPr>
+      </w:pPr>
+      <w:r>
+        <w:rPr>
+          <w:rFonts w:ascii="Courier New" w:eastAsia="Times New Roman" w:hAnsi="Courier New" w:cs="Courier New"/>
+          <w:sz w:val="20"/>
+          <w:szCs w:val="20"/>
+          <w:lang w:eastAsia="en-IN"/>
+        </w:rPr>
+        <w:t xml:space="preserve">            'Caffe Mocha',</w:t>
+      </w:r>
+    </w:p>
+    <w:p>
+      <w:pPr>
+        <w:rPr>
+          <w:rFonts w:ascii="Courier New" w:eastAsia="Times New Roman" w:hAnsi="Courier New" w:cs="Courier New"/>
+          <w:sz w:val="20"/>
+          <w:szCs w:val="20"/>
+          <w:lang w:eastAsia="en-IN"/>
+        </w:rPr>
+      </w:pPr>
+      <w:r>
+        <w:rPr>
+          <w:rFonts w:ascii="Courier New" w:eastAsia="Times New Roman" w:hAnsi="Courier New" w:cs="Courier New"/>
+          <w:sz w:val="20"/>
+          <w:szCs w:val="20"/>
+          <w:lang w:eastAsia="en-IN"/>
+        </w:rPr>
+        <w:t xml:space="preserve">            'Freshly prepared caffe mocha.'</w:t>
+      </w:r>
+    </w:p>
+    <w:p>
+      <w:pPr>
+        <w:rPr>
+          <w:rFonts w:ascii="Courier New" w:eastAsia="Times New Roman" w:hAnsi="Courier New" w:cs="Courier New"/>
+          <w:sz w:val="20"/>
+          <w:szCs w:val="20"/>
+          <w:lang w:eastAsia="en-IN"/>
+        </w:rPr>
+      </w:pPr>
+      <w:r>
+        <w:rPr>
+          <w:rFonts w:ascii="Courier New" w:eastAsia="Times New Roman" w:hAnsi="Courier New" w:cs="Courier New"/>
+          <w:sz w:val="20"/>
+          <w:szCs w:val="20"/>
+          <w:lang w:eastAsia="en-IN"/>
+        </w:rPr>
+        <w:t xml:space="preserve">        )</w:t>
       </w:r>
     </w:p>
     <w:p>
@@ -2144,102 +2773,7 @@
           <w:lang w:eastAsia="en-IN"/>
         </w:rPr>
         <w:lastRenderedPageBreak/>
-        <w:t xml:space="preserve">            'ECE1-FILTER-COFFEE',</w:t>
-      </w:r>
-    </w:p>
-    <w:p>
-      <w:pPr>
-        <w:rPr>
-          <w:rFonts w:ascii="Courier New" w:eastAsia="Times New Roman" w:hAnsi="Courier New" w:cs="Courier New"/>
-          <w:sz w:val="20"/>
-          <w:szCs w:val="20"/>
-          <w:lang w:eastAsia="en-IN"/>
-        </w:rPr>
-      </w:pPr>
-      <w:r>
-        <w:rPr>
-          <w:rFonts w:ascii="Courier New" w:eastAsia="Times New Roman" w:hAnsi="Courier New" w:cs="Courier New"/>
-          <w:sz w:val="20"/>
-          <w:szCs w:val="20"/>
-          <w:lang w:eastAsia="en-IN"/>
-        </w:rPr>
-        <w:t xml:space="preserve">            'Filter Coffee',</w:t>
-      </w:r>
-    </w:p>
-    <w:p>
-      <w:pPr>
-        <w:rPr>
-          <w:rFonts w:ascii="Courier New" w:eastAsia="Times New Roman" w:hAnsi="Courier New" w:cs="Courier New"/>
-          <w:sz w:val="20"/>
-          <w:szCs w:val="20"/>
-          <w:lang w:eastAsia="en-IN"/>
-        </w:rPr>
-      </w:pPr>
-      <w:r>
-        <w:rPr>
-          <w:rFonts w:ascii="Courier New" w:eastAsia="Times New Roman" w:hAnsi="Courier New" w:cs="Courier New"/>
-          <w:sz w:val="20"/>
-          <w:szCs w:val="20"/>
-          <w:lang w:eastAsia="en-IN"/>
-        </w:rPr>
-        <w:t xml:space="preserve">            'Freshly prepared filter coffee.'</w:t>
-      </w:r>
-    </w:p>
-    <w:p>
-      <w:pPr>
-        <w:rPr>
-          <w:rFonts w:ascii="Courier New" w:eastAsia="Times New Roman" w:hAnsi="Courier New" w:cs="Courier New"/>
-          <w:sz w:val="20"/>
-          <w:szCs w:val="20"/>
-          <w:lang w:eastAsia="en-IN"/>
-        </w:rPr>
-      </w:pPr>
-      <w:r>
-        <w:rPr>
-          <w:rFonts w:ascii="Courier New" w:eastAsia="Times New Roman" w:hAnsi="Courier New" w:cs="Courier New"/>
-          <w:sz w:val="20"/>
-          <w:szCs w:val="20"/>
-          <w:lang w:eastAsia="en-IN"/>
-        </w:rPr>
-        <w:t xml:space="preserve">        ),</w:t>
-      </w:r>
-    </w:p>
-    <w:p>
-      <w:pPr>
-        <w:rPr>
-          <w:rFonts w:ascii="Courier New" w:eastAsia="Times New Roman" w:hAnsi="Courier New" w:cs="Courier New"/>
-          <w:sz w:val="20"/>
-          <w:szCs w:val="20"/>
-          <w:lang w:eastAsia="en-IN"/>
-        </w:rPr>
-      </w:pPr>
-      <w:r>
-        <w:rPr>
-          <w:rFonts w:ascii="Courier New" w:eastAsia="Times New Roman" w:hAnsi="Courier New" w:cs="Courier New"/>
-          <w:sz w:val="20"/>
-          <w:szCs w:val="20"/>
-          <w:lang w:eastAsia="en-IN"/>
-        </w:rPr>
-        <w:t xml:space="preserve">        (</w:t>
-      </w:r>
-    </w:p>
-    <w:p>
-      <w:pPr>
-        <w:rPr>
-          <w:rFonts w:ascii="Courier New" w:eastAsia="Times New Roman" w:hAnsi="Courier New" w:cs="Courier New"/>
-          <w:sz w:val="20"/>
-          <w:szCs w:val="20"/>
-          <w:lang w:eastAsia="en-IN"/>
-        </w:rPr>
-      </w:pPr>
-      <w:r>
-        <w:rPr>
-          <w:rFonts w:ascii="Courier New" w:eastAsia="Times New Roman" w:hAnsi="Courier New" w:cs="Courier New"/>
-          <w:sz w:val="20"/>
-          <w:szCs w:val="20"/>
-          <w:lang w:eastAsia="en-IN"/>
-        </w:rPr>
-        <w:t xml:space="preserve">            '</w:t>
+        <w:t xml:space="preserve">) AS </w:t>
       </w:r>
       <w:proofErr w:type="gramStart"/>
       <w:r>
@@ -2249,7 +2783,7 @@
           <w:szCs w:val="20"/>
           <w:lang w:eastAsia="en-IN"/>
         </w:rPr>
-        <w:t>prod</w:t>
+        <w:t>v(</w:t>
       </w:r>
       <w:proofErr w:type="gramEnd"/>
       <w:r>
@@ -2259,121 +2793,26 @@
           <w:szCs w:val="20"/>
           <w:lang w:eastAsia="en-IN"/>
         </w:rPr>
-        <w:t>-ece1-butter-croissant',</w:t>
-      </w:r>
-    </w:p>
-    <w:p>
-      <w:pPr>
-        <w:rPr>
-          <w:rFonts w:ascii="Courier New" w:eastAsia="Times New Roman" w:hAnsi="Courier New" w:cs="Courier New"/>
-          <w:sz w:val="20"/>
-          <w:szCs w:val="20"/>
-          <w:lang w:eastAsia="en-IN"/>
-        </w:rPr>
-      </w:pPr>
-      <w:r>
-        <w:rPr>
-          <w:rFonts w:ascii="Courier New" w:eastAsia="Times New Roman" w:hAnsi="Courier New" w:cs="Courier New"/>
-          <w:sz w:val="20"/>
-          <w:szCs w:val="20"/>
-          <w:lang w:eastAsia="en-IN"/>
-        </w:rPr>
-        <w:t xml:space="preserve">            'ECE1-BUTTER-CROISSANT',</w:t>
-      </w:r>
-    </w:p>
-    <w:p>
-      <w:pPr>
-        <w:rPr>
-          <w:rFonts w:ascii="Courier New" w:eastAsia="Times New Roman" w:hAnsi="Courier New" w:cs="Courier New"/>
-          <w:sz w:val="20"/>
-          <w:szCs w:val="20"/>
-          <w:lang w:eastAsia="en-IN"/>
-        </w:rPr>
-      </w:pPr>
-      <w:r>
-        <w:rPr>
-          <w:rFonts w:ascii="Courier New" w:eastAsia="Times New Roman" w:hAnsi="Courier New" w:cs="Courier New"/>
-          <w:sz w:val="20"/>
-          <w:szCs w:val="20"/>
-          <w:lang w:eastAsia="en-IN"/>
-        </w:rPr>
-        <w:t xml:space="preserve">            'Butter Croissant',</w:t>
-      </w:r>
-    </w:p>
-    <w:p>
-      <w:pPr>
-        <w:rPr>
-          <w:rFonts w:ascii="Courier New" w:eastAsia="Times New Roman" w:hAnsi="Courier New" w:cs="Courier New"/>
-          <w:sz w:val="20"/>
-          <w:szCs w:val="20"/>
-          <w:lang w:eastAsia="en-IN"/>
-        </w:rPr>
-      </w:pPr>
-      <w:r>
-        <w:rPr>
-          <w:rFonts w:ascii="Courier New" w:eastAsia="Times New Roman" w:hAnsi="Courier New" w:cs="Courier New"/>
-          <w:sz w:val="20"/>
-          <w:szCs w:val="20"/>
-          <w:lang w:eastAsia="en-IN"/>
-        </w:rPr>
-        <w:t xml:space="preserve">            'Fresh butter croissant.'</w:t>
-      </w:r>
-    </w:p>
-    <w:p>
-      <w:pPr>
-        <w:rPr>
-          <w:rFonts w:ascii="Courier New" w:eastAsia="Times New Roman" w:hAnsi="Courier New" w:cs="Courier New"/>
-          <w:sz w:val="20"/>
-          <w:szCs w:val="20"/>
-          <w:lang w:eastAsia="en-IN"/>
-        </w:rPr>
-      </w:pPr>
-      <w:r>
-        <w:rPr>
-          <w:rFonts w:ascii="Courier New" w:eastAsia="Times New Roman" w:hAnsi="Courier New" w:cs="Courier New"/>
-          <w:sz w:val="20"/>
-          <w:szCs w:val="20"/>
-          <w:lang w:eastAsia="en-IN"/>
-        </w:rPr>
-        <w:t xml:space="preserve">        ),</w:t>
-      </w:r>
-    </w:p>
-    <w:p>
-      <w:pPr>
-        <w:rPr>
-          <w:rFonts w:ascii="Courier New" w:eastAsia="Times New Roman" w:hAnsi="Courier New" w:cs="Courier New"/>
-          <w:sz w:val="20"/>
-          <w:szCs w:val="20"/>
-          <w:lang w:eastAsia="en-IN"/>
-        </w:rPr>
-      </w:pPr>
-      <w:r>
-        <w:rPr>
-          <w:rFonts w:ascii="Courier New" w:eastAsia="Times New Roman" w:hAnsi="Courier New" w:cs="Courier New"/>
-          <w:sz w:val="20"/>
-          <w:szCs w:val="20"/>
-          <w:lang w:eastAsia="en-IN"/>
-        </w:rPr>
-        <w:t xml:space="preserve">        (</w:t>
-      </w:r>
-    </w:p>
-    <w:p>
-      <w:pPr>
-        <w:rPr>
-          <w:rFonts w:ascii="Courier New" w:eastAsia="Times New Roman" w:hAnsi="Courier New" w:cs="Courier New"/>
-          <w:sz w:val="20"/>
-          <w:szCs w:val="20"/>
-          <w:lang w:eastAsia="en-IN"/>
-        </w:rPr>
-      </w:pPr>
-      <w:r>
-        <w:rPr>
-          <w:rFonts w:ascii="Courier New" w:eastAsia="Times New Roman" w:hAnsi="Courier New" w:cs="Courier New"/>
-          <w:sz w:val="20"/>
-          <w:szCs w:val="20"/>
-          <w:lang w:eastAsia="en-IN"/>
-        </w:rPr>
-        <w:t xml:space="preserve">            '</w:t>
+        <w:t>product_id, product_code, product_name, description)</w:t>
+      </w:r>
+    </w:p>
+    <w:p>
+      <w:pPr>
+        <w:rPr>
+          <w:rFonts w:ascii="Courier New" w:eastAsia="Times New Roman" w:hAnsi="Courier New" w:cs="Courier New"/>
+          <w:sz w:val="20"/>
+          <w:szCs w:val="20"/>
+          <w:lang w:eastAsia="en-IN"/>
+        </w:rPr>
+      </w:pPr>
+      <w:r>
+        <w:rPr>
+          <w:rFonts w:ascii="Courier New" w:eastAsia="Times New Roman" w:hAnsi="Courier New" w:cs="Courier New"/>
+          <w:sz w:val="20"/>
+          <w:szCs w:val="20"/>
+          <w:lang w:eastAsia="en-IN"/>
+        </w:rPr>
+        <w:t xml:space="preserve">JOIN </w:t>
       </w:r>
       <w:proofErr w:type="gramStart"/>
       <w:r>
@@ -2383,7 +2822,7 @@
           <w:szCs w:val="20"/>
           <w:lang w:eastAsia="en-IN"/>
         </w:rPr>
-        <w:t>prod</w:t>
+        <w:t>memginedev.organization</w:t>
       </w:r>
       <w:proofErr w:type="gramEnd"/>
       <w:r>
@@ -2393,121 +2832,26 @@
           <w:szCs w:val="20"/>
           <w:lang w:eastAsia="en-IN"/>
         </w:rPr>
-        <w:t>-ece1-choc-cookie',</w:t>
-      </w:r>
-    </w:p>
-    <w:p>
-      <w:pPr>
-        <w:rPr>
-          <w:rFonts w:ascii="Courier New" w:eastAsia="Times New Roman" w:hAnsi="Courier New" w:cs="Courier New"/>
-          <w:sz w:val="20"/>
-          <w:szCs w:val="20"/>
-          <w:lang w:eastAsia="en-IN"/>
-        </w:rPr>
-      </w:pPr>
-      <w:r>
-        <w:rPr>
-          <w:rFonts w:ascii="Courier New" w:eastAsia="Times New Roman" w:hAnsi="Courier New" w:cs="Courier New"/>
-          <w:sz w:val="20"/>
-          <w:szCs w:val="20"/>
-          <w:lang w:eastAsia="en-IN"/>
-        </w:rPr>
-        <w:t xml:space="preserve">            'ECE1-CHOC-COOKIE',</w:t>
-      </w:r>
-    </w:p>
-    <w:p>
-      <w:pPr>
-        <w:rPr>
-          <w:rFonts w:ascii="Courier New" w:eastAsia="Times New Roman" w:hAnsi="Courier New" w:cs="Courier New"/>
-          <w:sz w:val="20"/>
-          <w:szCs w:val="20"/>
-          <w:lang w:eastAsia="en-IN"/>
-        </w:rPr>
-      </w:pPr>
-      <w:r>
-        <w:rPr>
-          <w:rFonts w:ascii="Courier New" w:eastAsia="Times New Roman" w:hAnsi="Courier New" w:cs="Courier New"/>
-          <w:sz w:val="20"/>
-          <w:szCs w:val="20"/>
-          <w:lang w:eastAsia="en-IN"/>
-        </w:rPr>
-        <w:t xml:space="preserve">            'Chocolate Cookie',</w:t>
-      </w:r>
-    </w:p>
-    <w:p>
-      <w:pPr>
-        <w:rPr>
-          <w:rFonts w:ascii="Courier New" w:eastAsia="Times New Roman" w:hAnsi="Courier New" w:cs="Courier New"/>
-          <w:sz w:val="20"/>
-          <w:szCs w:val="20"/>
-          <w:lang w:eastAsia="en-IN"/>
-        </w:rPr>
-      </w:pPr>
-      <w:r>
-        <w:rPr>
-          <w:rFonts w:ascii="Courier New" w:eastAsia="Times New Roman" w:hAnsi="Courier New" w:cs="Courier New"/>
-          <w:sz w:val="20"/>
-          <w:szCs w:val="20"/>
-          <w:lang w:eastAsia="en-IN"/>
-        </w:rPr>
-        <w:t xml:space="preserve">            'Chocolate cookie.'</w:t>
-      </w:r>
-    </w:p>
-    <w:p>
-      <w:pPr>
-        <w:rPr>
-          <w:rFonts w:ascii="Courier New" w:eastAsia="Times New Roman" w:hAnsi="Courier New" w:cs="Courier New"/>
-          <w:sz w:val="20"/>
-          <w:szCs w:val="20"/>
-          <w:lang w:eastAsia="en-IN"/>
-        </w:rPr>
-      </w:pPr>
-      <w:r>
-        <w:rPr>
-          <w:rFonts w:ascii="Courier New" w:eastAsia="Times New Roman" w:hAnsi="Courier New" w:cs="Courier New"/>
-          <w:sz w:val="20"/>
-          <w:szCs w:val="20"/>
-          <w:lang w:eastAsia="en-IN"/>
-        </w:rPr>
-        <w:t xml:space="preserve">        ),</w:t>
-      </w:r>
-    </w:p>
-    <w:p>
-      <w:pPr>
-        <w:rPr>
-          <w:rFonts w:ascii="Courier New" w:eastAsia="Times New Roman" w:hAnsi="Courier New" w:cs="Courier New"/>
-          <w:sz w:val="20"/>
-          <w:szCs w:val="20"/>
-          <w:lang w:eastAsia="en-IN"/>
-        </w:rPr>
-      </w:pPr>
-      <w:r>
-        <w:rPr>
-          <w:rFonts w:ascii="Courier New" w:eastAsia="Times New Roman" w:hAnsi="Courier New" w:cs="Courier New"/>
-          <w:sz w:val="20"/>
-          <w:szCs w:val="20"/>
-          <w:lang w:eastAsia="en-IN"/>
-        </w:rPr>
-        <w:t xml:space="preserve">        (</w:t>
-      </w:r>
-    </w:p>
-    <w:p>
-      <w:pPr>
-        <w:rPr>
-          <w:rFonts w:ascii="Courier New" w:eastAsia="Times New Roman" w:hAnsi="Courier New" w:cs="Courier New"/>
-          <w:sz w:val="20"/>
-          <w:szCs w:val="20"/>
-          <w:lang w:eastAsia="en-IN"/>
-        </w:rPr>
-      </w:pPr>
-      <w:r>
-        <w:rPr>
-          <w:rFonts w:ascii="Courier New" w:eastAsia="Times New Roman" w:hAnsi="Courier New" w:cs="Courier New"/>
-          <w:sz w:val="20"/>
-          <w:szCs w:val="20"/>
-          <w:lang w:eastAsia="en-IN"/>
-        </w:rPr>
-        <w:t xml:space="preserve">            '</w:t>
+        <w:t xml:space="preserve"> o</w:t>
+      </w:r>
+    </w:p>
+    <w:p>
+      <w:pPr>
+        <w:rPr>
+          <w:rFonts w:ascii="Courier New" w:eastAsia="Times New Roman" w:hAnsi="Courier New" w:cs="Courier New"/>
+          <w:sz w:val="20"/>
+          <w:szCs w:val="20"/>
+          <w:lang w:eastAsia="en-IN"/>
+        </w:rPr>
+      </w:pPr>
+      <w:r>
+        <w:rPr>
+          <w:rFonts w:ascii="Courier New" w:eastAsia="Times New Roman" w:hAnsi="Courier New" w:cs="Courier New"/>
+          <w:sz w:val="20"/>
+          <w:szCs w:val="20"/>
+          <w:lang w:eastAsia="en-IN"/>
+        </w:rPr>
+        <w:t xml:space="preserve">  ON </w:t>
       </w:r>
       <w:proofErr w:type="gramStart"/>
       <w:r>
@@ -2517,7 +2861,7 @@
           <w:szCs w:val="20"/>
           <w:lang w:eastAsia="en-IN"/>
         </w:rPr>
-        <w:t>prod</w:t>
+        <w:t>o.organization</w:t>
       </w:r>
       <w:proofErr w:type="gramEnd"/>
       <w:r>
@@ -2527,333 +2871,6 @@
           <w:szCs w:val="20"/>
           <w:lang w:eastAsia="en-IN"/>
         </w:rPr>
-        <w:t>-ece1-caffe-latte',</w:t>
-      </w:r>
-    </w:p>
-    <w:p>
-      <w:pPr>
-        <w:rPr>
-          <w:rFonts w:ascii="Courier New" w:eastAsia="Times New Roman" w:hAnsi="Courier New" w:cs="Courier New"/>
-          <w:sz w:val="20"/>
-          <w:szCs w:val="20"/>
-          <w:lang w:eastAsia="en-IN"/>
-        </w:rPr>
-      </w:pPr>
-      <w:r>
-        <w:rPr>
-          <w:rFonts w:ascii="Courier New" w:eastAsia="Times New Roman" w:hAnsi="Courier New" w:cs="Courier New"/>
-          <w:sz w:val="20"/>
-          <w:szCs w:val="20"/>
-          <w:lang w:eastAsia="en-IN"/>
-        </w:rPr>
-        <w:t xml:space="preserve">            'ECE1-CAFFE-LATTE',</w:t>
-      </w:r>
-    </w:p>
-    <w:p>
-      <w:pPr>
-        <w:rPr>
-          <w:rFonts w:ascii="Courier New" w:eastAsia="Times New Roman" w:hAnsi="Courier New" w:cs="Courier New"/>
-          <w:sz w:val="20"/>
-          <w:szCs w:val="20"/>
-          <w:lang w:eastAsia="en-IN"/>
-        </w:rPr>
-      </w:pPr>
-      <w:r>
-        <w:rPr>
-          <w:rFonts w:ascii="Courier New" w:eastAsia="Times New Roman" w:hAnsi="Courier New" w:cs="Courier New"/>
-          <w:sz w:val="20"/>
-          <w:szCs w:val="20"/>
-          <w:lang w:eastAsia="en-IN"/>
-        </w:rPr>
-        <w:t xml:space="preserve">            'Caffe Latte',</w:t>
-      </w:r>
-    </w:p>
-    <w:p>
-      <w:pPr>
-        <w:rPr>
-          <w:rFonts w:ascii="Courier New" w:eastAsia="Times New Roman" w:hAnsi="Courier New" w:cs="Courier New"/>
-          <w:sz w:val="20"/>
-          <w:szCs w:val="20"/>
-          <w:lang w:eastAsia="en-IN"/>
-        </w:rPr>
-      </w:pPr>
-      <w:r>
-        <w:rPr>
-          <w:rFonts w:ascii="Courier New" w:eastAsia="Times New Roman" w:hAnsi="Courier New" w:cs="Courier New"/>
-          <w:sz w:val="20"/>
-          <w:szCs w:val="20"/>
-          <w:lang w:eastAsia="en-IN"/>
-        </w:rPr>
-        <w:t xml:space="preserve">            'Freshly prepared caffe latte.'</w:t>
-      </w:r>
-    </w:p>
-    <w:p>
-      <w:pPr>
-        <w:rPr>
-          <w:rFonts w:ascii="Courier New" w:eastAsia="Times New Roman" w:hAnsi="Courier New" w:cs="Courier New"/>
-          <w:sz w:val="20"/>
-          <w:szCs w:val="20"/>
-          <w:lang w:eastAsia="en-IN"/>
-        </w:rPr>
-      </w:pPr>
-      <w:r>
-        <w:rPr>
-          <w:rFonts w:ascii="Courier New" w:eastAsia="Times New Roman" w:hAnsi="Courier New" w:cs="Courier New"/>
-          <w:sz w:val="20"/>
-          <w:szCs w:val="20"/>
-          <w:lang w:eastAsia="en-IN"/>
-        </w:rPr>
-        <w:t xml:space="preserve">        ),</w:t>
-      </w:r>
-    </w:p>
-    <w:p>
-      <w:pPr>
-        <w:rPr>
-          <w:rFonts w:ascii="Courier New" w:eastAsia="Times New Roman" w:hAnsi="Courier New" w:cs="Courier New"/>
-          <w:sz w:val="20"/>
-          <w:szCs w:val="20"/>
-          <w:lang w:eastAsia="en-IN"/>
-        </w:rPr>
-      </w:pPr>
-      <w:r>
-        <w:rPr>
-          <w:rFonts w:ascii="Courier New" w:eastAsia="Times New Roman" w:hAnsi="Courier New" w:cs="Courier New"/>
-          <w:sz w:val="20"/>
-          <w:szCs w:val="20"/>
-          <w:lang w:eastAsia="en-IN"/>
-        </w:rPr>
-        <w:t xml:space="preserve">        (</w:t>
-      </w:r>
-    </w:p>
-    <w:p>
-      <w:pPr>
-        <w:rPr>
-          <w:rFonts w:ascii="Courier New" w:eastAsia="Times New Roman" w:hAnsi="Courier New" w:cs="Courier New"/>
-          <w:sz w:val="20"/>
-          <w:szCs w:val="20"/>
-          <w:lang w:eastAsia="en-IN"/>
-        </w:rPr>
-      </w:pPr>
-      <w:r>
-        <w:rPr>
-          <w:rFonts w:ascii="Courier New" w:eastAsia="Times New Roman" w:hAnsi="Courier New" w:cs="Courier New"/>
-          <w:sz w:val="20"/>
-          <w:szCs w:val="20"/>
-          <w:lang w:eastAsia="en-IN"/>
-        </w:rPr>
-        <w:t xml:space="preserve">            '</w:t>
-      </w:r>
-      <w:proofErr w:type="gramStart"/>
-      <w:r>
-        <w:rPr>
-          <w:rFonts w:ascii="Courier New" w:eastAsia="Times New Roman" w:hAnsi="Courier New" w:cs="Courier New"/>
-          <w:sz w:val="20"/>
-          <w:szCs w:val="20"/>
-          <w:lang w:eastAsia="en-IN"/>
-        </w:rPr>
-        <w:t>prod</w:t>
-      </w:r>
-      <w:proofErr w:type="gramEnd"/>
-      <w:r>
-        <w:rPr>
-          <w:rFonts w:ascii="Courier New" w:eastAsia="Times New Roman" w:hAnsi="Courier New" w:cs="Courier New"/>
-          <w:sz w:val="20"/>
-          <w:szCs w:val="20"/>
-          <w:lang w:eastAsia="en-IN"/>
-        </w:rPr>
-        <w:t>-ece1-caffe-mocha',</w:t>
-      </w:r>
-    </w:p>
-    <w:p>
-      <w:pPr>
-        <w:rPr>
-          <w:rFonts w:ascii="Courier New" w:eastAsia="Times New Roman" w:hAnsi="Courier New" w:cs="Courier New"/>
-          <w:sz w:val="20"/>
-          <w:szCs w:val="20"/>
-          <w:lang w:eastAsia="en-IN"/>
-        </w:rPr>
-      </w:pPr>
-      <w:r>
-        <w:rPr>
-          <w:rFonts w:ascii="Courier New" w:eastAsia="Times New Roman" w:hAnsi="Courier New" w:cs="Courier New"/>
-          <w:sz w:val="20"/>
-          <w:szCs w:val="20"/>
-          <w:lang w:eastAsia="en-IN"/>
-        </w:rPr>
-        <w:t xml:space="preserve">            'ECE1-CAFFE-MOCHA',</w:t>
-      </w:r>
-    </w:p>
-    <w:p>
-      <w:pPr>
-        <w:rPr>
-          <w:rFonts w:ascii="Courier New" w:eastAsia="Times New Roman" w:hAnsi="Courier New" w:cs="Courier New"/>
-          <w:sz w:val="20"/>
-          <w:szCs w:val="20"/>
-          <w:lang w:eastAsia="en-IN"/>
-        </w:rPr>
-      </w:pPr>
-      <w:r>
-        <w:rPr>
-          <w:rFonts w:ascii="Courier New" w:eastAsia="Times New Roman" w:hAnsi="Courier New" w:cs="Courier New"/>
-          <w:sz w:val="20"/>
-          <w:szCs w:val="20"/>
-          <w:lang w:eastAsia="en-IN"/>
-        </w:rPr>
-        <w:t xml:space="preserve">            'Caffe Mocha',</w:t>
-      </w:r>
-    </w:p>
-    <w:p>
-      <w:pPr>
-        <w:rPr>
-          <w:rFonts w:ascii="Courier New" w:eastAsia="Times New Roman" w:hAnsi="Courier New" w:cs="Courier New"/>
-          <w:sz w:val="20"/>
-          <w:szCs w:val="20"/>
-          <w:lang w:eastAsia="en-IN"/>
-        </w:rPr>
-      </w:pPr>
-      <w:r>
-        <w:rPr>
-          <w:rFonts w:ascii="Courier New" w:eastAsia="Times New Roman" w:hAnsi="Courier New" w:cs="Courier New"/>
-          <w:sz w:val="20"/>
-          <w:szCs w:val="20"/>
-          <w:lang w:eastAsia="en-IN"/>
-        </w:rPr>
-        <w:t xml:space="preserve">            'Freshly prepared caffe mocha.'</w:t>
-      </w:r>
-    </w:p>
-    <w:p>
-      <w:pPr>
-        <w:rPr>
-          <w:rFonts w:ascii="Courier New" w:eastAsia="Times New Roman" w:hAnsi="Courier New" w:cs="Courier New"/>
-          <w:sz w:val="20"/>
-          <w:szCs w:val="20"/>
-          <w:lang w:eastAsia="en-IN"/>
-        </w:rPr>
-      </w:pPr>
-      <w:r>
-        <w:rPr>
-          <w:rFonts w:ascii="Courier New" w:eastAsia="Times New Roman" w:hAnsi="Courier New" w:cs="Courier New"/>
-          <w:sz w:val="20"/>
-          <w:szCs w:val="20"/>
-          <w:lang w:eastAsia="en-IN"/>
-        </w:rPr>
-        <w:t xml:space="preserve">        )</w:t>
-      </w:r>
-    </w:p>
-    <w:p>
-      <w:pPr>
-        <w:rPr>
-          <w:rFonts w:ascii="Courier New" w:eastAsia="Times New Roman" w:hAnsi="Courier New" w:cs="Courier New"/>
-          <w:sz w:val="20"/>
-          <w:szCs w:val="20"/>
-          <w:lang w:eastAsia="en-IN"/>
-        </w:rPr>
-      </w:pPr>
-      <w:r>
-        <w:rPr>
-          <w:rFonts w:ascii="Courier New" w:eastAsia="Times New Roman" w:hAnsi="Courier New" w:cs="Courier New"/>
-          <w:sz w:val="20"/>
-          <w:szCs w:val="20"/>
-          <w:lang w:eastAsia="en-IN"/>
-        </w:rPr>
-        <w:t xml:space="preserve">) AS </w:t>
-      </w:r>
-      <w:proofErr w:type="gramStart"/>
-      <w:r>
-        <w:rPr>
-          <w:rFonts w:ascii="Courier New" w:eastAsia="Times New Roman" w:hAnsi="Courier New" w:cs="Courier New"/>
-          <w:sz w:val="20"/>
-          <w:szCs w:val="20"/>
-          <w:lang w:eastAsia="en-IN"/>
-        </w:rPr>
-        <w:t>v(</w:t>
-      </w:r>
-      <w:proofErr w:type="gramEnd"/>
-      <w:r>
-        <w:rPr>
-          <w:rFonts w:ascii="Courier New" w:eastAsia="Times New Roman" w:hAnsi="Courier New" w:cs="Courier New"/>
-          <w:sz w:val="20"/>
-          <w:szCs w:val="20"/>
-          <w:lang w:eastAsia="en-IN"/>
-        </w:rPr>
-        <w:t>product_id, product_code, product_name, description)</w:t>
-      </w:r>
-    </w:p>
-    <w:p>
-      <w:pPr>
-        <w:rPr>
-          <w:rFonts w:ascii="Courier New" w:eastAsia="Times New Roman" w:hAnsi="Courier New" w:cs="Courier New"/>
-          <w:sz w:val="20"/>
-          <w:szCs w:val="20"/>
-          <w:lang w:eastAsia="en-IN"/>
-        </w:rPr>
-      </w:pPr>
-      <w:r>
-        <w:rPr>
-          <w:rFonts w:ascii="Courier New" w:eastAsia="Times New Roman" w:hAnsi="Courier New" w:cs="Courier New"/>
-          <w:sz w:val="20"/>
-          <w:szCs w:val="20"/>
-          <w:lang w:eastAsia="en-IN"/>
-        </w:rPr>
-        <w:t xml:space="preserve">JOIN </w:t>
-      </w:r>
-      <w:proofErr w:type="gramStart"/>
-      <w:r>
-        <w:rPr>
-          <w:rFonts w:ascii="Courier New" w:eastAsia="Times New Roman" w:hAnsi="Courier New" w:cs="Courier New"/>
-          <w:sz w:val="20"/>
-          <w:szCs w:val="20"/>
-          <w:lang w:eastAsia="en-IN"/>
-        </w:rPr>
-        <w:t>memginedev.organization</w:t>
-      </w:r>
-      <w:proofErr w:type="gramEnd"/>
-      <w:r>
-        <w:rPr>
-          <w:rFonts w:ascii="Courier New" w:eastAsia="Times New Roman" w:hAnsi="Courier New" w:cs="Courier New"/>
-          <w:sz w:val="20"/>
-          <w:szCs w:val="20"/>
-          <w:lang w:eastAsia="en-IN"/>
-        </w:rPr>
-        <w:t xml:space="preserve"> o</w:t>
-      </w:r>
-    </w:p>
-    <w:p>
-      <w:pPr>
-        <w:rPr>
-          <w:rFonts w:ascii="Courier New" w:eastAsia="Times New Roman" w:hAnsi="Courier New" w:cs="Courier New"/>
-          <w:sz w:val="20"/>
-          <w:szCs w:val="20"/>
-          <w:lang w:eastAsia="en-IN"/>
-        </w:rPr>
-      </w:pPr>
-      <w:r>
-        <w:rPr>
-          <w:rFonts w:ascii="Courier New" w:eastAsia="Times New Roman" w:hAnsi="Courier New" w:cs="Courier New"/>
-          <w:sz w:val="20"/>
-          <w:szCs w:val="20"/>
-          <w:lang w:eastAsia="en-IN"/>
-        </w:rPr>
-        <w:t xml:space="preserve">  ON </w:t>
-      </w:r>
-      <w:proofErr w:type="gramStart"/>
-      <w:r>
-        <w:rPr>
-          <w:rFonts w:ascii="Courier New" w:eastAsia="Times New Roman" w:hAnsi="Courier New" w:cs="Courier New"/>
-          <w:sz w:val="20"/>
-          <w:szCs w:val="20"/>
-          <w:lang w:eastAsia="en-IN"/>
-        </w:rPr>
-        <w:t>o.organization</w:t>
-      </w:r>
-      <w:proofErr w:type="gramEnd"/>
-      <w:r>
-        <w:rPr>
-          <w:rFonts w:ascii="Courier New" w:eastAsia="Times New Roman" w:hAnsi="Courier New" w:cs="Courier New"/>
-          <w:sz w:val="20"/>
-          <w:szCs w:val="20"/>
-          <w:lang w:eastAsia="en-IN"/>
-        </w:rPr>
         <w:t>_id = 'ORG_ece1b2f6-0e01-4d1b-ac11-3528e136cc1b'</w:t>
       </w:r>
     </w:p>
@@ -2930,7 +2947,6 @@
           <w:szCs w:val="20"/>
           <w:lang w:eastAsia="en-IN"/>
         </w:rPr>
-        <w:lastRenderedPageBreak/>
         <w:t xml:space="preserve">    product_code = EXCLUDED.product_code,</w:t>
       </w:r>
     </w:p>
@@ -3755,6 +3771,7 @@
           <w:szCs w:val="20"/>
           <w:lang w:eastAsia="en-IN"/>
         </w:rPr>
+        <w:lastRenderedPageBreak/>
         <w:t>-----END RSA PRIVATE KEY-----</w:t>
       </w:r>
     </w:p>
@@ -4922,6 +4939,7 @@
           <w:szCs w:val="20"/>
           <w:lang w:eastAsia="en-IN"/>
         </w:rPr>
+        <w:lastRenderedPageBreak/>
         <w:t xml:space="preserve">    'ORG_ece1b2f6-0e01-4d1b-ac11-3528e136cc1b',</w:t>
       </w:r>
     </w:p>
@@ -5138,7 +5156,6 @@
           <w:szCs w:val="20"/>
           <w:lang w:eastAsia="en-IN"/>
         </w:rPr>
-        <w:lastRenderedPageBreak/>
         <w:t>$key = Get-Content "C:\path\to\poynt-private-key.pem" -Raw</w:t>
       </w:r>
     </w:p>
@@ -5534,6 +5551,7 @@
           <w:sz w:val="32"/>
           <w:szCs w:val="32"/>
         </w:rPr>
+        <w:lastRenderedPageBreak/>
         <w:t>credential_secret_reference = not the actual private key. This must be the AWS Secrets Manager reference/name where we store the Poynt application's RSA private key/credential.</w:t>
       </w:r>
     </w:p>
@@ -5574,7 +5592,6 @@
           <w:sz w:val="32"/>
           <w:szCs w:val="32"/>
         </w:rPr>
-        <w:lastRenderedPageBreak/>
         <w:t xml:space="preserve">created_by / updated_by = a valid organization_user_id from Memgine for an admin/member of that organization, </w:t>
       </w:r>
       <w:r>
@@ -5605,8 +5622,45 @@
       </w:r>
       <w:proofErr w:type="gramEnd"/>
       <w:r>
-        <w:t>_OTE_CATALOG_CURRENCY_DIAGNOSTIC="true"; .\gradlew.bat :server:test --tests "com.mynikatech.memgine.component.commerce.provider.poynt.PoyntProductionCatalogDiscoveryTest</w:t>
-      </w:r>
+        <w:t xml:space="preserve">_OTE_CATALOG_CURRENCY_DIAGNOSTIC="true"; </w:t>
+      </w:r>
+      <w:proofErr w:type="gramStart"/>
+      <w:r>
+        <w:t>.\gradlew.bat :server</w:t>
+      </w:r>
+      <w:proofErr w:type="gramEnd"/>
+      <w:r>
+        <w:t>:test --tests "</w:t>
+      </w:r>
+      <w:proofErr w:type="gramStart"/>
+      <w:r>
+        <w:t>com.mynikatech</w:t>
+      </w:r>
+      <w:proofErr w:type="gramEnd"/>
+      <w:r>
+        <w:t>.</w:t>
+      </w:r>
+      <w:proofErr w:type="gramStart"/>
+      <w:r>
+        <w:t>memgine.component</w:t>
+      </w:r>
+      <w:proofErr w:type="gramEnd"/>
+      <w:r>
+        <w:t>.</w:t>
+      </w:r>
+      <w:proofErr w:type="gramStart"/>
+      <w:r>
+        <w:t>commerce.provider</w:t>
+      </w:r>
+      <w:proofErr w:type="gramEnd"/>
+      <w:r>
+        <w:t>.</w:t>
+      </w:r>
+      <w:proofErr w:type="gramStart"/>
+      <w:r>
+        <w:t>poynt.PoyntProductionCatalogDiscoveryTest</w:t>
+      </w:r>
+      <w:proofErr w:type="gramEnd"/>
       <w:r>
         <w:t>_OrderGET</w:t>
       </w:r>

</xml_diff>